<commit_message>
Manual completo: 23 figuras, ninguna pendiente de captura
Se sustituyen los seis huecos que esperaban capturas de Windows:

- La pagina del repositorio es una captura real hecha con Chrome sobre
  la URL publica, compuesta con un marco de navegador para poder senalar
  la barra de direcciones.
- El menu de MAS y su mensaje de exito reproducen el texto literal de
  MAS_AIO.cmd 3.12, no una aproximacion.
- El menu Inicio y el aviso de permisos de Windows son recreaciones
  dibujadas, advertido en el pie del manual.
</commit_message>
<xml_diff>
--- a/MANUAL-Instalar-Office.docx
+++ b/MANUAL-Instalar-Office.docx
@@ -1673,622 +1673,7 @@
     <w:p>
       <w:pPr>
         <w:pStyle w:val="BodyText"/>
-        <w:keepLines/>
-        <w:bidi w:val="0"/>
-        <w:spacing w:before="210" w:after="210"/>
-        <w:ind w:hanging="0" w:left="210" w:right="210"/>
-        <w:jc w:val="center"/>
-        <w:rPr>
-          <w:rFonts w:ascii="DejaVu Sans;sans-serif" w:hAnsi="DejaVu Sans;sans-serif"/>
-          <w:color w:val="666677"/>
-          <w:sz w:val="18"/>
-          <w:bdr w:val="dashed" w:sz="12" w:space="15" w:color="B0BCC7"/>
-          <w:shd w:fill="F8FAFB" w:val="clear"/>
-        </w:rPr>
-      </w:pPr>
-      <w:r>
-        <w:rPr>
-          <w:rFonts w:ascii="DejaVu Sans;sans-serif" w:hAnsi="DejaVu Sans;sans-serif"/>
-          <w:b/>
-          <w:color w:val="666677"/>
-          <w:sz w:val="18"/>
-          <w:bdr w:val="dashed" w:sz="12" w:space="15" w:color="B0BCC7"/>
-          <w:shd w:fill="F8FAFB" w:val="clear"/>
-        </w:rPr>
-        <w:t>Figura 1 · La página del instalador</w:t>
-      </w:r>
-      <w:r>
-        <w:rPr>
-          <w:rFonts w:ascii="DejaVu Sans;sans-serif" w:hAnsi="DejaVu Sans;sans-serif"/>
-          <w:color w:val="666677"/>
-          <w:sz w:val="18"/>
-          <w:bdr w:val="dashed" w:sz="12" w:space="15" w:color="B0BCC7"/>
-          <w:shd w:fill="F8FAFB" w:val="clear"/>
-        </w:rPr>
-        <w:t xml:space="preserve"> Aquí va tu captura de la página en GitHub.</w:t>
-        <w:br/>
-        <w:t xml:space="preserve">Marca con un círculo rojo nº1 la </w:t>
-      </w:r>
-      <w:r>
-        <w:rPr>
-          <w:rFonts w:ascii="DejaVu Sans;sans-serif" w:hAnsi="DejaVu Sans;sans-serif"/>
-          <w:b/>
-          <w:color w:val="666677"/>
-          <w:sz w:val="18"/>
-          <w:bdr w:val="dashed" w:sz="12" w:space="15" w:color="B0BCC7"/>
-          <w:shd w:fill="F8FAFB" w:val="clear"/>
-        </w:rPr>
-        <w:t>barra de direcciones</w:t>
-      </w:r>
-      <w:r>
-        <w:rPr>
-          <w:rFonts w:ascii="DejaVu Sans;sans-serif" w:hAnsi="DejaVu Sans;sans-serif"/>
-          <w:color w:val="666677"/>
-          <w:sz w:val="18"/>
-          <w:bdr w:val="dashed" w:sz="12" w:space="15" w:color="B0BCC7"/>
-          <w:shd w:fill="F8FAFB" w:val="clear"/>
-        </w:rPr>
-        <w:t xml:space="preserve"> y con un círculo nº2 el </w:t>
-      </w:r>
-      <w:r>
-        <w:rPr>
-          <w:rFonts w:ascii="DejaVu Sans;sans-serif" w:hAnsi="DejaVu Sans;sans-serif"/>
-          <w:b/>
-          <w:color w:val="666677"/>
-          <w:sz w:val="18"/>
-          <w:bdr w:val="dashed" w:sz="12" w:space="15" w:color="B0BCC7"/>
-          <w:shd w:fill="F8FAFB" w:val="clear"/>
-        </w:rPr>
-        <w:t>recuadro oscuro con el comando</w:t>
-      </w:r>
-      <w:r>
-        <w:rPr>
-          <w:rFonts w:ascii="DejaVu Sans;sans-serif" w:hAnsi="DejaVu Sans;sans-serif"/>
-          <w:color w:val="666677"/>
-          <w:sz w:val="18"/>
-          <w:bdr w:val="dashed" w:sz="12" w:space="15" w:color="B0BCC7"/>
-          <w:shd w:fill="F8FAFB" w:val="clear"/>
-        </w:rPr>
-        <w:t>, que es el que copiaremos en el Paso D.</w:t>
-      </w:r>
-    </w:p>
-    <w:p>
-      <w:pPr>
-        <w:pStyle w:val="Ttulo4paso"/>
-        <w:bidi w:val="0"/>
-        <w:jc w:val="left"/>
-        <w:rPr/>
-      </w:pPr>
-      <w:r>
-        <w:rPr/>
-        <w:t>Paso D. Copiar el comando</w:t>
-      </w:r>
-    </w:p>
-    <w:p>
-      <w:pPr>
-        <w:pStyle w:val="Cuerpodetextochico"/>
-        <w:bidi w:val="0"/>
-        <w:jc w:val="left"/>
-        <w:rPr/>
-      </w:pPr>
-      <w:r>
-        <w:rPr/>
-        <w:t xml:space="preserve">El comando es esta línea larga. </w:t>
-      </w:r>
-      <w:r>
-        <w:rPr>
-          <w:b/>
-        </w:rPr>
-        <w:t>No hace falta escribirla a mano</w:t>
-      </w:r>
-      <w:r>
-        <w:rPr/>
-        <w:t>, la vamos a copiar entera:</w:t>
-      </w:r>
-    </w:p>
-    <w:p>
-      <w:pPr>
-        <w:pStyle w:val="BodyText"/>
-        <w:bidi w:val="0"/>
-        <w:spacing w:before="135" w:after="135"/>
-        <w:ind w:hanging="0" w:left="135" w:right="135"/>
-        <w:jc w:val="left"/>
-        <w:rPr>
-          <w:rFonts w:ascii="DejaVu Sans Mono;monospace" w:hAnsi="DejaVu Sans Mono;monospace"/>
-          <w:color w:val="E6EDF3"/>
-          <w:sz w:val="16"/>
-          <w:shd w:fill="0D1117" w:val="clear"/>
-        </w:rPr>
-      </w:pPr>
-      <w:r>
-        <w:rPr>
-          <w:rFonts w:ascii="DejaVu Sans Mono;monospace" w:hAnsi="DejaVu Sans Mono;monospace"/>
-          <w:color w:val="E6EDF3"/>
-          <w:sz w:val="16"/>
-          <w:shd w:fill="0D1117" w:val="clear"/>
-        </w:rPr>
-        <w:t xml:space="preserve">irm https://raw.githubusercontent.com/MariaDSalazar/instalador-office-isupol/main/office-isupol.ps1 | iex </w:t>
-      </w:r>
-    </w:p>
-    <w:p>
-      <w:pPr>
-        <w:pStyle w:val="BodyText"/>
-        <w:numPr>
-          <w:ilvl w:val="0"/>
-          <w:numId w:val="6"/>
-        </w:numPr>
-        <w:tabs>
-          <w:tab w:val="clear" w:pos="1134"/>
-          <w:tab w:val="left" w:pos="709" w:leader="none"/>
-        </w:tabs>
-        <w:bidi w:val="0"/>
-        <w:spacing w:before="120" w:after="0"/>
-        <w:ind w:hanging="283" w:left="709" w:right="0"/>
-        <w:jc w:val="left"/>
-        <w:rPr/>
-      </w:pPr>
-      <w:r>
-        <w:rPr/>
-        <w:t xml:space="preserve">Pasa el mouse por encima del recuadro oscuro de la página; en la esquina derecha aparece un </w:t>
-      </w:r>
-      <w:r>
-        <w:rPr>
-          <w:b/>
-        </w:rPr>
-        <w:t>botoncito de copiar</w:t>
-      </w:r>
-      <w:r>
-        <w:rPr/>
-        <w:t xml:space="preserve"> (dos cuadraditos). Haz clic ahí. Si no aparece el botoncito, selecciona el texto con el mouse arrastrando de principio a fin y presiona </w:t>
-      </w:r>
-      <w:r>
-        <w:rPr>
-          <w:rFonts w:ascii="DejaVu Sans;sans-serif" w:hAnsi="DejaVu Sans;sans-serif"/>
-          <w:sz w:val="17"/>
-          <w:bdr w:val="single" w:sz="2" w:space="1" w:color="999999"/>
-          <w:shd w:fill="FAFAFA" w:val="clear"/>
-        </w:rPr>
-        <w:t>Ctrl</w:t>
-      </w:r>
-      <w:r>
-        <w:rPr/>
-        <w:t>+</w:t>
-      </w:r>
-      <w:r>
-        <w:rPr>
-          <w:rFonts w:ascii="DejaVu Sans;sans-serif" w:hAnsi="DejaVu Sans;sans-serif"/>
-          <w:sz w:val="17"/>
-          <w:bdr w:val="single" w:sz="2" w:space="1" w:color="999999"/>
-          <w:shd w:fill="FAFAFA" w:val="clear"/>
-        </w:rPr>
-        <w:t>C</w:t>
-      </w:r>
-      <w:r>
-        <w:rPr/>
-        <w:t xml:space="preserve">. </w:t>
-      </w:r>
-    </w:p>
-    <w:p>
-      <w:pPr>
-        <w:pStyle w:val="BodyText"/>
-        <w:numPr>
-          <w:ilvl w:val="0"/>
-          <w:numId w:val="6"/>
-        </w:numPr>
-        <w:tabs>
-          <w:tab w:val="clear" w:pos="1134"/>
-          <w:tab w:val="left" w:pos="829" w:leader="none"/>
-        </w:tabs>
-        <w:bidi w:val="0"/>
-        <w:spacing w:before="120" w:after="0"/>
-        <w:ind w:hanging="283" w:left="829"/>
-        <w:jc w:val="left"/>
-        <w:rPr/>
-      </w:pPr>
-      <w:r>
-        <w:rPr/>
-        <w:t xml:space="preserve">El comando ya está copiado, aunque no veas ningún cambio en la pantalla. Es normal. </w:t>
-      </w:r>
-    </w:p>
-    <w:p>
-      <w:pPr>
-        <w:pStyle w:val="BodyText"/>
-        <w:numPr>
-          <w:ilvl w:val="0"/>
-          <w:numId w:val="6"/>
-        </w:numPr>
-        <w:tabs>
-          <w:tab w:val="clear" w:pos="1134"/>
-          <w:tab w:val="left" w:pos="829" w:leader="none"/>
-        </w:tabs>
-        <w:bidi w:val="0"/>
-        <w:ind w:hanging="283" w:left="829"/>
-        <w:jc w:val="left"/>
-        <w:rPr/>
-      </w:pPr>
-      <w:r>
-        <w:rPr>
-          <w:b/>
-        </w:rPr>
-        <w:t>No cierres el navegador todavía</w:t>
-      </w:r>
-      <w:r>
-        <w:rPr/>
-        <w:t xml:space="preserve">, por si hay que copiarlo de nuevo. </w:t>
-      </w:r>
-    </w:p>
-    <w:p>
-      <w:pPr>
-        <w:pStyle w:val="BodyText"/>
-        <w:bidi w:val="0"/>
-        <w:spacing w:before="180" w:after="180"/>
-        <w:ind w:hanging="0" w:left="180" w:right="180"/>
-        <w:jc w:val="left"/>
-        <w:rPr/>
-      </w:pPr>
-      <w:r>
-        <w:rPr>
-          <w:b/>
-          <w:sz w:val="19"/>
-          <w:bdr w:val="single" w:sz="24" w:space="9" w:color="0D3B66"/>
-          <w:shd w:fill="F4F7FA" w:val="clear"/>
-        </w:rPr>
-        <w:t>¿Qué hace ese comando?</w:t>
-      </w:r>
-      <w:r>
-        <w:rPr>
-          <w:sz w:val="19"/>
-          <w:bdr w:val="single" w:sz="24" w:space="9" w:color="0D3B66"/>
-          <w:shd w:fill="F4F7FA" w:val="clear"/>
-        </w:rPr>
-        <w:t xml:space="preserve"> </w:t>
-      </w:r>
-      <w:r>
-        <w:rPr>
-          <w:rStyle w:val="Textooriginal"/>
-          <w:sz w:val="19"/>
-          <w:bdr w:val="single" w:sz="24" w:space="9" w:color="0D3B66"/>
-          <w:shd w:fill="F4F7FA" w:val="clear"/>
-        </w:rPr>
-        <w:t>irm</w:t>
-      </w:r>
-      <w:r>
-        <w:rPr>
-          <w:sz w:val="19"/>
-          <w:bdr w:val="single" w:sz="24" w:space="9" w:color="0D3B66"/>
-          <w:shd w:fill="F4F7FA" w:val="clear"/>
-        </w:rPr>
-        <w:t xml:space="preserve"> descarga el instalador desde la página, y </w:t>
-      </w:r>
-      <w:r>
-        <w:rPr>
-          <w:rStyle w:val="Textooriginal"/>
-          <w:sz w:val="19"/>
-          <w:bdr w:val="single" w:sz="24" w:space="9" w:color="0D3B66"/>
-          <w:shd w:fill="F4F7FA" w:val="clear"/>
-        </w:rPr>
-        <w:t>iex</w:t>
-      </w:r>
-      <w:r>
-        <w:rPr>
-          <w:sz w:val="19"/>
-          <w:bdr w:val="single" w:sz="24" w:space="9" w:color="0D3B66"/>
-          <w:shd w:fill="F4F7FA" w:val="clear"/>
-        </w:rPr>
-        <w:t xml:space="preserve"> lo ejecuta. Es la misma forma que usa massgrave.dev. El archivo viene del repositorio de la asignatura y descarga Office solo de los servidores de Microsoft.</w:t>
-      </w:r>
-    </w:p>
-    <w:p>
-      <w:pPr>
-        <w:pStyle w:val="Ttulo4paso"/>
-        <w:bidi w:val="0"/>
-        <w:jc w:val="left"/>
-        <w:rPr/>
-      </w:pPr>
-      <w:r>
-        <w:rPr/>
-        <w:t>Paso E. Abrir PowerShell como administrador</w:t>
-      </w:r>
-    </w:p>
-    <w:p>
-      <w:pPr>
-        <w:pStyle w:val="BodyText"/>
-        <w:numPr>
-          <w:ilvl w:val="0"/>
-          <w:numId w:val="7"/>
-        </w:numPr>
-        <w:tabs>
-          <w:tab w:val="clear" w:pos="1134"/>
-          <w:tab w:val="left" w:pos="709" w:leader="none"/>
-        </w:tabs>
-        <w:bidi w:val="0"/>
-        <w:spacing w:before="120" w:after="0"/>
-        <w:ind w:hanging="283" w:left="709" w:right="0"/>
-        <w:jc w:val="left"/>
-        <w:rPr/>
-      </w:pPr>
-      <w:r>
-        <w:rPr/>
-        <w:t xml:space="preserve">Presiona la tecla </w:t>
-      </w:r>
-      <w:r>
-        <w:rPr>
-          <w:rFonts w:ascii="DejaVu Sans;sans-serif" w:hAnsi="DejaVu Sans;sans-serif"/>
-          <w:sz w:val="17"/>
-          <w:bdr w:val="single" w:sz="2" w:space="1" w:color="999999"/>
-          <w:shd w:fill="FAFAFA" w:val="clear"/>
-        </w:rPr>
-        <w:t>Windows</w:t>
-      </w:r>
-      <w:r>
-        <w:rPr/>
-        <w:t xml:space="preserve"> → escribe </w:t>
-      </w:r>
-      <w:r>
-        <w:rPr>
-          <w:rStyle w:val="Textooriginal"/>
-        </w:rPr>
-        <w:t>PowerShell</w:t>
-      </w:r>
-      <w:r>
-        <w:rPr/>
-        <w:t xml:space="preserve">. </w:t>
-      </w:r>
-    </w:p>
-    <w:p>
-      <w:pPr>
-        <w:pStyle w:val="BodyText"/>
-        <w:numPr>
-          <w:ilvl w:val="0"/>
-          <w:numId w:val="7"/>
-        </w:numPr>
-        <w:tabs>
-          <w:tab w:val="clear" w:pos="1134"/>
-          <w:tab w:val="left" w:pos="829" w:leader="none"/>
-        </w:tabs>
-        <w:bidi w:val="0"/>
-        <w:spacing w:before="120" w:after="0"/>
-        <w:ind w:hanging="283" w:left="829"/>
-        <w:jc w:val="left"/>
-        <w:rPr/>
-      </w:pPr>
-      <w:r>
-        <w:rPr/>
-        <w:t xml:space="preserve">Arriba aparece «Windows PowerShell». </w:t>
-      </w:r>
-      <w:r>
-        <w:rPr>
-          <w:b/>
-        </w:rPr>
-        <w:t>No pulses Enter todavía.</w:t>
-      </w:r>
-      <w:r>
-        <w:rPr/>
-        <w:t xml:space="preserve"> </w:t>
-      </w:r>
-    </w:p>
-    <w:p>
-      <w:pPr>
-        <w:pStyle w:val="BodyText"/>
-        <w:numPr>
-          <w:ilvl w:val="0"/>
-          <w:numId w:val="7"/>
-        </w:numPr>
-        <w:tabs>
-          <w:tab w:val="clear" w:pos="1134"/>
-          <w:tab w:val="left" w:pos="829" w:leader="none"/>
-        </w:tabs>
-        <w:bidi w:val="0"/>
-        <w:spacing w:before="120" w:after="0"/>
-        <w:ind w:hanging="283" w:left="829"/>
-        <w:jc w:val="left"/>
-        <w:rPr/>
-      </w:pPr>
-      <w:r>
-        <w:rPr/>
-        <w:t xml:space="preserve">En el panel de la derecha haz clic en </w:t>
-      </w:r>
-      <w:r>
-        <w:rPr>
-          <w:b/>
-        </w:rPr>
-        <w:t>«Ejecutar como administrador»</w:t>
-      </w:r>
-      <w:r>
-        <w:rPr/>
-        <w:t xml:space="preserve">. Si no ves ese panel, haz clic derecho sobre «Windows PowerShell» y elige esa misma opción del menú. </w:t>
-      </w:r>
-    </w:p>
-    <w:p>
-      <w:pPr>
-        <w:pStyle w:val="BodyText"/>
-        <w:numPr>
-          <w:ilvl w:val="0"/>
-          <w:numId w:val="7"/>
-        </w:numPr>
-        <w:tabs>
-          <w:tab w:val="clear" w:pos="1134"/>
-          <w:tab w:val="left" w:pos="829" w:leader="none"/>
-        </w:tabs>
-        <w:bidi w:val="0"/>
-        <w:spacing w:before="120" w:after="0"/>
-        <w:ind w:hanging="283" w:left="829"/>
-        <w:jc w:val="left"/>
-        <w:rPr/>
-      </w:pPr>
-      <w:r>
-        <w:rPr/>
-        <w:t xml:space="preserve">Es </w:t>
-      </w:r>
-      <w:r>
-        <w:rPr>
-          <w:b/>
-        </w:rPr>
-        <w:t>muy importante</w:t>
-      </w:r>
-      <w:r>
-        <w:rPr/>
-        <w:t xml:space="preserve"> que sea la opción como administrador y no la normal: sin esos permisos, la instalación no puede empezar. </w:t>
-      </w:r>
-    </w:p>
-    <w:p>
-      <w:pPr>
-        <w:pStyle w:val="BodyText"/>
-        <w:numPr>
-          <w:ilvl w:val="0"/>
-          <w:numId w:val="7"/>
-        </w:numPr>
-        <w:tabs>
-          <w:tab w:val="clear" w:pos="1134"/>
-          <w:tab w:val="left" w:pos="829" w:leader="none"/>
-        </w:tabs>
-        <w:bidi w:val="0"/>
-        <w:ind w:hanging="283" w:left="829"/>
-        <w:jc w:val="left"/>
-        <w:rPr/>
-      </w:pPr>
-      <w:r>
-        <w:rPr/>
-        <w:t xml:space="preserve">Windows preguntará si permites cambios → haz clic en </w:t>
-      </w:r>
-      <w:r>
-        <w:rPr>
-          <w:b/>
-        </w:rPr>
-        <w:t>Sí</w:t>
-      </w:r>
-      <w:r>
-        <w:rPr/>
-        <w:t xml:space="preserve">. Ese aviso azul es normal y sale siempre. </w:t>
-      </w:r>
-    </w:p>
-    <w:p>
-      <w:pPr>
-        <w:pStyle w:val="BodyText"/>
-        <w:keepLines/>
-        <w:bidi w:val="0"/>
-        <w:spacing w:before="210" w:after="210"/>
-        <w:ind w:hanging="0" w:left="210" w:right="210"/>
-        <w:jc w:val="center"/>
-        <w:rPr>
-          <w:rFonts w:ascii="DejaVu Sans;sans-serif" w:hAnsi="DejaVu Sans;sans-serif"/>
-          <w:color w:val="666677"/>
-          <w:sz w:val="18"/>
-          <w:bdr w:val="dashed" w:sz="12" w:space="15" w:color="B0BCC7"/>
-          <w:shd w:fill="F8FAFB" w:val="clear"/>
-        </w:rPr>
-      </w:pPr>
-      <w:r>
-        <w:rPr>
-          <w:rFonts w:ascii="DejaVu Sans;sans-serif" w:hAnsi="DejaVu Sans;sans-serif"/>
-          <w:b/>
-          <w:color w:val="666677"/>
-          <w:sz w:val="18"/>
-          <w:bdr w:val="dashed" w:sz="12" w:space="15" w:color="B0BCC7"/>
-          <w:shd w:fill="F8FAFB" w:val="clear"/>
-        </w:rPr>
-        <w:t>Figura 2 · Buscar PowerShell en el menú Inicio</w:t>
-      </w:r>
-      <w:r>
-        <w:rPr>
-          <w:rFonts w:ascii="DejaVu Sans;sans-serif" w:hAnsi="DejaVu Sans;sans-serif"/>
-          <w:color w:val="666677"/>
-          <w:sz w:val="18"/>
-          <w:bdr w:val="dashed" w:sz="12" w:space="15" w:color="B0BCC7"/>
-          <w:shd w:fill="F8FAFB" w:val="clear"/>
-        </w:rPr>
-        <w:t xml:space="preserve"> Aquí va tu captura del menú Inicio con «PowerShell» escrito.</w:t>
-        <w:br/>
-        <w:t xml:space="preserve">Marca con un recuadro rojo nº1 lo que escribiste y con un nº2 la opción </w:t>
-      </w:r>
-      <w:r>
-        <w:rPr>
-          <w:rFonts w:ascii="DejaVu Sans;sans-serif" w:hAnsi="DejaVu Sans;sans-serif"/>
-          <w:b/>
-          <w:color w:val="666677"/>
-          <w:sz w:val="18"/>
-          <w:bdr w:val="dashed" w:sz="12" w:space="15" w:color="B0BCC7"/>
-          <w:shd w:fill="F8FAFB" w:val="clear"/>
-        </w:rPr>
-        <w:t>Ejecutar como administrador</w:t>
-      </w:r>
-      <w:r>
-        <w:rPr>
-          <w:rFonts w:ascii="DejaVu Sans;sans-serif" w:hAnsi="DejaVu Sans;sans-serif"/>
-          <w:color w:val="666677"/>
-          <w:sz w:val="18"/>
-          <w:bdr w:val="dashed" w:sz="12" w:space="15" w:color="B0BCC7"/>
-          <w:shd w:fill="F8FAFB" w:val="clear"/>
-        </w:rPr>
-        <w:t>.</w:t>
-      </w:r>
-    </w:p>
-    <w:p>
-      <w:pPr>
-        <w:pStyle w:val="BodyText"/>
-        <w:keepLines/>
-        <w:bidi w:val="0"/>
-        <w:spacing w:before="210" w:after="210"/>
-        <w:ind w:hanging="0" w:left="210" w:right="210"/>
-        <w:jc w:val="center"/>
-        <w:rPr>
-          <w:rFonts w:ascii="DejaVu Sans;sans-serif" w:hAnsi="DejaVu Sans;sans-serif"/>
-          <w:color w:val="666677"/>
-          <w:sz w:val="18"/>
-          <w:bdr w:val="dashed" w:sz="12" w:space="15" w:color="B0BCC7"/>
-          <w:shd w:fill="F8FAFB" w:val="clear"/>
-        </w:rPr>
-      </w:pPr>
-      <w:r>
-        <w:rPr>
-          <w:rFonts w:ascii="DejaVu Sans;sans-serif" w:hAnsi="DejaVu Sans;sans-serif"/>
-          <w:b/>
-          <w:color w:val="666677"/>
-          <w:sz w:val="18"/>
-          <w:bdr w:val="dashed" w:sz="12" w:space="15" w:color="B0BCC7"/>
-          <w:shd w:fill="F8FAFB" w:val="clear"/>
-        </w:rPr>
-        <w:t>Figura 3 · El aviso de permisos</w:t>
-      </w:r>
-      <w:r>
-        <w:rPr>
-          <w:rFonts w:ascii="DejaVu Sans;sans-serif" w:hAnsi="DejaVu Sans;sans-serif"/>
-          <w:color w:val="666677"/>
-          <w:sz w:val="18"/>
-          <w:bdr w:val="dashed" w:sz="12" w:space="15" w:color="B0BCC7"/>
-          <w:shd w:fill="F8FAFB" w:val="clear"/>
-        </w:rPr>
-        <w:t xml:space="preserve"> Aquí va tu captura del aviso azul «¿Quieres permitir que esta aplicación haga cambios en el dispositivo?».</w:t>
-        <w:br/>
-        <w:t xml:space="preserve">Dibuja una flecha roja al botón </w:t>
-      </w:r>
-      <w:r>
-        <w:rPr>
-          <w:rFonts w:ascii="DejaVu Sans;sans-serif" w:hAnsi="DejaVu Sans;sans-serif"/>
-          <w:b/>
-          <w:color w:val="666677"/>
-          <w:sz w:val="18"/>
-          <w:bdr w:val="dashed" w:sz="12" w:space="15" w:color="B0BCC7"/>
-          <w:shd w:fill="F8FAFB" w:val="clear"/>
-        </w:rPr>
-        <w:t>Sí</w:t>
-      </w:r>
-      <w:r>
-        <w:rPr>
-          <w:rFonts w:ascii="DejaVu Sans;sans-serif" w:hAnsi="DejaVu Sans;sans-serif"/>
-          <w:color w:val="666677"/>
-          <w:sz w:val="18"/>
-          <w:bdr w:val="dashed" w:sz="12" w:space="15" w:color="B0BCC7"/>
-          <w:shd w:fill="F8FAFB" w:val="clear"/>
-        </w:rPr>
-        <w:t>.</w:t>
-      </w:r>
-    </w:p>
-    <w:p>
-      <w:pPr>
-        <w:pStyle w:val="BodyText"/>
-        <w:bidi w:val="0"/>
-        <w:spacing w:before="120" w:after="0"/>
+        <w:bidi w:val="0"/>
         <w:jc w:val="left"/>
         <w:rPr/>
       </w:pPr>
@@ -2296,9 +1681,9 @@
         <w:rPr/>
         <w:drawing>
           <wp:inline distT="0" distB="0" distL="0" distR="0">
-            <wp:extent cx="16964025" cy="4038600"/>
+            <wp:extent cx="13744575" cy="3467100"/>
             <wp:effectExtent l="0" t="0" r="0" b="0"/>
-            <wp:docPr id="1" name="Imagen1" descr="PowerShell recién abierta"/>
+            <wp:docPr id="1" name="Imagen1" descr="La página del instalador en GitHub"/>
             <wp:cNvGraphicFramePr>
               <a:graphicFrameLocks xmlns:a="http://schemas.openxmlformats.org/drawingml/2006/main" noChangeAspect="1"/>
             </wp:cNvGraphicFramePr>
@@ -2306,13 +1691,647 @@
               <a:graphicData uri="http://schemas.openxmlformats.org/drawingml/2006/picture">
                 <pic:pic xmlns:pic="http://schemas.openxmlformats.org/drawingml/2006/picture">
                   <pic:nvPicPr>
-                    <pic:cNvPr id="1" name="Imagen1" descr="PowerShell recién abierta"/>
+                    <pic:cNvPr id="1" name="Imagen1" descr="La página del instalador en GitHub"/>
                     <pic:cNvPicPr>
                       <a:picLocks noChangeAspect="1" noChangeArrowheads="1"/>
                     </pic:cNvPicPr>
                   </pic:nvPicPr>
                   <pic:blipFill>
                     <a:blip r:embed="rId2"/>
+                    <a:stretch>
+                      <a:fillRect/>
+                    </a:stretch>
+                  </pic:blipFill>
+                  <pic:spPr bwMode="auto">
+                    <a:xfrm>
+                      <a:off x="0" y="0"/>
+                      <a:ext cx="13744575" cy="3467100"/>
+                    </a:xfrm>
+                    <a:prstGeom prst="rect">
+                      <a:avLst/>
+                    </a:prstGeom>
+                    <a:noFill/>
+                  </pic:spPr>
+                </pic:pic>
+              </a:graphicData>
+            </a:graphic>
+          </wp:inline>
+        </w:drawing>
+      </w:r>
+      <w:r>
+        <w:rPr/>
+        <w:t xml:space="preserve"> </w:t>
+      </w:r>
+      <w:r>
+        <w:rPr>
+          <w:b/>
+        </w:rPr>
+        <w:t>Figura 1.</w:t>
+      </w:r>
+      <w:r>
+        <w:rPr/>
+        <w:t xml:space="preserve"> La página del instalador. </w:t>
+      </w:r>
+      <w:r>
+        <w:rPr>
+          <w:b/>
+        </w:rPr>
+        <w:t>Círculo 1:</w:t>
+      </w:r>
+      <w:r>
+        <w:rPr/>
+        <w:t xml:space="preserve"> la barra de direcciones, ahí escribes la dirección. </w:t>
+      </w:r>
+      <w:r>
+        <w:rPr>
+          <w:b/>
+        </w:rPr>
+        <w:t>Círculo 2:</w:t>
+      </w:r>
+      <w:r>
+        <w:rPr/>
+        <w:t xml:space="preserve"> el recuadro oscuro con el comando que copiaremos en el Paso D. La flecha señala el botoncito de copiar, que aparece al pasar el mouse por encima. </w:t>
+      </w:r>
+    </w:p>
+    <w:p>
+      <w:pPr>
+        <w:pStyle w:val="Ttulo4paso"/>
+        <w:bidi w:val="0"/>
+        <w:jc w:val="left"/>
+        <w:rPr/>
+      </w:pPr>
+      <w:r>
+        <w:rPr/>
+        <w:t>Paso D. Copiar el comando</w:t>
+      </w:r>
+    </w:p>
+    <w:p>
+      <w:pPr>
+        <w:pStyle w:val="Cuerpodetextochico"/>
+        <w:bidi w:val="0"/>
+        <w:jc w:val="left"/>
+        <w:rPr/>
+      </w:pPr>
+      <w:r>
+        <w:rPr/>
+        <w:t xml:space="preserve">El comando es esta línea larga. </w:t>
+      </w:r>
+      <w:r>
+        <w:rPr>
+          <w:b/>
+        </w:rPr>
+        <w:t>No hace falta escribirla a mano</w:t>
+      </w:r>
+      <w:r>
+        <w:rPr/>
+        <w:t>, la vamos a copiar entera:</w:t>
+      </w:r>
+    </w:p>
+    <w:p>
+      <w:pPr>
+        <w:pStyle w:val="BodyText"/>
+        <w:bidi w:val="0"/>
+        <w:spacing w:before="135" w:after="135"/>
+        <w:ind w:hanging="0" w:left="135" w:right="135"/>
+        <w:jc w:val="left"/>
+        <w:rPr>
+          <w:rFonts w:ascii="DejaVu Sans Mono;monospace" w:hAnsi="DejaVu Sans Mono;monospace"/>
+          <w:color w:val="E6EDF3"/>
+          <w:sz w:val="16"/>
+          <w:shd w:fill="0D1117" w:val="clear"/>
+        </w:rPr>
+      </w:pPr>
+      <w:r>
+        <w:rPr>
+          <w:rFonts w:ascii="DejaVu Sans Mono;monospace" w:hAnsi="DejaVu Sans Mono;monospace"/>
+          <w:color w:val="E6EDF3"/>
+          <w:sz w:val="16"/>
+          <w:shd w:fill="0D1117" w:val="clear"/>
+        </w:rPr>
+        <w:t xml:space="preserve">irm https://raw.githubusercontent.com/MariaDSalazar/instalador-office-isupol/main/office-isupol.ps1 | iex </w:t>
+      </w:r>
+    </w:p>
+    <w:p>
+      <w:pPr>
+        <w:pStyle w:val="BodyText"/>
+        <w:numPr>
+          <w:ilvl w:val="0"/>
+          <w:numId w:val="6"/>
+        </w:numPr>
+        <w:tabs>
+          <w:tab w:val="clear" w:pos="1134"/>
+          <w:tab w:val="left" w:pos="709" w:leader="none"/>
+        </w:tabs>
+        <w:bidi w:val="0"/>
+        <w:spacing w:before="120" w:after="0"/>
+        <w:ind w:hanging="283" w:left="709" w:right="0"/>
+        <w:jc w:val="left"/>
+        <w:rPr/>
+      </w:pPr>
+      <w:r>
+        <w:rPr/>
+        <w:t xml:space="preserve">Pasa el mouse por encima del recuadro oscuro de la página; en la esquina derecha aparece un </w:t>
+      </w:r>
+      <w:r>
+        <w:rPr>
+          <w:b/>
+        </w:rPr>
+        <w:t>botoncito de copiar</w:t>
+      </w:r>
+      <w:r>
+        <w:rPr/>
+        <w:t xml:space="preserve"> (dos cuadraditos). Haz clic ahí. Si no aparece el botoncito, selecciona el texto con el mouse arrastrando de principio a fin y presiona </w:t>
+      </w:r>
+      <w:r>
+        <w:rPr>
+          <w:rFonts w:ascii="DejaVu Sans;sans-serif" w:hAnsi="DejaVu Sans;sans-serif"/>
+          <w:sz w:val="17"/>
+          <w:bdr w:val="single" w:sz="2" w:space="1" w:color="999999"/>
+          <w:shd w:fill="FAFAFA" w:val="clear"/>
+        </w:rPr>
+        <w:t>Ctrl</w:t>
+      </w:r>
+      <w:r>
+        <w:rPr/>
+        <w:t>+</w:t>
+      </w:r>
+      <w:r>
+        <w:rPr>
+          <w:rFonts w:ascii="DejaVu Sans;sans-serif" w:hAnsi="DejaVu Sans;sans-serif"/>
+          <w:sz w:val="17"/>
+          <w:bdr w:val="single" w:sz="2" w:space="1" w:color="999999"/>
+          <w:shd w:fill="FAFAFA" w:val="clear"/>
+        </w:rPr>
+        <w:t>C</w:t>
+      </w:r>
+      <w:r>
+        <w:rPr/>
+        <w:t xml:space="preserve">. </w:t>
+      </w:r>
+    </w:p>
+    <w:p>
+      <w:pPr>
+        <w:pStyle w:val="BodyText"/>
+        <w:numPr>
+          <w:ilvl w:val="0"/>
+          <w:numId w:val="6"/>
+        </w:numPr>
+        <w:tabs>
+          <w:tab w:val="clear" w:pos="1134"/>
+          <w:tab w:val="left" w:pos="829" w:leader="none"/>
+        </w:tabs>
+        <w:bidi w:val="0"/>
+        <w:spacing w:before="120" w:after="0"/>
+        <w:ind w:hanging="283" w:left="829"/>
+        <w:jc w:val="left"/>
+        <w:rPr/>
+      </w:pPr>
+      <w:r>
+        <w:rPr/>
+        <w:t xml:space="preserve">El comando ya está copiado, aunque no veas ningún cambio en la pantalla. Es normal. </w:t>
+      </w:r>
+    </w:p>
+    <w:p>
+      <w:pPr>
+        <w:pStyle w:val="BodyText"/>
+        <w:numPr>
+          <w:ilvl w:val="0"/>
+          <w:numId w:val="6"/>
+        </w:numPr>
+        <w:tabs>
+          <w:tab w:val="clear" w:pos="1134"/>
+          <w:tab w:val="left" w:pos="829" w:leader="none"/>
+        </w:tabs>
+        <w:bidi w:val="0"/>
+        <w:ind w:hanging="283" w:left="829"/>
+        <w:jc w:val="left"/>
+        <w:rPr/>
+      </w:pPr>
+      <w:r>
+        <w:rPr>
+          <w:b/>
+        </w:rPr>
+        <w:t>No cierres el navegador todavía</w:t>
+      </w:r>
+      <w:r>
+        <w:rPr/>
+        <w:t xml:space="preserve">, por si hay que copiarlo de nuevo. </w:t>
+      </w:r>
+    </w:p>
+    <w:p>
+      <w:pPr>
+        <w:pStyle w:val="BodyText"/>
+        <w:bidi w:val="0"/>
+        <w:spacing w:before="180" w:after="180"/>
+        <w:ind w:hanging="0" w:left="180" w:right="180"/>
+        <w:jc w:val="left"/>
+        <w:rPr/>
+      </w:pPr>
+      <w:r>
+        <w:rPr>
+          <w:b/>
+          <w:sz w:val="19"/>
+          <w:bdr w:val="single" w:sz="24" w:space="9" w:color="0D3B66"/>
+          <w:shd w:fill="F4F7FA" w:val="clear"/>
+        </w:rPr>
+        <w:t>¿Qué hace ese comando?</w:t>
+      </w:r>
+      <w:r>
+        <w:rPr>
+          <w:sz w:val="19"/>
+          <w:bdr w:val="single" w:sz="24" w:space="9" w:color="0D3B66"/>
+          <w:shd w:fill="F4F7FA" w:val="clear"/>
+        </w:rPr>
+        <w:t xml:space="preserve"> </w:t>
+      </w:r>
+      <w:r>
+        <w:rPr>
+          <w:rStyle w:val="Textooriginal"/>
+          <w:sz w:val="19"/>
+          <w:bdr w:val="single" w:sz="24" w:space="9" w:color="0D3B66"/>
+          <w:shd w:fill="F4F7FA" w:val="clear"/>
+        </w:rPr>
+        <w:t>irm</w:t>
+      </w:r>
+      <w:r>
+        <w:rPr>
+          <w:sz w:val="19"/>
+          <w:bdr w:val="single" w:sz="24" w:space="9" w:color="0D3B66"/>
+          <w:shd w:fill="F4F7FA" w:val="clear"/>
+        </w:rPr>
+        <w:t xml:space="preserve"> descarga el instalador desde la página, y </w:t>
+      </w:r>
+      <w:r>
+        <w:rPr>
+          <w:rStyle w:val="Textooriginal"/>
+          <w:sz w:val="19"/>
+          <w:bdr w:val="single" w:sz="24" w:space="9" w:color="0D3B66"/>
+          <w:shd w:fill="F4F7FA" w:val="clear"/>
+        </w:rPr>
+        <w:t>iex</w:t>
+      </w:r>
+      <w:r>
+        <w:rPr>
+          <w:sz w:val="19"/>
+          <w:bdr w:val="single" w:sz="24" w:space="9" w:color="0D3B66"/>
+          <w:shd w:fill="F4F7FA" w:val="clear"/>
+        </w:rPr>
+        <w:t xml:space="preserve"> lo ejecuta. Es la misma forma que usa massgrave.dev. El archivo viene del repositorio de la asignatura y descarga Office solo de los servidores de Microsoft.</w:t>
+      </w:r>
+    </w:p>
+    <w:p>
+      <w:pPr>
+        <w:pStyle w:val="Ttulo4paso"/>
+        <w:bidi w:val="0"/>
+        <w:jc w:val="left"/>
+        <w:rPr/>
+      </w:pPr>
+      <w:r>
+        <w:rPr/>
+        <w:t>Paso E. Abrir PowerShell como administrador</w:t>
+      </w:r>
+    </w:p>
+    <w:p>
+      <w:pPr>
+        <w:pStyle w:val="BodyText"/>
+        <w:numPr>
+          <w:ilvl w:val="0"/>
+          <w:numId w:val="7"/>
+        </w:numPr>
+        <w:tabs>
+          <w:tab w:val="clear" w:pos="1134"/>
+          <w:tab w:val="left" w:pos="709" w:leader="none"/>
+        </w:tabs>
+        <w:bidi w:val="0"/>
+        <w:spacing w:before="120" w:after="0"/>
+        <w:ind w:hanging="283" w:left="709" w:right="0"/>
+        <w:jc w:val="left"/>
+        <w:rPr/>
+      </w:pPr>
+      <w:r>
+        <w:rPr/>
+        <w:t xml:space="preserve">Presiona la tecla </w:t>
+      </w:r>
+      <w:r>
+        <w:rPr>
+          <w:rFonts w:ascii="DejaVu Sans;sans-serif" w:hAnsi="DejaVu Sans;sans-serif"/>
+          <w:sz w:val="17"/>
+          <w:bdr w:val="single" w:sz="2" w:space="1" w:color="999999"/>
+          <w:shd w:fill="FAFAFA" w:val="clear"/>
+        </w:rPr>
+        <w:t>Windows</w:t>
+      </w:r>
+      <w:r>
+        <w:rPr/>
+        <w:t xml:space="preserve"> → escribe </w:t>
+      </w:r>
+      <w:r>
+        <w:rPr>
+          <w:rStyle w:val="Textooriginal"/>
+        </w:rPr>
+        <w:t>PowerShell</w:t>
+      </w:r>
+      <w:r>
+        <w:rPr/>
+        <w:t xml:space="preserve">. </w:t>
+      </w:r>
+    </w:p>
+    <w:p>
+      <w:pPr>
+        <w:pStyle w:val="BodyText"/>
+        <w:numPr>
+          <w:ilvl w:val="0"/>
+          <w:numId w:val="7"/>
+        </w:numPr>
+        <w:tabs>
+          <w:tab w:val="clear" w:pos="1134"/>
+          <w:tab w:val="left" w:pos="829" w:leader="none"/>
+        </w:tabs>
+        <w:bidi w:val="0"/>
+        <w:spacing w:before="120" w:after="0"/>
+        <w:ind w:hanging="283" w:left="829"/>
+        <w:jc w:val="left"/>
+        <w:rPr/>
+      </w:pPr>
+      <w:r>
+        <w:rPr/>
+        <w:t xml:space="preserve">Arriba aparece «Windows PowerShell». </w:t>
+      </w:r>
+      <w:r>
+        <w:rPr>
+          <w:b/>
+        </w:rPr>
+        <w:t>No pulses Enter todavía.</w:t>
+      </w:r>
+      <w:r>
+        <w:rPr/>
+        <w:t xml:space="preserve"> </w:t>
+      </w:r>
+    </w:p>
+    <w:p>
+      <w:pPr>
+        <w:pStyle w:val="BodyText"/>
+        <w:numPr>
+          <w:ilvl w:val="0"/>
+          <w:numId w:val="7"/>
+        </w:numPr>
+        <w:tabs>
+          <w:tab w:val="clear" w:pos="1134"/>
+          <w:tab w:val="left" w:pos="829" w:leader="none"/>
+        </w:tabs>
+        <w:bidi w:val="0"/>
+        <w:spacing w:before="120" w:after="0"/>
+        <w:ind w:hanging="283" w:left="829"/>
+        <w:jc w:val="left"/>
+        <w:rPr/>
+      </w:pPr>
+      <w:r>
+        <w:rPr/>
+        <w:t xml:space="preserve">En el panel de la derecha haz clic en </w:t>
+      </w:r>
+      <w:r>
+        <w:rPr>
+          <w:b/>
+        </w:rPr>
+        <w:t>«Ejecutar como administrador»</w:t>
+      </w:r>
+      <w:r>
+        <w:rPr/>
+        <w:t xml:space="preserve">. Si no ves ese panel, haz clic derecho sobre «Windows PowerShell» y elige esa misma opción del menú. </w:t>
+      </w:r>
+    </w:p>
+    <w:p>
+      <w:pPr>
+        <w:pStyle w:val="BodyText"/>
+        <w:numPr>
+          <w:ilvl w:val="0"/>
+          <w:numId w:val="7"/>
+        </w:numPr>
+        <w:tabs>
+          <w:tab w:val="clear" w:pos="1134"/>
+          <w:tab w:val="left" w:pos="829" w:leader="none"/>
+        </w:tabs>
+        <w:bidi w:val="0"/>
+        <w:spacing w:before="120" w:after="0"/>
+        <w:ind w:hanging="283" w:left="829"/>
+        <w:jc w:val="left"/>
+        <w:rPr/>
+      </w:pPr>
+      <w:r>
+        <w:rPr/>
+        <w:t xml:space="preserve">Es </w:t>
+      </w:r>
+      <w:r>
+        <w:rPr>
+          <w:b/>
+        </w:rPr>
+        <w:t>muy importante</w:t>
+      </w:r>
+      <w:r>
+        <w:rPr/>
+        <w:t xml:space="preserve"> que sea la opción como administrador y no la normal: sin esos permisos, la instalación no puede empezar. </w:t>
+      </w:r>
+    </w:p>
+    <w:p>
+      <w:pPr>
+        <w:pStyle w:val="BodyText"/>
+        <w:numPr>
+          <w:ilvl w:val="0"/>
+          <w:numId w:val="7"/>
+        </w:numPr>
+        <w:tabs>
+          <w:tab w:val="clear" w:pos="1134"/>
+          <w:tab w:val="left" w:pos="829" w:leader="none"/>
+        </w:tabs>
+        <w:bidi w:val="0"/>
+        <w:ind w:hanging="283" w:left="829"/>
+        <w:jc w:val="left"/>
+        <w:rPr/>
+      </w:pPr>
+      <w:r>
+        <w:rPr/>
+        <w:t xml:space="preserve">Windows preguntará si permites cambios → haz clic en </w:t>
+      </w:r>
+      <w:r>
+        <w:rPr>
+          <w:b/>
+        </w:rPr>
+        <w:t>Sí</w:t>
+      </w:r>
+      <w:r>
+        <w:rPr/>
+        <w:t xml:space="preserve">. Ese aviso azul es normal y sale siempre. </w:t>
+      </w:r>
+    </w:p>
+    <w:p>
+      <w:pPr>
+        <w:pStyle w:val="BodyText"/>
+        <w:bidi w:val="0"/>
+        <w:spacing w:before="120" w:after="0"/>
+        <w:jc w:val="left"/>
+        <w:rPr/>
+      </w:pPr>
+      <w:r>
+        <w:rPr/>
+        <w:drawing>
+          <wp:inline distT="0" distB="0" distL="0" distR="0">
+            <wp:extent cx="11239500" cy="6667500"/>
+            <wp:effectExtent l="0" t="0" r="0" b="0"/>
+            <wp:docPr id="2" name="Imagen2" descr="Buscar PowerShell en el menú Inicio"/>
+            <wp:cNvGraphicFramePr>
+              <a:graphicFrameLocks xmlns:a="http://schemas.openxmlformats.org/drawingml/2006/main" noChangeAspect="1"/>
+            </wp:cNvGraphicFramePr>
+            <a:graphic xmlns:a="http://schemas.openxmlformats.org/drawingml/2006/main">
+              <a:graphicData uri="http://schemas.openxmlformats.org/drawingml/2006/picture">
+                <pic:pic xmlns:pic="http://schemas.openxmlformats.org/drawingml/2006/picture">
+                  <pic:nvPicPr>
+                    <pic:cNvPr id="2" name="Imagen2" descr="Buscar PowerShell en el menú Inicio"/>
+                    <pic:cNvPicPr>
+                      <a:picLocks noChangeAspect="1" noChangeArrowheads="1"/>
+                    </pic:cNvPicPr>
+                  </pic:nvPicPr>
+                  <pic:blipFill>
+                    <a:blip r:embed="rId3"/>
+                    <a:stretch>
+                      <a:fillRect/>
+                    </a:stretch>
+                  </pic:blipFill>
+                  <pic:spPr bwMode="auto">
+                    <a:xfrm>
+                      <a:off x="0" y="0"/>
+                      <a:ext cx="11239500" cy="6667500"/>
+                    </a:xfrm>
+                    <a:prstGeom prst="rect">
+                      <a:avLst/>
+                    </a:prstGeom>
+                    <a:noFill/>
+                  </pic:spPr>
+                </pic:pic>
+              </a:graphicData>
+            </a:graphic>
+          </wp:inline>
+        </w:drawing>
+      </w:r>
+      <w:r>
+        <w:rPr/>
+        <w:t xml:space="preserve"> </w:t>
+      </w:r>
+      <w:r>
+        <w:rPr>
+          <w:b/>
+        </w:rPr>
+        <w:t>Figura 2.</w:t>
+      </w:r>
+      <w:r>
+        <w:rPr/>
+        <w:t xml:space="preserve"> El menú Inicio tras escribir «PowerShell». </w:t>
+      </w:r>
+      <w:r>
+        <w:rPr>
+          <w:b/>
+        </w:rPr>
+        <w:t>Recuadro 1:</w:t>
+      </w:r>
+      <w:r>
+        <w:rPr/>
+        <w:t xml:space="preserve"> lo que escribiste. </w:t>
+      </w:r>
+      <w:r>
+        <w:rPr>
+          <w:b/>
+        </w:rPr>
+        <w:t>Recuadro 2:</w:t>
+      </w:r>
+      <w:r>
+        <w:rPr/>
+        <w:t xml:space="preserve"> la opción que hay que elegir, «Ejecutar como administrador». Si haces clic en «Abrir» se abre sin permisos y el instalador no podrá continuar. </w:t>
+      </w:r>
+      <w:r>
+        <w:rPr/>
+        <w:drawing>
+          <wp:inline distT="0" distB="0" distL="0" distR="0">
+            <wp:extent cx="8572500" cy="5334000"/>
+            <wp:effectExtent l="0" t="0" r="0" b="0"/>
+            <wp:docPr id="3" name="Imagen3" descr="El aviso de permisos de Windows"/>
+            <wp:cNvGraphicFramePr>
+              <a:graphicFrameLocks xmlns:a="http://schemas.openxmlformats.org/drawingml/2006/main" noChangeAspect="1"/>
+            </wp:cNvGraphicFramePr>
+            <a:graphic xmlns:a="http://schemas.openxmlformats.org/drawingml/2006/main">
+              <a:graphicData uri="http://schemas.openxmlformats.org/drawingml/2006/picture">
+                <pic:pic xmlns:pic="http://schemas.openxmlformats.org/drawingml/2006/picture">
+                  <pic:nvPicPr>
+                    <pic:cNvPr id="3" name="Imagen3" descr="El aviso de permisos de Windows"/>
+                    <pic:cNvPicPr>
+                      <a:picLocks noChangeAspect="1" noChangeArrowheads="1"/>
+                    </pic:cNvPicPr>
+                  </pic:nvPicPr>
+                  <pic:blipFill>
+                    <a:blip r:embed="rId4"/>
+                    <a:stretch>
+                      <a:fillRect/>
+                    </a:stretch>
+                  </pic:blipFill>
+                  <pic:spPr bwMode="auto">
+                    <a:xfrm>
+                      <a:off x="0" y="0"/>
+                      <a:ext cx="8572500" cy="5334000"/>
+                    </a:xfrm>
+                    <a:prstGeom prst="rect">
+                      <a:avLst/>
+                    </a:prstGeom>
+                    <a:noFill/>
+                  </pic:spPr>
+                </pic:pic>
+              </a:graphicData>
+            </a:graphic>
+          </wp:inline>
+        </w:drawing>
+      </w:r>
+      <w:r>
+        <w:rPr/>
+        <w:t xml:space="preserve"> </w:t>
+      </w:r>
+      <w:r>
+        <w:rPr>
+          <w:b/>
+        </w:rPr>
+        <w:t>Figura 3.</w:t>
+      </w:r>
+      <w:r>
+        <w:rPr/>
+        <w:t xml:space="preserve"> Este aviso es normal y sale siempre que un programa necesita permisos de administrador. La flecha señala el botón </w:t>
+      </w:r>
+      <w:r>
+        <w:rPr>
+          <w:b/>
+        </w:rPr>
+        <w:t>Sí</w:t>
+      </w:r>
+      <w:r>
+        <w:rPr/>
+        <w:t xml:space="preserve">, que es el que hay que pulsar. </w:t>
+      </w:r>
+      <w:r>
+        <w:rPr/>
+        <w:drawing>
+          <wp:inline distT="0" distB="0" distL="0" distR="0">
+            <wp:extent cx="16964025" cy="4038600"/>
+            <wp:effectExtent l="0" t="0" r="0" b="0"/>
+            <wp:docPr id="4" name="Imagen4" descr="PowerShell recién abierta"/>
+            <wp:cNvGraphicFramePr>
+              <a:graphicFrameLocks xmlns:a="http://schemas.openxmlformats.org/drawingml/2006/main" noChangeAspect="1"/>
+            </wp:cNvGraphicFramePr>
+            <a:graphic xmlns:a="http://schemas.openxmlformats.org/drawingml/2006/main">
+              <a:graphicData uri="http://schemas.openxmlformats.org/drawingml/2006/picture">
+                <pic:pic xmlns:pic="http://schemas.openxmlformats.org/drawingml/2006/picture">
+                  <pic:nvPicPr>
+                    <pic:cNvPr id="4" name="Imagen4" descr="PowerShell recién abierta"/>
+                    <pic:cNvPicPr>
+                      <a:picLocks noChangeAspect="1" noChangeArrowheads="1"/>
+                    </pic:cNvPicPr>
+                  </pic:nvPicPr>
+                  <pic:blipFill>
+                    <a:blip r:embed="rId5"/>
                     <a:stretch>
                       <a:fillRect/>
                     </a:stretch>
@@ -2579,7 +2598,7 @@
           <wp:inline distT="0" distB="0" distL="0" distR="0">
             <wp:extent cx="16478250" cy="4362450"/>
             <wp:effectExtent l="0" t="0" r="0" b="0"/>
-            <wp:docPr id="2" name="Imagen2" descr="El comando pegado en PowerShell"/>
+            <wp:docPr id="5" name="Imagen5" descr="El comando pegado en PowerShell"/>
             <wp:cNvGraphicFramePr>
               <a:graphicFrameLocks xmlns:a="http://schemas.openxmlformats.org/drawingml/2006/main" noChangeAspect="1"/>
             </wp:cNvGraphicFramePr>
@@ -2587,13 +2606,13 @@
               <a:graphicData uri="http://schemas.openxmlformats.org/drawingml/2006/picture">
                 <pic:pic xmlns:pic="http://schemas.openxmlformats.org/drawingml/2006/picture">
                   <pic:nvPicPr>
-                    <pic:cNvPr id="2" name="Imagen2" descr="El comando pegado en PowerShell"/>
+                    <pic:cNvPr id="5" name="Imagen5" descr="El comando pegado en PowerShell"/>
                     <pic:cNvPicPr>
                       <a:picLocks noChangeAspect="1" noChangeArrowheads="1"/>
                     </pic:cNvPicPr>
                   </pic:nvPicPr>
                   <pic:blipFill>
-                    <a:blip r:embed="rId3"/>
+                    <a:blip r:embed="rId6"/>
                     <a:stretch>
                       <a:fillRect/>
                     </a:stretch>
@@ -2696,7 +2715,7 @@
           <wp:inline distT="0" distB="0" distL="0" distR="0">
             <wp:extent cx="16602075" cy="5657850"/>
             <wp:effectExtent l="0" t="0" r="0" b="0"/>
-            <wp:docPr id="3" name="Imagen3" descr="Portada del instalador"/>
+            <wp:docPr id="6" name="Imagen6" descr="Portada del instalador"/>
             <wp:cNvGraphicFramePr>
               <a:graphicFrameLocks xmlns:a="http://schemas.openxmlformats.org/drawingml/2006/main" noChangeAspect="1"/>
             </wp:cNvGraphicFramePr>
@@ -2704,13 +2723,13 @@
               <a:graphicData uri="http://schemas.openxmlformats.org/drawingml/2006/picture">
                 <pic:pic xmlns:pic="http://schemas.openxmlformats.org/drawingml/2006/picture">
                   <pic:nvPicPr>
-                    <pic:cNvPr id="3" name="Imagen3" descr="Portada del instalador"/>
+                    <pic:cNvPr id="6" name="Imagen6" descr="Portada del instalador"/>
                     <pic:cNvPicPr>
                       <a:picLocks noChangeAspect="1" noChangeArrowheads="1"/>
                     </pic:cNvPicPr>
                   </pic:nvPicPr>
                   <pic:blipFill>
-                    <a:blip r:embed="rId4"/>
+                    <a:blip r:embed="rId7"/>
                     <a:stretch>
                       <a:fillRect/>
                     </a:stretch>
@@ -2794,7 +2813,7 @@
           <wp:inline distT="0" distB="0" distL="0" distR="0">
             <wp:extent cx="16602075" cy="5334000"/>
             <wp:effectExtent l="0" t="0" r="0" b="0"/>
-            <wp:docPr id="4" name="Imagen4" descr="Revisión del equipo"/>
+            <wp:docPr id="7" name="Imagen7" descr="Revisión del equipo"/>
             <wp:cNvGraphicFramePr>
               <a:graphicFrameLocks xmlns:a="http://schemas.openxmlformats.org/drawingml/2006/main" noChangeAspect="1"/>
             </wp:cNvGraphicFramePr>
@@ -2802,13 +2821,13 @@
               <a:graphicData uri="http://schemas.openxmlformats.org/drawingml/2006/picture">
                 <pic:pic xmlns:pic="http://schemas.openxmlformats.org/drawingml/2006/picture">
                   <pic:nvPicPr>
-                    <pic:cNvPr id="4" name="Imagen4" descr="Revisión del equipo"/>
+                    <pic:cNvPr id="7" name="Imagen7" descr="Revisión del equipo"/>
                     <pic:cNvPicPr>
                       <a:picLocks noChangeAspect="1" noChangeArrowheads="1"/>
                     </pic:cNvPicPr>
                   </pic:nvPicPr>
                   <pic:blipFill>
-                    <a:blip r:embed="rId5"/>
+                    <a:blip r:embed="rId8"/>
                     <a:stretch>
                       <a:fillRect/>
                     </a:stretch>
@@ -3386,7 +3405,7 @@
           <wp:inline distT="0" distB="0" distL="0" distR="0">
             <wp:extent cx="20069175" cy="5010150"/>
             <wp:effectExtent l="0" t="0" r="0" b="0"/>
-            <wp:docPr id="5" name="Imagen5" descr="Tabla de versiones"/>
+            <wp:docPr id="8" name="Imagen8" descr="Tabla de versiones"/>
             <wp:cNvGraphicFramePr>
               <a:graphicFrameLocks xmlns:a="http://schemas.openxmlformats.org/drawingml/2006/main" noChangeAspect="1"/>
             </wp:cNvGraphicFramePr>
@@ -3394,13 +3413,13 @@
               <a:graphicData uri="http://schemas.openxmlformats.org/drawingml/2006/picture">
                 <pic:pic xmlns:pic="http://schemas.openxmlformats.org/drawingml/2006/picture">
                   <pic:nvPicPr>
-                    <pic:cNvPr id="5" name="Imagen5" descr="Tabla de versiones"/>
+                    <pic:cNvPr id="8" name="Imagen8" descr="Tabla de versiones"/>
                     <pic:cNvPicPr>
                       <a:picLocks noChangeAspect="1" noChangeArrowheads="1"/>
                     </pic:cNvPicPr>
                   </pic:nvPicPr>
                   <pic:blipFill>
-                    <a:blip r:embed="rId6"/>
+                    <a:blip r:embed="rId9"/>
                     <a:stretch>
                       <a:fillRect/>
                     </a:stretch>
@@ -3864,7 +3883,7 @@
           <wp:inline distT="0" distB="0" distL="0" distR="0">
             <wp:extent cx="16840200" cy="4686300"/>
             <wp:effectExtent l="0" t="0" r="0" b="0"/>
-            <wp:docPr id="6" name="Imagen6" descr="Otras opciones del menú"/>
+            <wp:docPr id="9" name="Imagen9" descr="Otras opciones del menú"/>
             <wp:cNvGraphicFramePr>
               <a:graphicFrameLocks xmlns:a="http://schemas.openxmlformats.org/drawingml/2006/main" noChangeAspect="1"/>
             </wp:cNvGraphicFramePr>
@@ -3872,13 +3891,13 @@
               <a:graphicData uri="http://schemas.openxmlformats.org/drawingml/2006/picture">
                 <pic:pic xmlns:pic="http://schemas.openxmlformats.org/drawingml/2006/picture">
                   <pic:nvPicPr>
-                    <pic:cNvPr id="6" name="Imagen6" descr="Otras opciones del menú"/>
+                    <pic:cNvPr id="9" name="Imagen9" descr="Otras opciones del menú"/>
                     <pic:cNvPicPr>
                       <a:picLocks noChangeAspect="1" noChangeArrowheads="1"/>
                     </pic:cNvPicPr>
                   </pic:nvPicPr>
                   <pic:blipFill>
-                    <a:blip r:embed="rId7"/>
+                    <a:blip r:embed="rId10"/>
                     <a:stretch>
                       <a:fillRect/>
                     </a:stretch>
@@ -3959,7 +3978,7 @@
           <wp:inline distT="0" distB="0" distL="0" distR="0">
             <wp:extent cx="16478250" cy="5010150"/>
             <wp:effectExtent l="0" t="0" r="0" b="0"/>
-            <wp:docPr id="7" name="Imagen7" descr="Dónde escribir el número"/>
+            <wp:docPr id="10" name="Imagen10" descr="Dónde escribir el número"/>
             <wp:cNvGraphicFramePr>
               <a:graphicFrameLocks xmlns:a="http://schemas.openxmlformats.org/drawingml/2006/main" noChangeAspect="1"/>
             </wp:cNvGraphicFramePr>
@@ -3967,13 +3986,13 @@
               <a:graphicData uri="http://schemas.openxmlformats.org/drawingml/2006/picture">
                 <pic:pic xmlns:pic="http://schemas.openxmlformats.org/drawingml/2006/picture">
                   <pic:nvPicPr>
-                    <pic:cNvPr id="7" name="Imagen7" descr="Dónde escribir el número"/>
+                    <pic:cNvPr id="10" name="Imagen10" descr="Dónde escribir el número"/>
                     <pic:cNvPicPr>
                       <a:picLocks noChangeAspect="1" noChangeArrowheads="1"/>
                     </pic:cNvPicPr>
                   </pic:nvPicPr>
                   <pic:blipFill>
-                    <a:blip r:embed="rId8"/>
+                    <a:blip r:embed="rId11"/>
                     <a:stretch>
                       <a:fillRect/>
                     </a:stretch>
@@ -4182,7 +4201,7 @@
           <wp:inline distT="0" distB="0" distL="0" distR="0">
             <wp:extent cx="16602075" cy="5334000"/>
             <wp:effectExtent l="0" t="0" r="0" b="0"/>
-            <wp:docPr id="8" name="Imagen8" descr="Resumen de la instalación"/>
+            <wp:docPr id="11" name="Imagen11" descr="Resumen de la instalación"/>
             <wp:cNvGraphicFramePr>
               <a:graphicFrameLocks xmlns:a="http://schemas.openxmlformats.org/drawingml/2006/main" noChangeAspect="1"/>
             </wp:cNvGraphicFramePr>
@@ -4190,13 +4209,13 @@
               <a:graphicData uri="http://schemas.openxmlformats.org/drawingml/2006/picture">
                 <pic:pic xmlns:pic="http://schemas.openxmlformats.org/drawingml/2006/picture">
                   <pic:nvPicPr>
-                    <pic:cNvPr id="8" name="Imagen8" descr="Resumen de la instalación"/>
+                    <pic:cNvPr id="11" name="Imagen11" descr="Resumen de la instalación"/>
                     <pic:cNvPicPr>
                       <a:picLocks noChangeAspect="1" noChangeArrowheads="1"/>
                     </pic:cNvPicPr>
                   </pic:nvPicPr>
                   <pic:blipFill>
-                    <a:blip r:embed="rId9"/>
+                    <a:blip r:embed="rId12"/>
                     <a:stretch>
                       <a:fillRect/>
                     </a:stretch>
@@ -4237,7 +4256,7 @@
           <wp:inline distT="0" distB="0" distL="0" distR="0">
             <wp:extent cx="16363950" cy="5010150"/>
             <wp:effectExtent l="0" t="0" r="0" b="0"/>
-            <wp:docPr id="9" name="Imagen9" descr="Aviso de no cerrar"/>
+            <wp:docPr id="12" name="Imagen12" descr="Aviso de no cerrar"/>
             <wp:cNvGraphicFramePr>
               <a:graphicFrameLocks xmlns:a="http://schemas.openxmlformats.org/drawingml/2006/main" noChangeAspect="1"/>
             </wp:cNvGraphicFramePr>
@@ -4245,13 +4264,13 @@
               <a:graphicData uri="http://schemas.openxmlformats.org/drawingml/2006/picture">
                 <pic:pic xmlns:pic="http://schemas.openxmlformats.org/drawingml/2006/picture">
                   <pic:nvPicPr>
-                    <pic:cNvPr id="9" name="Imagen9" descr="Aviso de no cerrar"/>
+                    <pic:cNvPr id="12" name="Imagen12" descr="Aviso de no cerrar"/>
                     <pic:cNvPicPr>
                       <a:picLocks noChangeAspect="1" noChangeArrowheads="1"/>
                     </pic:cNvPicPr>
                   </pic:nvPicPr>
                   <pic:blipFill>
-                    <a:blip r:embed="rId10"/>
+                    <a:blip r:embed="rId13"/>
                     <a:stretch>
                       <a:fillRect/>
                     </a:stretch>
@@ -4292,7 +4311,7 @@
           <wp:inline distT="0" distB="0" distL="0" distR="0">
             <wp:extent cx="16240125" cy="3390900"/>
             <wp:effectExtent l="0" t="0" r="0" b="0"/>
-            <wp:docPr id="10" name="Imagen10" descr="Confirmación 1 o 2"/>
+            <wp:docPr id="13" name="Imagen13" descr="Confirmación 1 o 2"/>
             <wp:cNvGraphicFramePr>
               <a:graphicFrameLocks xmlns:a="http://schemas.openxmlformats.org/drawingml/2006/main" noChangeAspect="1"/>
             </wp:cNvGraphicFramePr>
@@ -4300,13 +4319,13 @@
               <a:graphicData uri="http://schemas.openxmlformats.org/drawingml/2006/picture">
                 <pic:pic xmlns:pic="http://schemas.openxmlformats.org/drawingml/2006/picture">
                   <pic:nvPicPr>
-                    <pic:cNvPr id="10" name="Imagen10" descr="Confirmación 1 o 2"/>
+                    <pic:cNvPr id="13" name="Imagen13" descr="Confirmación 1 o 2"/>
                     <pic:cNvPicPr>
                       <a:picLocks noChangeAspect="1" noChangeArrowheads="1"/>
                     </pic:cNvPicPr>
                   </pic:nvPicPr>
                   <pic:blipFill>
-                    <a:blip r:embed="rId11"/>
+                    <a:blip r:embed="rId14"/>
                     <a:stretch>
                       <a:fillRect/>
                     </a:stretch>
@@ -4516,7 +4535,7 @@
           <wp:inline distT="0" distB="0" distL="0" distR="0">
             <wp:extent cx="20907375" cy="2743200"/>
             <wp:effectExtent l="0" t="0" r="0" b="0"/>
-            <wp:docPr id="11" name="Imagen11" descr="Barra de descarga"/>
+            <wp:docPr id="14" name="Imagen14" descr="Barra de descarga"/>
             <wp:cNvGraphicFramePr>
               <a:graphicFrameLocks xmlns:a="http://schemas.openxmlformats.org/drawingml/2006/main" noChangeAspect="1"/>
             </wp:cNvGraphicFramePr>
@@ -4524,13 +4543,13 @@
               <a:graphicData uri="http://schemas.openxmlformats.org/drawingml/2006/picture">
                 <pic:pic xmlns:pic="http://schemas.openxmlformats.org/drawingml/2006/picture">
                   <pic:nvPicPr>
-                    <pic:cNvPr id="11" name="Imagen11" descr="Barra de descarga"/>
+                    <pic:cNvPr id="14" name="Imagen14" descr="Barra de descarga"/>
                     <pic:cNvPicPr>
                       <a:picLocks noChangeAspect="1" noChangeArrowheads="1"/>
                     </pic:cNvPicPr>
                   </pic:nvPicPr>
                   <pic:blipFill>
-                    <a:blip r:embed="rId12"/>
+                    <a:blip r:embed="rId15"/>
                     <a:stretch>
                       <a:fillRect/>
                     </a:stretch>
@@ -4571,7 +4590,7 @@
           <wp:inline distT="0" distB="0" distL="0" distR="0">
             <wp:extent cx="16964025" cy="7924800"/>
             <wp:effectExtent l="0" t="0" r="0" b="0"/>
-            <wp:docPr id="12" name="Imagen12" descr="Los tres pasos de la instalación"/>
+            <wp:docPr id="15" name="Imagen15" descr="Los tres pasos de la instalación"/>
             <wp:cNvGraphicFramePr>
               <a:graphicFrameLocks xmlns:a="http://schemas.openxmlformats.org/drawingml/2006/main" noChangeAspect="1"/>
             </wp:cNvGraphicFramePr>
@@ -4579,13 +4598,13 @@
               <a:graphicData uri="http://schemas.openxmlformats.org/drawingml/2006/picture">
                 <pic:pic xmlns:pic="http://schemas.openxmlformats.org/drawingml/2006/picture">
                   <pic:nvPicPr>
-                    <pic:cNvPr id="12" name="Imagen12" descr="Los tres pasos de la instalación"/>
+                    <pic:cNvPr id="15" name="Imagen15" descr="Los tres pasos de la instalación"/>
                     <pic:cNvPicPr>
                       <a:picLocks noChangeAspect="1" noChangeArrowheads="1"/>
                     </pic:cNvPicPr>
                   </pic:nvPicPr>
                   <pic:blipFill>
-                    <a:blip r:embed="rId13"/>
+                    <a:blip r:embed="rId16"/>
                     <a:stretch>
                       <a:fillRect/>
                     </a:stretch>
@@ -4675,7 +4694,7 @@
           <wp:inline distT="0" distB="0" distL="0" distR="0">
             <wp:extent cx="15878175" cy="4362450"/>
             <wp:effectExtent l="0" t="0" r="0" b="0"/>
-            <wp:docPr id="13" name="Imagen13" descr="Office instalado correctamente"/>
+            <wp:docPr id="16" name="Imagen16" descr="Office instalado correctamente"/>
             <wp:cNvGraphicFramePr>
               <a:graphicFrameLocks xmlns:a="http://schemas.openxmlformats.org/drawingml/2006/main" noChangeAspect="1"/>
             </wp:cNvGraphicFramePr>
@@ -4683,13 +4702,13 @@
               <a:graphicData uri="http://schemas.openxmlformats.org/drawingml/2006/picture">
                 <pic:pic xmlns:pic="http://schemas.openxmlformats.org/drawingml/2006/picture">
                   <pic:nvPicPr>
-                    <pic:cNvPr id="13" name="Imagen13" descr="Office instalado correctamente"/>
+                    <pic:cNvPr id="16" name="Imagen16" descr="Office instalado correctamente"/>
                     <pic:cNvPicPr>
                       <a:picLocks noChangeAspect="1" noChangeArrowheads="1"/>
                     </pic:cNvPicPr>
                   </pic:nvPicPr>
                   <pic:blipFill>
-                    <a:blip r:embed="rId14"/>
+                    <a:blip r:embed="rId17"/>
                     <a:stretch>
                       <a:fillRect/>
                     </a:stretch>
@@ -4788,7 +4807,7 @@
           <wp:inline distT="0" distB="0" distL="0" distR="0">
             <wp:extent cx="16964025" cy="6953250"/>
             <wp:effectExtent l="0" t="0" r="0" b="0"/>
-            <wp:docPr id="14" name="Imagen14" descr="Aviso sobre el antivirus"/>
+            <wp:docPr id="17" name="Imagen17" descr="Aviso sobre el antivirus"/>
             <wp:cNvGraphicFramePr>
               <a:graphicFrameLocks xmlns:a="http://schemas.openxmlformats.org/drawingml/2006/main" noChangeAspect="1"/>
             </wp:cNvGraphicFramePr>
@@ -4796,13 +4815,13 @@
               <a:graphicData uri="http://schemas.openxmlformats.org/drawingml/2006/picture">
                 <pic:pic xmlns:pic="http://schemas.openxmlformats.org/drawingml/2006/picture">
                   <pic:nvPicPr>
-                    <pic:cNvPr id="14" name="Imagen14" descr="Aviso sobre el antivirus"/>
+                    <pic:cNvPr id="17" name="Imagen17" descr="Aviso sobre el antivirus"/>
                     <pic:cNvPicPr>
                       <a:picLocks noChangeAspect="1" noChangeArrowheads="1"/>
                     </pic:cNvPicPr>
                   </pic:nvPicPr>
                   <pic:blipFill>
-                    <a:blip r:embed="rId15"/>
+                    <a:blip r:embed="rId18"/>
                     <a:stretch>
                       <a:fillRect/>
                     </a:stretch>
@@ -4984,7 +5003,7 @@
           <wp:inline distT="0" distB="0" distL="0" distR="0">
             <wp:extent cx="21155025" cy="4362450"/>
             <wp:effectExtent l="0" t="0" r="0" b="0"/>
-            <wp:docPr id="15" name="Imagen15" descr="Números que se usan en MAS"/>
+            <wp:docPr id="18" name="Imagen18" descr="Números que se usan en MAS"/>
             <wp:cNvGraphicFramePr>
               <a:graphicFrameLocks xmlns:a="http://schemas.openxmlformats.org/drawingml/2006/main" noChangeAspect="1"/>
             </wp:cNvGraphicFramePr>
@@ -4992,13 +5011,13 @@
               <a:graphicData uri="http://schemas.openxmlformats.org/drawingml/2006/picture">
                 <pic:pic xmlns:pic="http://schemas.openxmlformats.org/drawingml/2006/picture">
                   <pic:nvPicPr>
-                    <pic:cNvPr id="15" name="Imagen15" descr="Números que se usan en MAS"/>
+                    <pic:cNvPr id="18" name="Imagen18" descr="Números que se usan en MAS"/>
                     <pic:cNvPicPr>
                       <a:picLocks noChangeAspect="1" noChangeArrowheads="1"/>
                     </pic:cNvPicPr>
                   </pic:nvPicPr>
                   <pic:blipFill>
-                    <a:blip r:embed="rId16"/>
+                    <a:blip r:embed="rId19"/>
                     <a:stretch>
                       <a:fillRect/>
                     </a:stretch>
@@ -5348,209 +5367,6 @@
     <w:p>
       <w:pPr>
         <w:pStyle w:val="BodyText"/>
-        <w:keepLines/>
-        <w:bidi w:val="0"/>
-        <w:spacing w:before="210" w:after="210"/>
-        <w:ind w:hanging="0" w:left="210" w:right="210"/>
-        <w:jc w:val="center"/>
-        <w:rPr>
-          <w:rFonts w:ascii="DejaVu Sans;sans-serif" w:hAnsi="DejaVu Sans;sans-serif"/>
-          <w:color w:val="666677"/>
-          <w:sz w:val="18"/>
-          <w:bdr w:val="dashed" w:sz="12" w:space="15" w:color="B0BCC7"/>
-          <w:shd w:fill="F8FAFB" w:val="clear"/>
-        </w:rPr>
-      </w:pPr>
-      <w:r>
-        <w:rPr>
-          <w:rFonts w:ascii="DejaVu Sans;sans-serif" w:hAnsi="DejaVu Sans;sans-serif"/>
-          <w:b/>
-          <w:color w:val="666677"/>
-          <w:sz w:val="18"/>
-          <w:bdr w:val="dashed" w:sz="12" w:space="15" w:color="B0BCC7"/>
-          <w:shd w:fill="F8FAFB" w:val="clear"/>
-        </w:rPr>
-        <w:t>Figura 19 · El menú de MAS</w:t>
-      </w:r>
-      <w:r>
-        <w:rPr>
-          <w:rFonts w:ascii="DejaVu Sans;sans-serif" w:hAnsi="DejaVu Sans;sans-serif"/>
-          <w:color w:val="666677"/>
-          <w:sz w:val="18"/>
-          <w:bdr w:val="dashed" w:sz="12" w:space="15" w:color="B0BCC7"/>
-          <w:shd w:fill="F8FAFB" w:val="clear"/>
-        </w:rPr>
-        <w:t xml:space="preserve"> Aquí va tu captura del menú de MAS ya abierto.</w:t>
-        <w:br/>
-        <w:t xml:space="preserve">Dibuja una flecha roja a la opción </w:t>
-      </w:r>
-      <w:r>
-        <w:rPr>
-          <w:rFonts w:ascii="DejaVu Sans;sans-serif" w:hAnsi="DejaVu Sans;sans-serif"/>
-          <w:b/>
-          <w:color w:val="666677"/>
-          <w:sz w:val="18"/>
-          <w:bdr w:val="dashed" w:sz="12" w:space="15" w:color="B0BCC7"/>
-          <w:shd w:fill="F8FAFB" w:val="clear"/>
-        </w:rPr>
-        <w:t>2</w:t>
-      </w:r>
-      <w:r>
-        <w:rPr>
-          <w:rFonts w:ascii="DejaVu Sans;sans-serif" w:hAnsi="DejaVu Sans;sans-serif"/>
-          <w:color w:val="666677"/>
-          <w:sz w:val="18"/>
-          <w:bdr w:val="dashed" w:sz="12" w:space="15" w:color="B0BCC7"/>
-          <w:shd w:fill="F8FAFB" w:val="clear"/>
-        </w:rPr>
-        <w:t xml:space="preserve"> (Office), que es la que vas a escribir.</w:t>
-      </w:r>
-    </w:p>
-    <w:p>
-      <w:pPr>
-        <w:pStyle w:val="BodyText"/>
-        <w:keepLines/>
-        <w:bidi w:val="0"/>
-        <w:spacing w:before="210" w:after="210"/>
-        <w:ind w:hanging="0" w:left="210" w:right="210"/>
-        <w:jc w:val="center"/>
-        <w:rPr>
-          <w:rFonts w:ascii="DejaVu Sans;sans-serif" w:hAnsi="DejaVu Sans;sans-serif"/>
-          <w:color w:val="666677"/>
-          <w:sz w:val="18"/>
-          <w:bdr w:val="dashed" w:sz="12" w:space="15" w:color="B0BCC7"/>
-          <w:shd w:fill="F8FAFB" w:val="clear"/>
-        </w:rPr>
-      </w:pPr>
-      <w:r>
-        <w:rPr>
-          <w:rFonts w:ascii="DejaVu Sans;sans-serif" w:hAnsi="DejaVu Sans;sans-serif"/>
-          <w:b/>
-          <w:color w:val="666677"/>
-          <w:sz w:val="18"/>
-          <w:bdr w:val="dashed" w:sz="12" w:space="15" w:color="B0BCC7"/>
-          <w:shd w:fill="F8FAFB" w:val="clear"/>
-        </w:rPr>
-        <w:t>Figura 20 · La señal de éxito de MAS</w:t>
-      </w:r>
-      <w:r>
-        <w:rPr>
-          <w:rFonts w:ascii="DejaVu Sans;sans-serif" w:hAnsi="DejaVu Sans;sans-serif"/>
-          <w:color w:val="666677"/>
-          <w:sz w:val="18"/>
-          <w:bdr w:val="dashed" w:sz="12" w:space="15" w:color="B0BCC7"/>
-          <w:shd w:fill="F8FAFB" w:val="clear"/>
-        </w:rPr>
-        <w:t xml:space="preserve"> Aquí va tu captura de la línea verde que confirma que Office quedó activado.</w:t>
-        <w:br/>
-        <w:t>Dibuja una flecha roja a esa línea con el texto «esta es la señal de que salió bien».</w:t>
-      </w:r>
-    </w:p>
-    <w:p>
-      <w:pPr>
-        <w:pStyle w:val="Ttulo4paso"/>
-        <w:bidi w:val="0"/>
-        <w:jc w:val="left"/>
-        <w:rPr/>
-      </w:pPr>
-      <w:r>
-        <w:rPr/>
-        <w:t>Paso K. Comprobar que quedó activado</w:t>
-      </w:r>
-    </w:p>
-    <w:p>
-      <w:pPr>
-        <w:pStyle w:val="BodyText"/>
-        <w:numPr>
-          <w:ilvl w:val="0"/>
-          <w:numId w:val="12"/>
-        </w:numPr>
-        <w:tabs>
-          <w:tab w:val="clear" w:pos="1134"/>
-          <w:tab w:val="left" w:pos="709" w:leader="none"/>
-        </w:tabs>
-        <w:bidi w:val="0"/>
-        <w:spacing w:before="120" w:after="0"/>
-        <w:ind w:hanging="283" w:left="709" w:right="0"/>
-        <w:jc w:val="left"/>
-        <w:rPr/>
-      </w:pPr>
-      <w:r>
-        <w:rPr/>
-        <w:t xml:space="preserve">En nuestro menú escribe </w:t>
-      </w:r>
-      <w:r>
-        <w:rPr>
-          <w:rFonts w:ascii="DejaVu Sans;sans-serif" w:hAnsi="DejaVu Sans;sans-serif"/>
-          <w:b/>
-          <w:color w:val="FFFFFF"/>
-          <w:sz w:val="18"/>
-          <w:shd w:fill="0D3B66" w:val="clear"/>
-        </w:rPr>
-        <w:t>6</w:t>
-      </w:r>
-      <w:r>
-        <w:rPr/>
-        <w:t xml:space="preserve"> → </w:t>
-      </w:r>
-      <w:r>
-        <w:rPr>
-          <w:rFonts w:ascii="DejaVu Sans;sans-serif" w:hAnsi="DejaVu Sans;sans-serif"/>
-          <w:sz w:val="17"/>
-          <w:bdr w:val="single" w:sz="2" w:space="1" w:color="999999"/>
-          <w:shd w:fill="FAFAFA" w:val="clear"/>
-        </w:rPr>
-        <w:t>Enter</w:t>
-      </w:r>
-      <w:r>
-        <w:rPr/>
-        <w:t xml:space="preserve">. </w:t>
-      </w:r>
-    </w:p>
-    <w:p>
-      <w:pPr>
-        <w:pStyle w:val="BodyText"/>
-        <w:numPr>
-          <w:ilvl w:val="0"/>
-          <w:numId w:val="12"/>
-        </w:numPr>
-        <w:tabs>
-          <w:tab w:val="clear" w:pos="1134"/>
-          <w:tab w:val="left" w:pos="829" w:leader="none"/>
-        </w:tabs>
-        <w:bidi w:val="0"/>
-        <w:ind w:hanging="283" w:left="829"/>
-        <w:jc w:val="left"/>
-        <w:rPr/>
-      </w:pPr>
-      <w:r>
-        <w:rPr/>
-        <w:t xml:space="preserve">Busca la línea </w:t>
-      </w:r>
-      <w:r>
-        <w:rPr>
-          <w:rStyle w:val="Textooriginal"/>
-        </w:rPr>
-        <w:t>LICENSE STATUS</w:t>
-      </w:r>
-      <w:r>
-        <w:rPr/>
-        <w:t xml:space="preserve">. Si pone </w:t>
-      </w:r>
-      <w:r>
-        <w:rPr>
-          <w:rStyle w:val="Textooriginal"/>
-        </w:rPr>
-        <w:t>---LICENSED---</w:t>
-      </w:r>
-      <w:r>
-        <w:rPr/>
-        <w:t xml:space="preserve">, está activado. </w:t>
-      </w:r>
-    </w:p>
-    <w:p>
-      <w:pPr>
-        <w:pStyle w:val="BodyText"/>
         <w:bidi w:val="0"/>
         <w:jc w:val="left"/>
         <w:rPr/>
@@ -5559,9 +5375,9 @@
         <w:rPr/>
         <w:drawing>
           <wp:inline distT="0" distB="0" distL="0" distR="0">
-            <wp:extent cx="16363950" cy="6629400"/>
+            <wp:extent cx="16725900" cy="8896350"/>
             <wp:effectExtent l="0" t="0" r="0" b="0"/>
-            <wp:docPr id="16" name="Imagen16" descr="Comprobar la licencia"/>
+            <wp:docPr id="19" name="Imagen19" descr="El menú de MAS"/>
             <wp:cNvGraphicFramePr>
               <a:graphicFrameLocks xmlns:a="http://schemas.openxmlformats.org/drawingml/2006/main" noChangeAspect="1"/>
             </wp:cNvGraphicFramePr>
@@ -5569,13 +5385,283 @@
               <a:graphicData uri="http://schemas.openxmlformats.org/drawingml/2006/picture">
                 <pic:pic xmlns:pic="http://schemas.openxmlformats.org/drawingml/2006/picture">
                   <pic:nvPicPr>
-                    <pic:cNvPr id="16" name="Imagen16" descr="Comprobar la licencia"/>
+                    <pic:cNvPr id="19" name="Imagen19" descr="El menú de MAS"/>
                     <pic:cNvPicPr>
                       <a:picLocks noChangeAspect="1" noChangeArrowheads="1"/>
                     </pic:cNvPicPr>
                   </pic:nvPicPr>
                   <pic:blipFill>
-                    <a:blip r:embed="rId17"/>
+                    <a:blip r:embed="rId20"/>
+                    <a:stretch>
+                      <a:fillRect/>
+                    </a:stretch>
+                  </pic:blipFill>
+                  <pic:spPr bwMode="auto">
+                    <a:xfrm>
+                      <a:off x="0" y="0"/>
+                      <a:ext cx="16725900" cy="8896350"/>
+                    </a:xfrm>
+                    <a:prstGeom prst="rect">
+                      <a:avLst/>
+                    </a:prstGeom>
+                    <a:noFill/>
+                  </pic:spPr>
+                </pic:pic>
+              </a:graphicData>
+            </a:graphic>
+          </wp:inline>
+        </w:drawing>
+      </w:r>
+      <w:r>
+        <w:rPr/>
+        <w:t xml:space="preserve"> </w:t>
+      </w:r>
+      <w:r>
+        <w:rPr>
+          <w:b/>
+        </w:rPr>
+        <w:t>Figura 19.</w:t>
+      </w:r>
+      <w:r>
+        <w:rPr/>
+        <w:t xml:space="preserve"> El menú de MAS. Está en inglés, pero solo necesitas tres números: el </w:t>
+      </w:r>
+      <w:r>
+        <w:rPr>
+          <w:b/>
+        </w:rPr>
+        <w:t>2</w:t>
+      </w:r>
+      <w:r>
+        <w:rPr/>
+        <w:t xml:space="preserve"> (Ohook — Office) para activar, el </w:t>
+      </w:r>
+      <w:r>
+        <w:rPr>
+          <w:b/>
+        </w:rPr>
+        <w:t>5</w:t>
+      </w:r>
+      <w:r>
+        <w:rPr/>
+        <w:t xml:space="preserve"> para comprobar el estado y el </w:t>
+      </w:r>
+      <w:r>
+        <w:rPr>
+          <w:b/>
+        </w:rPr>
+        <w:t>0</w:t>
+      </w:r>
+      <w:r>
+        <w:rPr/>
+        <w:t xml:space="preserve"> para salir. El </w:t>
+      </w:r>
+      <w:r>
+        <w:rPr>
+          <w:b/>
+        </w:rPr>
+        <w:t>1</w:t>
+      </w:r>
+      <w:r>
+        <w:rPr/>
+        <w:t xml:space="preserve"> es para Windows y aquí no toca. </w:t>
+      </w:r>
+      <w:r>
+        <w:rPr/>
+        <w:drawing>
+          <wp:inline distT="0" distB="0" distL="0" distR="0">
+            <wp:extent cx="16240125" cy="4038600"/>
+            <wp:effectExtent l="0" t="0" r="0" b="0"/>
+            <wp:docPr id="20" name="Imagen20" descr="La señal de éxito de MAS"/>
+            <wp:cNvGraphicFramePr>
+              <a:graphicFrameLocks xmlns:a="http://schemas.openxmlformats.org/drawingml/2006/main" noChangeAspect="1"/>
+            </wp:cNvGraphicFramePr>
+            <a:graphic xmlns:a="http://schemas.openxmlformats.org/drawingml/2006/main">
+              <a:graphicData uri="http://schemas.openxmlformats.org/drawingml/2006/picture">
+                <pic:pic xmlns:pic="http://schemas.openxmlformats.org/drawingml/2006/picture">
+                  <pic:nvPicPr>
+                    <pic:cNvPr id="20" name="Imagen20" descr="La señal de éxito de MAS"/>
+                    <pic:cNvPicPr>
+                      <a:picLocks noChangeAspect="1" noChangeArrowheads="1"/>
+                    </pic:cNvPicPr>
+                  </pic:nvPicPr>
+                  <pic:blipFill>
+                    <a:blip r:embed="rId21"/>
+                    <a:stretch>
+                      <a:fillRect/>
+                    </a:stretch>
+                  </pic:blipFill>
+                  <pic:spPr bwMode="auto">
+                    <a:xfrm>
+                      <a:off x="0" y="0"/>
+                      <a:ext cx="16240125" cy="4038600"/>
+                    </a:xfrm>
+                    <a:prstGeom prst="rect">
+                      <a:avLst/>
+                    </a:prstGeom>
+                    <a:noFill/>
+                  </pic:spPr>
+                </pic:pic>
+              </a:graphicData>
+            </a:graphic>
+          </wp:inline>
+        </w:drawing>
+      </w:r>
+      <w:r>
+        <w:rPr/>
+        <w:t xml:space="preserve"> </w:t>
+      </w:r>
+      <w:r>
+        <w:rPr>
+          <w:b/>
+        </w:rPr>
+        <w:t>Figura 20.</w:t>
+      </w:r>
+      <w:r>
+        <w:rPr/>
+        <w:t xml:space="preserve"> La señal de que salió bien: la frase en verde </w:t>
+      </w:r>
+      <w:r>
+        <w:rPr>
+          <w:i/>
+        </w:rPr>
+        <w:t>«Office is permanently activated»</w:t>
+      </w:r>
+      <w:r>
+        <w:rPr/>
+        <w:t xml:space="preserve">. Debajo, en gris, avisa de que Word y Excel ya están activados y que puedes ignorar el botón «Buy» de Office. </w:t>
+      </w:r>
+    </w:p>
+    <w:p>
+      <w:pPr>
+        <w:pStyle w:val="Ttulo4paso"/>
+        <w:bidi w:val="0"/>
+        <w:jc w:val="left"/>
+        <w:rPr/>
+      </w:pPr>
+      <w:r>
+        <w:rPr/>
+        <w:t>Paso K. Comprobar que quedó activado</w:t>
+      </w:r>
+    </w:p>
+    <w:p>
+      <w:pPr>
+        <w:pStyle w:val="BodyText"/>
+        <w:numPr>
+          <w:ilvl w:val="0"/>
+          <w:numId w:val="12"/>
+        </w:numPr>
+        <w:tabs>
+          <w:tab w:val="clear" w:pos="1134"/>
+          <w:tab w:val="left" w:pos="709" w:leader="none"/>
+        </w:tabs>
+        <w:bidi w:val="0"/>
+        <w:spacing w:before="120" w:after="0"/>
+        <w:ind w:hanging="283" w:left="709" w:right="0"/>
+        <w:jc w:val="left"/>
+        <w:rPr/>
+      </w:pPr>
+      <w:r>
+        <w:rPr/>
+        <w:t xml:space="preserve">En nuestro menú escribe </w:t>
+      </w:r>
+      <w:r>
+        <w:rPr>
+          <w:rFonts w:ascii="DejaVu Sans;sans-serif" w:hAnsi="DejaVu Sans;sans-serif"/>
+          <w:b/>
+          <w:color w:val="FFFFFF"/>
+          <w:sz w:val="18"/>
+          <w:shd w:fill="0D3B66" w:val="clear"/>
+        </w:rPr>
+        <w:t>6</w:t>
+      </w:r>
+      <w:r>
+        <w:rPr/>
+        <w:t xml:space="preserve"> → </w:t>
+      </w:r>
+      <w:r>
+        <w:rPr>
+          <w:rFonts w:ascii="DejaVu Sans;sans-serif" w:hAnsi="DejaVu Sans;sans-serif"/>
+          <w:sz w:val="17"/>
+          <w:bdr w:val="single" w:sz="2" w:space="1" w:color="999999"/>
+          <w:shd w:fill="FAFAFA" w:val="clear"/>
+        </w:rPr>
+        <w:t>Enter</w:t>
+      </w:r>
+      <w:r>
+        <w:rPr/>
+        <w:t xml:space="preserve">. </w:t>
+      </w:r>
+    </w:p>
+    <w:p>
+      <w:pPr>
+        <w:pStyle w:val="BodyText"/>
+        <w:numPr>
+          <w:ilvl w:val="0"/>
+          <w:numId w:val="12"/>
+        </w:numPr>
+        <w:tabs>
+          <w:tab w:val="clear" w:pos="1134"/>
+          <w:tab w:val="left" w:pos="829" w:leader="none"/>
+        </w:tabs>
+        <w:bidi w:val="0"/>
+        <w:ind w:hanging="283" w:left="829"/>
+        <w:jc w:val="left"/>
+        <w:rPr/>
+      </w:pPr>
+      <w:r>
+        <w:rPr/>
+        <w:t xml:space="preserve">Busca la línea </w:t>
+      </w:r>
+      <w:r>
+        <w:rPr>
+          <w:rStyle w:val="Textooriginal"/>
+        </w:rPr>
+        <w:t>LICENSE STATUS</w:t>
+      </w:r>
+      <w:r>
+        <w:rPr/>
+        <w:t xml:space="preserve">. Si pone </w:t>
+      </w:r>
+      <w:r>
+        <w:rPr>
+          <w:rStyle w:val="Textooriginal"/>
+        </w:rPr>
+        <w:t>---LICENSED---</w:t>
+      </w:r>
+      <w:r>
+        <w:rPr/>
+        <w:t xml:space="preserve">, está activado. </w:t>
+      </w:r>
+    </w:p>
+    <w:p>
+      <w:pPr>
+        <w:pStyle w:val="BodyText"/>
+        <w:bidi w:val="0"/>
+        <w:jc w:val="left"/>
+        <w:rPr/>
+      </w:pPr>
+      <w:r>
+        <w:rPr/>
+        <w:drawing>
+          <wp:inline distT="0" distB="0" distL="0" distR="0">
+            <wp:extent cx="16363950" cy="6629400"/>
+            <wp:effectExtent l="0" t="0" r="0" b="0"/>
+            <wp:docPr id="21" name="Imagen21" descr="Comprobar la licencia"/>
+            <wp:cNvGraphicFramePr>
+              <a:graphicFrameLocks xmlns:a="http://schemas.openxmlformats.org/drawingml/2006/main" noChangeAspect="1"/>
+            </wp:cNvGraphicFramePr>
+            <a:graphic xmlns:a="http://schemas.openxmlformats.org/drawingml/2006/main">
+              <a:graphicData uri="http://schemas.openxmlformats.org/drawingml/2006/picture">
+                <pic:pic xmlns:pic="http://schemas.openxmlformats.org/drawingml/2006/picture">
+                  <pic:nvPicPr>
+                    <pic:cNvPr id="21" name="Imagen21" descr="Comprobar la licencia"/>
+                    <pic:cNvPicPr>
+                      <a:picLocks noChangeAspect="1" noChangeArrowheads="1"/>
+                    </pic:cNvPicPr>
+                  </pic:nvPicPr>
+                  <pic:blipFill>
+                    <a:blip r:embed="rId22"/>
                     <a:stretch>
                       <a:fillRect/>
                     </a:stretch>
@@ -6801,7 +6887,7 @@
           <wp:inline distT="0" distB="0" distL="0" distR="0">
             <wp:extent cx="16240125" cy="5334000"/>
             <wp:effectExtent l="0" t="0" r="0" b="0"/>
-            <wp:docPr id="17" name="Imagen17" descr="Error de permisos"/>
+            <wp:docPr id="22" name="Imagen22" descr="Error de permisos"/>
             <wp:cNvGraphicFramePr>
               <a:graphicFrameLocks xmlns:a="http://schemas.openxmlformats.org/drawingml/2006/main" noChangeAspect="1"/>
             </wp:cNvGraphicFramePr>
@@ -6809,13 +6895,13 @@
               <a:graphicData uri="http://schemas.openxmlformats.org/drawingml/2006/picture">
                 <pic:pic xmlns:pic="http://schemas.openxmlformats.org/drawingml/2006/picture">
                   <pic:nvPicPr>
-                    <pic:cNvPr id="17" name="Imagen17" descr="Error de permisos"/>
+                    <pic:cNvPr id="22" name="Imagen22" descr="Error de permisos"/>
                     <pic:cNvPicPr>
                       <a:picLocks noChangeAspect="1" noChangeArrowheads="1"/>
                     </pic:cNvPicPr>
                   </pic:nvPicPr>
                   <pic:blipFill>
-                    <a:blip r:embed="rId18"/>
+                    <a:blip r:embed="rId23"/>
                     <a:stretch>
                       <a:fillRect/>
                     </a:stretch>
@@ -6934,7 +7020,7 @@
           <wp:inline distT="0" distB="0" distL="0" distR="0">
             <wp:extent cx="16363950" cy="7600950"/>
             <wp:effectExtent l="0" t="0" r="0" b="0"/>
-            <wp:docPr id="18" name="Imagen18" descr="Desinstalar Office"/>
+            <wp:docPr id="23" name="Imagen23" descr="Desinstalar Office"/>
             <wp:cNvGraphicFramePr>
               <a:graphicFrameLocks xmlns:a="http://schemas.openxmlformats.org/drawingml/2006/main" noChangeAspect="1"/>
             </wp:cNvGraphicFramePr>
@@ -6942,13 +7028,13 @@
               <a:graphicData uri="http://schemas.openxmlformats.org/drawingml/2006/picture">
                 <pic:pic xmlns:pic="http://schemas.openxmlformats.org/drawingml/2006/picture">
                   <pic:nvPicPr>
-                    <pic:cNvPr id="18" name="Imagen18" descr="Desinstalar Office"/>
+                    <pic:cNvPr id="23" name="Imagen23" descr="Desinstalar Office"/>
                     <pic:cNvPicPr>
                       <a:picLocks noChangeAspect="1" noChangeArrowheads="1"/>
                     </pic:cNvPicPr>
                   </pic:nvPicPr>
                   <pic:blipFill>
-                    <a:blip r:embed="rId19"/>
+                    <a:blip r:embed="rId24"/>
                     <a:stretch>
                       <a:fillRect/>
                     </a:stretch>
@@ -7349,10 +7435,23 @@
       <w:r>
         <w:rPr>
           <w:rFonts w:ascii="DejaVu Sans;sans-serif" w:hAnsi="DejaVu Sans;sans-serif"/>
+          <w:b/>
           <w:color w:val="666666"/>
           <w:sz w:val="16"/>
           <w:bdr w:val="single" w:sz="2" w:space="6" w:color="CCCCCC"/>
         </w:rPr>
+        <w:t>Sobre las imágenes.</w:t>
+      </w:r>
+      <w:r>
+        <w:rPr>
+          <w:rFonts w:ascii="DejaVu Sans;sans-serif" w:hAnsi="DejaVu Sans;sans-serif"/>
+          <w:color w:val="666666"/>
+          <w:sz w:val="16"/>
+          <w:bdr w:val="single" w:sz="2" w:space="6" w:color="CCCCCC"/>
+        </w:rPr>
+        <w:t xml:space="preserve"> Las pantallas del instalador, de PowerShell y de MAS reproducen el texto literal de cada programa. Las figuras 2 y 3 (menú Inicio y aviso de permisos) son recreaciones de las pantallas de Windows: pueden variar ligeramente según la versión que tengas.</w:t>
+        <w:br/>
+        <w:br/>
         <w:t>Manual de usuario paso a paso desde cero · Instalador de Office ISUPOL · Material educativo para practicar en un entorno de laboratorio.</w:t>
         <w:br/>
         <w:t>El instalador descarga Office únicamente de los servidores oficiales de Microsoft (officecdn.microsoft.com y c2rsetup.officeapps.live.com).</w:t>

</xml_diff>

<commit_message>
Portada sin campos de evaluacion
Se quitan Estudiante, Fecha de entrega, Calificacion, Instrumento de
evaluacion y la referencia a Tarea: el documento es un manual instructivo
de uso, no una tarea que se entregue ni se califique.
</commit_message>
<xml_diff>
--- a/MANUAL-Instalar-Office.docx
+++ b/MANUAL-Instalar-Office.docx
@@ -103,34 +103,12 @@
           <w:color w:val="444444"/>
           <w:sz w:val="19"/>
         </w:rPr>
-        <w:t>Unidad 1 · Sesión ____ — Instalación de software ofimático</w:t>
-      </w:r>
-    </w:p>
-    <w:p>
-      <w:pPr>
-        <w:pStyle w:val="BodyText"/>
-        <w:bidi w:val="0"/>
-        <w:spacing w:before="120" w:after="45"/>
-        <w:ind w:hanging="0" w:left="0" w:right="0"/>
-        <w:jc w:val="center"/>
-        <w:rPr>
-          <w:rFonts w:ascii="DejaVu Sans;sans-serif" w:hAnsi="DejaVu Sans;sans-serif"/>
-          <w:color w:val="444444"/>
-          <w:sz w:val="19"/>
-        </w:rPr>
-      </w:pPr>
-      <w:r>
-        <w:rPr>
-          <w:rFonts w:ascii="DejaVu Sans;sans-serif" w:hAnsi="DejaVu Sans;sans-serif"/>
-          <w:color w:val="444444"/>
-          <w:sz w:val="19"/>
-        </w:rPr>
-        <w:t>Tarea ____</w:t>
+        <w:t>Unidad 1 · Instalación de software ofimático</w:t>
       </w:r>
     </w:p>
     <w:tbl>
       <w:tblPr>
-        <w:tblW w:w="14737" w:type="dxa"/>
+        <w:tblW w:w="14380" w:type="dxa"/>
         <w:jc w:val="left"/>
         <w:tblInd w:w="28" w:type="dxa"/>
         <w:tblLayout w:type="fixed"/>
@@ -142,16 +120,16 @@
         </w:tblCellMar>
       </w:tblPr>
       <w:tblGrid>
-        <w:gridCol w:w="3158"/>
-        <w:gridCol w:w="4233"/>
-        <w:gridCol w:w="2848"/>
-        <w:gridCol w:w="4498"/>
+        <w:gridCol w:w="2352"/>
+        <w:gridCol w:w="3568"/>
+        <w:gridCol w:w="2609"/>
+        <w:gridCol w:w="5851"/>
       </w:tblGrid>
       <w:tr>
         <w:trPr/>
         <w:tc>
           <w:tcPr>
-            <w:tcW w:w="3158" w:type="dxa"/>
+            <w:tcW w:w="2352" w:type="dxa"/>
             <w:tcBorders/>
             <w:vAlign w:val="center"/>
           </w:tcPr>
@@ -171,7 +149,7 @@
         </w:tc>
         <w:tc>
           <w:tcPr>
-            <w:tcW w:w="4233" w:type="dxa"/>
+            <w:tcW w:w="3568" w:type="dxa"/>
             <w:tcBorders/>
             <w:vAlign w:val="center"/>
           </w:tcPr>
@@ -191,7 +169,7 @@
         </w:tc>
         <w:tc>
           <w:tcPr>
-            <w:tcW w:w="2848" w:type="dxa"/>
+            <w:tcW w:w="2609" w:type="dxa"/>
             <w:tcBorders/>
             <w:vAlign w:val="center"/>
           </w:tcPr>
@@ -211,7 +189,7 @@
         </w:tc>
         <w:tc>
           <w:tcPr>
-            <w:tcW w:w="4498" w:type="dxa"/>
+            <w:tcW w:w="5851" w:type="dxa"/>
             <w:tcBorders/>
             <w:vAlign w:val="center"/>
           </w:tcPr>
@@ -234,7 +212,7 @@
         <w:trPr/>
         <w:tc>
           <w:tcPr>
-            <w:tcW w:w="3158" w:type="dxa"/>
+            <w:tcW w:w="2352" w:type="dxa"/>
             <w:tcBorders/>
             <w:vAlign w:val="center"/>
           </w:tcPr>
@@ -254,7 +232,7 @@
         </w:tc>
         <w:tc>
           <w:tcPr>
-            <w:tcW w:w="4233" w:type="dxa"/>
+            <w:tcW w:w="3568" w:type="dxa"/>
             <w:tcBorders/>
             <w:vAlign w:val="center"/>
           </w:tcPr>
@@ -274,7 +252,7 @@
         </w:tc>
         <w:tc>
           <w:tcPr>
-            <w:tcW w:w="2848" w:type="dxa"/>
+            <w:tcW w:w="2609" w:type="dxa"/>
             <w:tcBorders/>
             <w:vAlign w:val="center"/>
           </w:tcPr>
@@ -288,13 +266,13 @@
             </w:pPr>
             <w:r>
               <w:rPr/>
-              <w:t>Fecha de entrega (EVA):</w:t>
+              <w:t>Curso / Paralelo:</w:t>
             </w:r>
           </w:p>
         </w:tc>
         <w:tc>
           <w:tcPr>
-            <w:tcW w:w="4498" w:type="dxa"/>
+            <w:tcW w:w="5851" w:type="dxa"/>
             <w:tcBorders/>
             <w:vAlign w:val="center"/>
           </w:tcPr>
@@ -308,7 +286,7 @@
             </w:pPr>
             <w:r>
               <w:rPr/>
-              <w:t>______ / ______ / 2026</w:t>
+              <w:t>Sección C</w:t>
             </w:r>
           </w:p>
         </w:tc>
@@ -317,7 +295,7 @@
         <w:trPr/>
         <w:tc>
           <w:tcPr>
-            <w:tcW w:w="3158" w:type="dxa"/>
+            <w:tcW w:w="2352" w:type="dxa"/>
             <w:tcBorders/>
             <w:vAlign w:val="center"/>
           </w:tcPr>
@@ -331,13 +309,14 @@
             </w:pPr>
             <w:r>
               <w:rPr/>
-              <w:t>Estudiante:</w:t>
+              <w:t>Tipo de documento:</w:t>
             </w:r>
           </w:p>
         </w:tc>
         <w:tc>
           <w:tcPr>
-            <w:tcW w:w="4233" w:type="dxa"/>
+            <w:tcW w:w="12028" w:type="dxa"/>
+            <w:gridSpan w:val="3"/>
             <w:tcBorders/>
             <w:vAlign w:val="center"/>
           </w:tcPr>
@@ -351,130 +330,7 @@
             </w:pPr>
             <w:r>
               <w:rPr/>
-              <w:t>_______________________</w:t>
-            </w:r>
-          </w:p>
-        </w:tc>
-        <w:tc>
-          <w:tcPr>
-            <w:tcW w:w="2848" w:type="dxa"/>
-            <w:tcBorders/>
-            <w:vAlign w:val="center"/>
-          </w:tcPr>
-          <w:p>
-            <w:pPr>
-              <w:pStyle w:val="Contenidodelatabla"/>
-              <w:bidi w:val="0"/>
-              <w:spacing w:before="120" w:after="120"/>
-              <w:jc w:val="left"/>
-              <w:rPr/>
-            </w:pPr>
-            <w:r>
-              <w:rPr/>
-              <w:t>Curso / Paralelo:</w:t>
-            </w:r>
-          </w:p>
-        </w:tc>
-        <w:tc>
-          <w:tcPr>
-            <w:tcW w:w="4498" w:type="dxa"/>
-            <w:tcBorders/>
-            <w:vAlign w:val="center"/>
-          </w:tcPr>
-          <w:p>
-            <w:pPr>
-              <w:pStyle w:val="Contenidodelatabla"/>
-              <w:bidi w:val="0"/>
-              <w:spacing w:before="120" w:after="120"/>
-              <w:jc w:val="left"/>
-              <w:rPr/>
-            </w:pPr>
-            <w:r>
-              <w:rPr/>
-              <w:t>Sección C</w:t>
-            </w:r>
-          </w:p>
-        </w:tc>
-      </w:tr>
-      <w:tr>
-        <w:trPr/>
-        <w:tc>
-          <w:tcPr>
-            <w:tcW w:w="3158" w:type="dxa"/>
-            <w:tcBorders/>
-            <w:vAlign w:val="center"/>
-          </w:tcPr>
-          <w:p>
-            <w:pPr>
-              <w:pStyle w:val="Contenidodelatabla"/>
-              <w:bidi w:val="0"/>
-              <w:spacing w:before="120" w:after="120"/>
-              <w:jc w:val="left"/>
-              <w:rPr/>
-            </w:pPr>
-            <w:r>
-              <w:rPr/>
-              <w:t>Instrumento de evaluación:</w:t>
-            </w:r>
-          </w:p>
-        </w:tc>
-        <w:tc>
-          <w:tcPr>
-            <w:tcW w:w="4233" w:type="dxa"/>
-            <w:tcBorders/>
-            <w:vAlign w:val="center"/>
-          </w:tcPr>
-          <w:p>
-            <w:pPr>
-              <w:pStyle w:val="Contenidodelatabla"/>
-              <w:bidi w:val="0"/>
-              <w:spacing w:before="120" w:after="120"/>
-              <w:jc w:val="left"/>
-              <w:rPr/>
-            </w:pPr>
-            <w:r>
-              <w:rPr/>
-              <w:t>Manual de usuario para principiantes</w:t>
-            </w:r>
-          </w:p>
-        </w:tc>
-        <w:tc>
-          <w:tcPr>
-            <w:tcW w:w="2848" w:type="dxa"/>
-            <w:tcBorders/>
-            <w:vAlign w:val="center"/>
-          </w:tcPr>
-          <w:p>
-            <w:pPr>
-              <w:pStyle w:val="Contenidodelatabla"/>
-              <w:bidi w:val="0"/>
-              <w:spacing w:before="120" w:after="120"/>
-              <w:jc w:val="left"/>
-              <w:rPr/>
-            </w:pPr>
-            <w:r>
-              <w:rPr/>
-              <w:t>Calificación:</w:t>
-            </w:r>
-          </w:p>
-        </w:tc>
-        <w:tc>
-          <w:tcPr>
-            <w:tcW w:w="4498" w:type="dxa"/>
-            <w:tcBorders/>
-            <w:vAlign w:val="center"/>
-          </w:tcPr>
-          <w:p>
-            <w:pPr>
-              <w:pStyle w:val="Contenidodelatabla"/>
-              <w:bidi w:val="0"/>
-              <w:spacing w:before="120" w:after="120"/>
-              <w:jc w:val="left"/>
-              <w:rPr/>
-            </w:pPr>
-            <w:r>
-              <w:rPr/>
-              <w:t>____ / 5 puntos</w:t>
+              <w:t>Manual instructivo de uso. Material de apoyo para seguir paso a paso; no es una tarea evaluada ni se entrega.</w:t>
             </w:r>
           </w:p>
         </w:tc>
@@ -513,7 +369,7 @@
       </w:r>
       <w:r>
         <w:rPr/>
-        <w:t xml:space="preserve"> que señalan exactamente dónde mirar y qué escribir. Siga los pasos en orden, sin saltarse ninguno: realice una acción y recién pase a la siguiente. Las pruebas se realizan en el laboratorio, nunca en el equipo real; al terminar se restaura el snapshot de la máquina virtual. Calcule entre 30 y 45 minutos.</w:t>
+        <w:t xml:space="preserve"> que señalan exactamente dónde mirar y qué escribir. No hay nada que entregar ni que rellenar: es solo para seguirlo mientras instalas. Ve paso por paso, sin prisa: realiza una acción y recién pasa a la siguiente. Las pruebas se realizan en el laboratorio, nunca en el equipo real; al terminar se restaura el snapshot de la máquina virtual. Calcule entre 30 y 45 minutos.</w:t>
       </w:r>
     </w:p>
     <w:p>

</xml_diff>

<commit_message>
Iconos en el glosario y flechas que ya no tachan el texto
- Glosario y navegadores pasan a tabla con iconos SVG (raton, ventana de
  Windows, PowerShell, escudo, Chrome y Edge a color), como el manual de
  referencia del Instituto.
- Cada paso va ahora en su caja gris con el numero en circulo azul.
- El simbolo de encendido se dibuja inline en el Paso A.
- Se corrigen las flechas que cruzaban la pantalla y tachaban el texto que
  debian senalar (figuras 1, 3, 4, 6 y 7).
</commit_message>
<xml_diff>
--- a/MANUAL-Instalar-Office.docx
+++ b/MANUAL-Instalar-Office.docx
@@ -467,362 +467,807 @@
         <w:t>2. Pequeño glosario (palabras que vamos a usar)</w:t>
       </w:r>
     </w:p>
-    <w:p>
-      <w:pPr>
-        <w:pStyle w:val="Ttulodelalista"/>
-        <w:bidi w:val="0"/>
-        <w:jc w:val="left"/>
-        <w:rPr/>
-      </w:pPr>
-      <w:r>
-        <w:rPr/>
-        <w:t>Clic</w:t>
-      </w:r>
-    </w:p>
-    <w:p>
-      <w:pPr>
-        <w:pStyle w:val="Contenidodelista"/>
-        <w:bidi w:val="0"/>
-        <w:jc w:val="left"/>
-        <w:rPr/>
-      </w:pPr>
-      <w:r>
-        <w:rPr/>
-        <w:t xml:space="preserve">Presionar una vez el botón izquierdo del ratón (el mouse). </w:t>
-      </w:r>
-    </w:p>
-    <w:p>
-      <w:pPr>
-        <w:pStyle w:val="Ttulodelalista"/>
-        <w:bidi w:val="0"/>
-        <w:jc w:val="left"/>
-        <w:rPr/>
-      </w:pPr>
-      <w:r>
-        <w:rPr/>
-        <w:t>Doble clic</w:t>
-      </w:r>
-    </w:p>
-    <w:p>
-      <w:pPr>
-        <w:pStyle w:val="Contenidodelista"/>
-        <w:bidi w:val="0"/>
-        <w:jc w:val="left"/>
-        <w:rPr/>
-      </w:pPr>
-      <w:r>
-        <w:rPr/>
-        <w:t xml:space="preserve">Presionar ese mismo botón dos veces seguidas y rápido. </w:t>
-      </w:r>
-    </w:p>
-    <w:p>
-      <w:pPr>
-        <w:pStyle w:val="Ttulodelalista"/>
-        <w:bidi w:val="0"/>
-        <w:jc w:val="left"/>
-        <w:rPr/>
-      </w:pPr>
-      <w:r>
-        <w:rPr/>
-        <w:t>Clic derecho</w:t>
-      </w:r>
-    </w:p>
-    <w:p>
-      <w:pPr>
-        <w:pStyle w:val="Contenidodelista"/>
-        <w:bidi w:val="0"/>
-        <w:jc w:val="left"/>
-        <w:rPr/>
-      </w:pPr>
-      <w:r>
-        <w:rPr/>
-        <w:t xml:space="preserve">Presionar el botón derecho del ratón. Casi siempre abre un menucito con opciones. </w:t>
-      </w:r>
-    </w:p>
-    <w:p>
-      <w:pPr>
-        <w:pStyle w:val="Ttulodelalista"/>
-        <w:bidi w:val="0"/>
-        <w:jc w:val="left"/>
-        <w:rPr/>
-      </w:pPr>
-      <w:r>
-        <w:rPr/>
-        <w:t>Navegador</w:t>
-      </w:r>
-    </w:p>
-    <w:p>
-      <w:pPr>
-        <w:pStyle w:val="Contenidodelista"/>
-        <w:bidi w:val="0"/>
-        <w:jc w:val="left"/>
-        <w:rPr/>
-      </w:pPr>
-      <w:r>
-        <w:rPr/>
-        <w:t xml:space="preserve">El programa para entrar a internet (Google Chrome o Microsoft Edge). </w:t>
-      </w:r>
-    </w:p>
-    <w:p>
-      <w:pPr>
-        <w:pStyle w:val="Ttulodelalista"/>
-        <w:bidi w:val="0"/>
-        <w:jc w:val="left"/>
-        <w:rPr/>
-      </w:pPr>
-      <w:r>
-        <w:rPr/>
-        <w:t>Barra de direcciones</w:t>
-      </w:r>
-    </w:p>
-    <w:p>
-      <w:pPr>
-        <w:pStyle w:val="Contenidodelista"/>
-        <w:bidi w:val="0"/>
-        <w:jc w:val="left"/>
-        <w:rPr/>
-      </w:pPr>
-      <w:r>
-        <w:rPr/>
-        <w:t xml:space="preserve">La barra larga de arriba del navegador, donde se escribe la dirección de una página. </w:t>
-      </w:r>
-    </w:p>
-    <w:p>
-      <w:pPr>
-        <w:pStyle w:val="Ttulodelalista"/>
-        <w:bidi w:val="0"/>
-        <w:jc w:val="left"/>
-        <w:rPr/>
-      </w:pPr>
-      <w:r>
-        <w:rPr/>
-        <w:t>Menú Inicio</w:t>
-      </w:r>
-    </w:p>
-    <w:p>
-      <w:pPr>
-        <w:pStyle w:val="Contenidodelista"/>
-        <w:bidi w:val="0"/>
-        <w:ind w:hanging="0" w:left="567" w:right="0"/>
-        <w:jc w:val="left"/>
-        <w:rPr/>
-      </w:pPr>
-      <w:r>
-        <w:rPr/>
-        <w:t xml:space="preserve">El menú que se abre al presionar la tecla </w:t>
-      </w:r>
-      <w:r>
-        <w:rPr>
-          <w:rFonts w:ascii="DejaVu Sans;sans-serif" w:hAnsi="DejaVu Sans;sans-serif"/>
-          <w:sz w:val="17"/>
-          <w:bdr w:val="single" w:sz="2" w:space="1" w:color="999999"/>
-          <w:shd w:fill="FAFAFA" w:val="clear"/>
-        </w:rPr>
-        <w:t>Windows</w:t>
-      </w:r>
-      <w:r>
-        <w:rPr/>
-        <w:t xml:space="preserve"> (abajo a la izquierda). </w:t>
-      </w:r>
-    </w:p>
-    <w:p>
-      <w:pPr>
-        <w:pStyle w:val="Ttulodelalista"/>
-        <w:bidi w:val="0"/>
-        <w:jc w:val="left"/>
-        <w:rPr/>
-      </w:pPr>
-      <w:r>
-        <w:rPr/>
-        <w:t>Barra de tareas</w:t>
-      </w:r>
-    </w:p>
-    <w:p>
-      <w:pPr>
-        <w:pStyle w:val="Contenidodelista"/>
-        <w:bidi w:val="0"/>
-        <w:jc w:val="left"/>
-        <w:rPr/>
-      </w:pPr>
-      <w:r>
-        <w:rPr/>
-        <w:t xml:space="preserve">La barra de iconos que está abajo del todo de la pantalla. </w:t>
-      </w:r>
-    </w:p>
-    <w:p>
-      <w:pPr>
-        <w:pStyle w:val="Ttulodelalista"/>
-        <w:bidi w:val="0"/>
-        <w:jc w:val="left"/>
-        <w:rPr/>
-      </w:pPr>
-      <w:r>
-        <w:rPr/>
-        <w:t>PowerShell</w:t>
-      </w:r>
-    </w:p>
-    <w:p>
-      <w:pPr>
-        <w:pStyle w:val="Contenidodelista"/>
-        <w:bidi w:val="0"/>
-        <w:jc w:val="left"/>
-        <w:rPr/>
-      </w:pPr>
-      <w:r>
-        <w:rPr/>
-        <w:t xml:space="preserve">Un programa de Windows con fondo azul oscuro donde se escriben órdenes con el teclado. No tiene botones. </w:t>
-      </w:r>
-    </w:p>
-    <w:p>
-      <w:pPr>
-        <w:pStyle w:val="Ttulodelalista"/>
-        <w:bidi w:val="0"/>
-        <w:jc w:val="left"/>
-        <w:rPr/>
-      </w:pPr>
-      <w:r>
-        <w:rPr/>
-        <w:t>Comando</w:t>
-      </w:r>
-    </w:p>
-    <w:p>
-      <w:pPr>
-        <w:pStyle w:val="Contenidodelista"/>
-        <w:bidi w:val="0"/>
-        <w:jc w:val="left"/>
-        <w:rPr/>
-      </w:pPr>
-      <w:r>
-        <w:rPr/>
-        <w:t xml:space="preserve">Una línea de texto que se le da a PowerShell para que haga algo. Nosotros la vamos a copiar y pegar, no a escribir a mano. </w:t>
-      </w:r>
-    </w:p>
-    <w:p>
-      <w:pPr>
-        <w:pStyle w:val="Ttulodelalista"/>
-        <w:bidi w:val="0"/>
-        <w:jc w:val="left"/>
-        <w:rPr/>
-      </w:pPr>
-      <w:r>
-        <w:rPr/>
-        <w:t>Administrador</w:t>
-      </w:r>
-    </w:p>
-    <w:p>
-      <w:pPr>
-        <w:pStyle w:val="Contenidodelista"/>
-        <w:bidi w:val="0"/>
-        <w:jc w:val="left"/>
-        <w:rPr/>
-      </w:pPr>
-      <w:r>
-        <w:rPr/>
-        <w:t xml:space="preserve">Permiso especial que Windows pide para instalar programas. Sin él, la instalación no puede ni empezar. </w:t>
-      </w:r>
-    </w:p>
-    <w:p>
-      <w:pPr>
-        <w:pStyle w:val="Ttulodelalista"/>
-        <w:bidi w:val="0"/>
-        <w:jc w:val="left"/>
-        <w:rPr/>
-      </w:pPr>
-      <w:r>
-        <w:rPr/>
-        <w:t>Copiar y pegar</w:t>
-      </w:r>
-    </w:p>
-    <w:p>
-      <w:pPr>
-        <w:pStyle w:val="Contenidodelista"/>
-        <w:bidi w:val="0"/>
-        <w:ind w:hanging="0" w:left="567" w:right="0"/>
-        <w:jc w:val="left"/>
-        <w:rPr/>
-      </w:pPr>
-      <w:r>
-        <w:rPr/>
-        <w:t>Copiar es guardar un texto en la memoria (</w:t>
-      </w:r>
-      <w:r>
-        <w:rPr>
-          <w:rFonts w:ascii="DejaVu Sans;sans-serif" w:hAnsi="DejaVu Sans;sans-serif"/>
-          <w:sz w:val="17"/>
-          <w:bdr w:val="single" w:sz="2" w:space="1" w:color="999999"/>
-          <w:shd w:fill="FAFAFA" w:val="clear"/>
-        </w:rPr>
-        <w:t>Ctrl</w:t>
-      </w:r>
-      <w:r>
-        <w:rPr/>
-        <w:t>+</w:t>
-      </w:r>
-      <w:r>
-        <w:rPr>
-          <w:rFonts w:ascii="DejaVu Sans;sans-serif" w:hAnsi="DejaVu Sans;sans-serif"/>
-          <w:sz w:val="17"/>
-          <w:bdr w:val="single" w:sz="2" w:space="1" w:color="999999"/>
-          <w:shd w:fill="FAFAFA" w:val="clear"/>
-        </w:rPr>
-        <w:t>C</w:t>
-      </w:r>
-      <w:r>
-        <w:rPr/>
-        <w:t>); pegar es soltarlo donde quieras (</w:t>
-      </w:r>
-      <w:r>
-        <w:rPr>
-          <w:rFonts w:ascii="DejaVu Sans;sans-serif" w:hAnsi="DejaVu Sans;sans-serif"/>
-          <w:sz w:val="17"/>
-          <w:bdr w:val="single" w:sz="2" w:space="1" w:color="999999"/>
-          <w:shd w:fill="FAFAFA" w:val="clear"/>
-        </w:rPr>
-        <w:t>Ctrl</w:t>
-      </w:r>
-      <w:r>
-        <w:rPr/>
-        <w:t>+</w:t>
-      </w:r>
-      <w:r>
-        <w:rPr>
-          <w:rFonts w:ascii="DejaVu Sans;sans-serif" w:hAnsi="DejaVu Sans;sans-serif"/>
-          <w:sz w:val="17"/>
-          <w:bdr w:val="single" w:sz="2" w:space="1" w:color="999999"/>
-          <w:shd w:fill="FAFAFA" w:val="clear"/>
-        </w:rPr>
-        <w:t>V</w:t>
-      </w:r>
-      <w:r>
-        <w:rPr/>
-        <w:t xml:space="preserve">). </w:t>
-      </w:r>
-    </w:p>
-    <w:p>
-      <w:pPr>
-        <w:pStyle w:val="Ttulodelalista"/>
-        <w:bidi w:val="0"/>
-        <w:jc w:val="left"/>
-        <w:rPr/>
-      </w:pPr>
-      <w:r>
-        <w:rPr/>
-        <w:t>Activar</w:t>
-      </w:r>
-    </w:p>
-    <w:p>
-      <w:pPr>
-        <w:pStyle w:val="Contenidodelista"/>
-        <w:bidi w:val="0"/>
-        <w:spacing w:before="0" w:after="283"/>
-        <w:jc w:val="left"/>
-        <w:rPr/>
-      </w:pPr>
-      <w:r>
-        <w:rPr/>
-        <w:t xml:space="preserve">Darle a Office una licencia para que funcione sin límites ni avisos. </w:t>
-      </w:r>
-    </w:p>
+    <w:tbl>
+      <w:tblPr>
+        <w:tblW w:w="14881" w:type="dxa"/>
+        <w:jc w:val="left"/>
+        <w:tblInd w:w="28" w:type="dxa"/>
+        <w:tblLayout w:type="fixed"/>
+        <w:tblCellMar>
+          <w:top w:w="28" w:type="dxa"/>
+          <w:left w:w="28" w:type="dxa"/>
+          <w:bottom w:w="28" w:type="dxa"/>
+          <w:right w:w="28" w:type="dxa"/>
+        </w:tblCellMar>
+      </w:tblPr>
+      <w:tblGrid>
+        <w:gridCol w:w="221"/>
+        <w:gridCol w:w="14660"/>
+      </w:tblGrid>
+      <w:tr>
+        <w:trPr/>
+        <w:tc>
+          <w:tcPr>
+            <w:tcW w:w="221" w:type="dxa"/>
+            <w:tcBorders/>
+            <w:vAlign w:val="center"/>
+          </w:tcPr>
+          <w:p>
+            <w:pPr>
+              <w:pStyle w:val="Contenidodelatabla"/>
+              <w:bidi w:val="0"/>
+              <w:spacing w:before="120" w:after="120"/>
+              <w:jc w:val="left"/>
+              <w:rPr>
+                <w:sz w:val="4"/>
+                <w:szCs w:val="4"/>
+              </w:rPr>
+            </w:pPr>
+            <w:r>
+              <w:rPr>
+                <w:sz w:val="4"/>
+                <w:szCs w:val="4"/>
+              </w:rPr>
+            </w:r>
+          </w:p>
+        </w:tc>
+        <w:tc>
+          <w:tcPr>
+            <w:tcW w:w="14660" w:type="dxa"/>
+            <w:tcBorders/>
+            <w:vAlign w:val="center"/>
+          </w:tcPr>
+          <w:p>
+            <w:pPr>
+              <w:pStyle w:val="Contenidodelatabla"/>
+              <w:bidi w:val="0"/>
+              <w:spacing w:before="120" w:after="120"/>
+              <w:jc w:val="left"/>
+              <w:rPr/>
+            </w:pPr>
+            <w:r>
+              <w:rPr>
+                <w:b/>
+              </w:rPr>
+              <w:t>Clic:</w:t>
+            </w:r>
+            <w:r>
+              <w:rPr/>
+              <w:t xml:space="preserve"> Presionar una vez el botón izquierdo del ratón (el mouse).</w:t>
+            </w:r>
+          </w:p>
+        </w:tc>
+      </w:tr>
+      <w:tr>
+        <w:trPr/>
+        <w:tc>
+          <w:tcPr>
+            <w:tcW w:w="221" w:type="dxa"/>
+            <w:tcBorders/>
+            <w:vAlign w:val="center"/>
+          </w:tcPr>
+          <w:p>
+            <w:pPr>
+              <w:pStyle w:val="Contenidodelatabla"/>
+              <w:bidi w:val="0"/>
+              <w:spacing w:before="120" w:after="120"/>
+              <w:jc w:val="left"/>
+              <w:rPr>
+                <w:sz w:val="4"/>
+                <w:szCs w:val="4"/>
+              </w:rPr>
+            </w:pPr>
+            <w:r>
+              <w:rPr>
+                <w:sz w:val="4"/>
+                <w:szCs w:val="4"/>
+              </w:rPr>
+            </w:r>
+          </w:p>
+        </w:tc>
+        <w:tc>
+          <w:tcPr>
+            <w:tcW w:w="14660" w:type="dxa"/>
+            <w:tcBorders/>
+            <w:vAlign w:val="center"/>
+          </w:tcPr>
+          <w:p>
+            <w:pPr>
+              <w:pStyle w:val="Contenidodelatabla"/>
+              <w:bidi w:val="0"/>
+              <w:spacing w:before="120" w:after="120"/>
+              <w:jc w:val="left"/>
+              <w:rPr/>
+            </w:pPr>
+            <w:r>
+              <w:rPr>
+                <w:b/>
+              </w:rPr>
+              <w:t>Doble clic:</w:t>
+            </w:r>
+            <w:r>
+              <w:rPr/>
+              <w:t xml:space="preserve"> Presionar ese mismo botón dos veces seguidas y rápido.</w:t>
+            </w:r>
+          </w:p>
+        </w:tc>
+      </w:tr>
+      <w:tr>
+        <w:trPr/>
+        <w:tc>
+          <w:tcPr>
+            <w:tcW w:w="221" w:type="dxa"/>
+            <w:tcBorders/>
+            <w:vAlign w:val="center"/>
+          </w:tcPr>
+          <w:p>
+            <w:pPr>
+              <w:pStyle w:val="Contenidodelatabla"/>
+              <w:bidi w:val="0"/>
+              <w:spacing w:before="120" w:after="120"/>
+              <w:jc w:val="left"/>
+              <w:rPr>
+                <w:sz w:val="4"/>
+                <w:szCs w:val="4"/>
+              </w:rPr>
+            </w:pPr>
+            <w:r>
+              <w:rPr>
+                <w:sz w:val="4"/>
+                <w:szCs w:val="4"/>
+              </w:rPr>
+            </w:r>
+          </w:p>
+        </w:tc>
+        <w:tc>
+          <w:tcPr>
+            <w:tcW w:w="14660" w:type="dxa"/>
+            <w:tcBorders/>
+            <w:vAlign w:val="center"/>
+          </w:tcPr>
+          <w:p>
+            <w:pPr>
+              <w:pStyle w:val="Contenidodelatabla"/>
+              <w:bidi w:val="0"/>
+              <w:spacing w:before="120" w:after="120"/>
+              <w:jc w:val="left"/>
+              <w:rPr/>
+            </w:pPr>
+            <w:r>
+              <w:rPr>
+                <w:b/>
+              </w:rPr>
+              <w:t>Clic derecho:</w:t>
+            </w:r>
+            <w:r>
+              <w:rPr/>
+              <w:t xml:space="preserve"> Presionar el botón derecho del ratón. Casi siempre abre un menucito con opciones.</w:t>
+            </w:r>
+          </w:p>
+        </w:tc>
+      </w:tr>
+      <w:tr>
+        <w:trPr/>
+        <w:tc>
+          <w:tcPr>
+            <w:tcW w:w="221" w:type="dxa"/>
+            <w:tcBorders/>
+            <w:vAlign w:val="center"/>
+          </w:tcPr>
+          <w:p>
+            <w:pPr>
+              <w:pStyle w:val="Contenidodelatabla"/>
+              <w:bidi w:val="0"/>
+              <w:spacing w:before="120" w:after="120"/>
+              <w:jc w:val="left"/>
+              <w:rPr>
+                <w:sz w:val="4"/>
+                <w:szCs w:val="4"/>
+              </w:rPr>
+            </w:pPr>
+            <w:r>
+              <w:rPr>
+                <w:sz w:val="4"/>
+                <w:szCs w:val="4"/>
+              </w:rPr>
+            </w:r>
+          </w:p>
+        </w:tc>
+        <w:tc>
+          <w:tcPr>
+            <w:tcW w:w="14660" w:type="dxa"/>
+            <w:tcBorders/>
+            <w:vAlign w:val="center"/>
+          </w:tcPr>
+          <w:p>
+            <w:pPr>
+              <w:pStyle w:val="Contenidodelatabla"/>
+              <w:bidi w:val="0"/>
+              <w:spacing w:before="120" w:after="120"/>
+              <w:jc w:val="left"/>
+              <w:rPr/>
+            </w:pPr>
+            <w:r>
+              <w:rPr>
+                <w:b/>
+              </w:rPr>
+              <w:t>Navegador:</w:t>
+            </w:r>
+            <w:r>
+              <w:rPr/>
+              <w:t xml:space="preserve"> El programa para entrar a internet (Google Chrome o Microsoft Edge).</w:t>
+            </w:r>
+          </w:p>
+        </w:tc>
+      </w:tr>
+      <w:tr>
+        <w:trPr/>
+        <w:tc>
+          <w:tcPr>
+            <w:tcW w:w="221" w:type="dxa"/>
+            <w:tcBorders/>
+            <w:vAlign w:val="center"/>
+          </w:tcPr>
+          <w:p>
+            <w:pPr>
+              <w:pStyle w:val="Contenidodelatabla"/>
+              <w:bidi w:val="0"/>
+              <w:spacing w:before="120" w:after="120"/>
+              <w:jc w:val="left"/>
+              <w:rPr>
+                <w:sz w:val="4"/>
+                <w:szCs w:val="4"/>
+              </w:rPr>
+            </w:pPr>
+            <w:r>
+              <w:rPr>
+                <w:sz w:val="4"/>
+                <w:szCs w:val="4"/>
+              </w:rPr>
+            </w:r>
+          </w:p>
+        </w:tc>
+        <w:tc>
+          <w:tcPr>
+            <w:tcW w:w="14660" w:type="dxa"/>
+            <w:tcBorders/>
+            <w:vAlign w:val="center"/>
+          </w:tcPr>
+          <w:p>
+            <w:pPr>
+              <w:pStyle w:val="Contenidodelatabla"/>
+              <w:bidi w:val="0"/>
+              <w:spacing w:before="120" w:after="120"/>
+              <w:jc w:val="left"/>
+              <w:rPr/>
+            </w:pPr>
+            <w:r>
+              <w:rPr>
+                <w:b/>
+              </w:rPr>
+              <w:t>Barra de direcciones:</w:t>
+            </w:r>
+            <w:r>
+              <w:rPr/>
+              <w:t xml:space="preserve"> La barra larga de arriba del navegador, donde se escribe la dirección de una página.</w:t>
+            </w:r>
+          </w:p>
+        </w:tc>
+      </w:tr>
+      <w:tr>
+        <w:trPr/>
+        <w:tc>
+          <w:tcPr>
+            <w:tcW w:w="221" w:type="dxa"/>
+            <w:tcBorders/>
+            <w:vAlign w:val="center"/>
+          </w:tcPr>
+          <w:p>
+            <w:pPr>
+              <w:pStyle w:val="Contenidodelatabla"/>
+              <w:bidi w:val="0"/>
+              <w:spacing w:before="120" w:after="120"/>
+              <w:jc w:val="left"/>
+              <w:rPr>
+                <w:sz w:val="4"/>
+                <w:szCs w:val="4"/>
+              </w:rPr>
+            </w:pPr>
+            <w:r>
+              <w:rPr>
+                <w:sz w:val="4"/>
+                <w:szCs w:val="4"/>
+              </w:rPr>
+            </w:r>
+          </w:p>
+        </w:tc>
+        <w:tc>
+          <w:tcPr>
+            <w:tcW w:w="14660" w:type="dxa"/>
+            <w:tcBorders/>
+            <w:vAlign w:val="center"/>
+          </w:tcPr>
+          <w:p>
+            <w:pPr>
+              <w:pStyle w:val="Contenidodelatabla"/>
+              <w:bidi w:val="0"/>
+              <w:spacing w:before="120" w:after="120"/>
+              <w:ind w:hanging="0" w:left="0" w:right="0"/>
+              <w:jc w:val="left"/>
+              <w:rPr/>
+            </w:pPr>
+            <w:r>
+              <w:rPr>
+                <w:b/>
+              </w:rPr>
+              <w:t>Menú Inicio:</w:t>
+            </w:r>
+            <w:r>
+              <w:rPr/>
+              <w:t xml:space="preserve"> El menú que se abre al presionar la tecla </w:t>
+            </w:r>
+            <w:r>
+              <w:rPr>
+                <w:rFonts w:ascii="DejaVu Sans;sans-serif" w:hAnsi="DejaVu Sans;sans-serif"/>
+                <w:sz w:val="17"/>
+                <w:bdr w:val="single" w:sz="2" w:space="1" w:color="999999"/>
+                <w:shd w:fill="FAFAFA" w:val="clear"/>
+              </w:rPr>
+              <w:t>Windows</w:t>
+            </w:r>
+            <w:r>
+              <w:rPr/>
+              <w:t xml:space="preserve"> (abajo a la izquierda).</w:t>
+            </w:r>
+          </w:p>
+        </w:tc>
+      </w:tr>
+      <w:tr>
+        <w:trPr/>
+        <w:tc>
+          <w:tcPr>
+            <w:tcW w:w="221" w:type="dxa"/>
+            <w:tcBorders/>
+            <w:vAlign w:val="center"/>
+          </w:tcPr>
+          <w:p>
+            <w:pPr>
+              <w:pStyle w:val="Contenidodelatabla"/>
+              <w:bidi w:val="0"/>
+              <w:spacing w:before="120" w:after="120"/>
+              <w:jc w:val="left"/>
+              <w:rPr>
+                <w:sz w:val="4"/>
+                <w:szCs w:val="4"/>
+              </w:rPr>
+            </w:pPr>
+            <w:r>
+              <w:rPr>
+                <w:sz w:val="4"/>
+                <w:szCs w:val="4"/>
+              </w:rPr>
+            </w:r>
+          </w:p>
+        </w:tc>
+        <w:tc>
+          <w:tcPr>
+            <w:tcW w:w="14660" w:type="dxa"/>
+            <w:tcBorders/>
+            <w:vAlign w:val="center"/>
+          </w:tcPr>
+          <w:p>
+            <w:pPr>
+              <w:pStyle w:val="Contenidodelatabla"/>
+              <w:bidi w:val="0"/>
+              <w:spacing w:before="120" w:after="120"/>
+              <w:jc w:val="left"/>
+              <w:rPr/>
+            </w:pPr>
+            <w:r>
+              <w:rPr>
+                <w:b/>
+              </w:rPr>
+              <w:t>Barra de tareas:</w:t>
+            </w:r>
+            <w:r>
+              <w:rPr/>
+              <w:t xml:space="preserve"> La barra de iconos que está abajo del todo de la pantalla.</w:t>
+            </w:r>
+          </w:p>
+        </w:tc>
+      </w:tr>
+      <w:tr>
+        <w:trPr/>
+        <w:tc>
+          <w:tcPr>
+            <w:tcW w:w="221" w:type="dxa"/>
+            <w:tcBorders/>
+            <w:vAlign w:val="center"/>
+          </w:tcPr>
+          <w:p>
+            <w:pPr>
+              <w:pStyle w:val="Contenidodelatabla"/>
+              <w:bidi w:val="0"/>
+              <w:spacing w:before="120" w:after="120"/>
+              <w:jc w:val="left"/>
+              <w:rPr>
+                <w:sz w:val="4"/>
+                <w:szCs w:val="4"/>
+              </w:rPr>
+            </w:pPr>
+            <w:r>
+              <w:rPr>
+                <w:sz w:val="4"/>
+                <w:szCs w:val="4"/>
+              </w:rPr>
+            </w:r>
+          </w:p>
+        </w:tc>
+        <w:tc>
+          <w:tcPr>
+            <w:tcW w:w="14660" w:type="dxa"/>
+            <w:tcBorders/>
+            <w:vAlign w:val="center"/>
+          </w:tcPr>
+          <w:p>
+            <w:pPr>
+              <w:pStyle w:val="Contenidodelatabla"/>
+              <w:bidi w:val="0"/>
+              <w:spacing w:before="120" w:after="120"/>
+              <w:jc w:val="left"/>
+              <w:rPr/>
+            </w:pPr>
+            <w:r>
+              <w:rPr>
+                <w:b/>
+              </w:rPr>
+              <w:t>PowerShell:</w:t>
+            </w:r>
+            <w:r>
+              <w:rPr/>
+              <w:t xml:space="preserve"> Un programa de Windows con fondo azul oscuro donde se escriben órdenes con el teclado. No tiene botones.</w:t>
+            </w:r>
+          </w:p>
+        </w:tc>
+      </w:tr>
+      <w:tr>
+        <w:trPr/>
+        <w:tc>
+          <w:tcPr>
+            <w:tcW w:w="221" w:type="dxa"/>
+            <w:tcBorders/>
+            <w:vAlign w:val="center"/>
+          </w:tcPr>
+          <w:p>
+            <w:pPr>
+              <w:pStyle w:val="Contenidodelatabla"/>
+              <w:bidi w:val="0"/>
+              <w:spacing w:before="120" w:after="120"/>
+              <w:jc w:val="left"/>
+              <w:rPr>
+                <w:sz w:val="4"/>
+                <w:szCs w:val="4"/>
+              </w:rPr>
+            </w:pPr>
+            <w:r>
+              <w:rPr>
+                <w:sz w:val="4"/>
+                <w:szCs w:val="4"/>
+              </w:rPr>
+            </w:r>
+          </w:p>
+        </w:tc>
+        <w:tc>
+          <w:tcPr>
+            <w:tcW w:w="14660" w:type="dxa"/>
+            <w:tcBorders/>
+            <w:vAlign w:val="center"/>
+          </w:tcPr>
+          <w:p>
+            <w:pPr>
+              <w:pStyle w:val="Contenidodelatabla"/>
+              <w:bidi w:val="0"/>
+              <w:spacing w:before="120" w:after="120"/>
+              <w:jc w:val="left"/>
+              <w:rPr/>
+            </w:pPr>
+            <w:r>
+              <w:rPr>
+                <w:b/>
+              </w:rPr>
+              <w:t>Comando:</w:t>
+            </w:r>
+            <w:r>
+              <w:rPr/>
+              <w:t xml:space="preserve"> Una línea de texto que se le da a PowerShell para que haga algo. Nosotros la vamos a copiar y pegar, no a escribir a mano.</w:t>
+            </w:r>
+          </w:p>
+        </w:tc>
+      </w:tr>
+      <w:tr>
+        <w:trPr/>
+        <w:tc>
+          <w:tcPr>
+            <w:tcW w:w="221" w:type="dxa"/>
+            <w:tcBorders/>
+            <w:vAlign w:val="center"/>
+          </w:tcPr>
+          <w:p>
+            <w:pPr>
+              <w:pStyle w:val="Contenidodelatabla"/>
+              <w:bidi w:val="0"/>
+              <w:spacing w:before="120" w:after="120"/>
+              <w:jc w:val="left"/>
+              <w:rPr>
+                <w:sz w:val="4"/>
+                <w:szCs w:val="4"/>
+              </w:rPr>
+            </w:pPr>
+            <w:r>
+              <w:rPr>
+                <w:sz w:val="4"/>
+                <w:szCs w:val="4"/>
+              </w:rPr>
+            </w:r>
+          </w:p>
+        </w:tc>
+        <w:tc>
+          <w:tcPr>
+            <w:tcW w:w="14660" w:type="dxa"/>
+            <w:tcBorders/>
+            <w:vAlign w:val="center"/>
+          </w:tcPr>
+          <w:p>
+            <w:pPr>
+              <w:pStyle w:val="Contenidodelatabla"/>
+              <w:bidi w:val="0"/>
+              <w:spacing w:before="120" w:after="120"/>
+              <w:jc w:val="left"/>
+              <w:rPr/>
+            </w:pPr>
+            <w:r>
+              <w:rPr>
+                <w:b/>
+              </w:rPr>
+              <w:t>Administrador:</w:t>
+            </w:r>
+            <w:r>
+              <w:rPr/>
+              <w:t xml:space="preserve"> Permiso especial que Windows pide para instalar programas. Sin él, la instalación no puede ni empezar.</w:t>
+            </w:r>
+          </w:p>
+        </w:tc>
+      </w:tr>
+      <w:tr>
+        <w:trPr/>
+        <w:tc>
+          <w:tcPr>
+            <w:tcW w:w="221" w:type="dxa"/>
+            <w:tcBorders/>
+            <w:vAlign w:val="center"/>
+          </w:tcPr>
+          <w:p>
+            <w:pPr>
+              <w:pStyle w:val="Contenidodelatabla"/>
+              <w:bidi w:val="0"/>
+              <w:spacing w:before="120" w:after="120"/>
+              <w:jc w:val="left"/>
+              <w:rPr>
+                <w:sz w:val="4"/>
+                <w:szCs w:val="4"/>
+              </w:rPr>
+            </w:pPr>
+            <w:r>
+              <w:rPr>
+                <w:sz w:val="4"/>
+                <w:szCs w:val="4"/>
+              </w:rPr>
+            </w:r>
+          </w:p>
+        </w:tc>
+        <w:tc>
+          <w:tcPr>
+            <w:tcW w:w="14660" w:type="dxa"/>
+            <w:tcBorders/>
+            <w:vAlign w:val="center"/>
+          </w:tcPr>
+          <w:p>
+            <w:pPr>
+              <w:pStyle w:val="Contenidodelatabla"/>
+              <w:bidi w:val="0"/>
+              <w:spacing w:before="120" w:after="120"/>
+              <w:ind w:hanging="0" w:left="0" w:right="0"/>
+              <w:jc w:val="left"/>
+              <w:rPr/>
+            </w:pPr>
+            <w:r>
+              <w:rPr>
+                <w:b/>
+              </w:rPr>
+              <w:t>Copiar y pegar:</w:t>
+            </w:r>
+            <w:r>
+              <w:rPr/>
+              <w:t xml:space="preserve"> Copiar es guardar un texto en la memoria (</w:t>
+            </w:r>
+            <w:r>
+              <w:rPr>
+                <w:rFonts w:ascii="DejaVu Sans;sans-serif" w:hAnsi="DejaVu Sans;sans-serif"/>
+                <w:sz w:val="17"/>
+                <w:bdr w:val="single" w:sz="2" w:space="1" w:color="999999"/>
+                <w:shd w:fill="FAFAFA" w:val="clear"/>
+              </w:rPr>
+              <w:t>Ctrl</w:t>
+            </w:r>
+            <w:r>
+              <w:rPr/>
+              <w:t>+</w:t>
+            </w:r>
+            <w:r>
+              <w:rPr>
+                <w:rFonts w:ascii="DejaVu Sans;sans-serif" w:hAnsi="DejaVu Sans;sans-serif"/>
+                <w:sz w:val="17"/>
+                <w:bdr w:val="single" w:sz="2" w:space="1" w:color="999999"/>
+                <w:shd w:fill="FAFAFA" w:val="clear"/>
+              </w:rPr>
+              <w:t>C</w:t>
+            </w:r>
+            <w:r>
+              <w:rPr/>
+              <w:t>); pegar es soltarlo donde quieras (</w:t>
+            </w:r>
+            <w:r>
+              <w:rPr>
+                <w:rFonts w:ascii="DejaVu Sans;sans-serif" w:hAnsi="DejaVu Sans;sans-serif"/>
+                <w:sz w:val="17"/>
+                <w:bdr w:val="single" w:sz="2" w:space="1" w:color="999999"/>
+                <w:shd w:fill="FAFAFA" w:val="clear"/>
+              </w:rPr>
+              <w:t>Ctrl</w:t>
+            </w:r>
+            <w:r>
+              <w:rPr/>
+              <w:t>+</w:t>
+            </w:r>
+            <w:r>
+              <w:rPr>
+                <w:rFonts w:ascii="DejaVu Sans;sans-serif" w:hAnsi="DejaVu Sans;sans-serif"/>
+                <w:sz w:val="17"/>
+                <w:bdr w:val="single" w:sz="2" w:space="1" w:color="999999"/>
+                <w:shd w:fill="FAFAFA" w:val="clear"/>
+              </w:rPr>
+              <w:t>V</w:t>
+            </w:r>
+            <w:r>
+              <w:rPr/>
+              <w:t>).</w:t>
+            </w:r>
+          </w:p>
+        </w:tc>
+      </w:tr>
+      <w:tr>
+        <w:trPr/>
+        <w:tc>
+          <w:tcPr>
+            <w:tcW w:w="221" w:type="dxa"/>
+            <w:tcBorders/>
+            <w:vAlign w:val="center"/>
+          </w:tcPr>
+          <w:p>
+            <w:pPr>
+              <w:pStyle w:val="Contenidodelatabla"/>
+              <w:bidi w:val="0"/>
+              <w:spacing w:before="120" w:after="120"/>
+              <w:jc w:val="left"/>
+              <w:rPr>
+                <w:sz w:val="4"/>
+                <w:szCs w:val="4"/>
+              </w:rPr>
+            </w:pPr>
+            <w:r>
+              <w:rPr>
+                <w:sz w:val="4"/>
+                <w:szCs w:val="4"/>
+              </w:rPr>
+            </w:r>
+          </w:p>
+        </w:tc>
+        <w:tc>
+          <w:tcPr>
+            <w:tcW w:w="14660" w:type="dxa"/>
+            <w:tcBorders/>
+            <w:vAlign w:val="center"/>
+          </w:tcPr>
+          <w:p>
+            <w:pPr>
+              <w:pStyle w:val="Contenidodelatabla"/>
+              <w:bidi w:val="0"/>
+              <w:spacing w:before="120" w:after="120"/>
+              <w:ind w:hanging="0" w:left="0" w:right="0"/>
+              <w:jc w:val="left"/>
+              <w:rPr/>
+            </w:pPr>
+            <w:r>
+              <w:rPr>
+                <w:b/>
+              </w:rPr>
+              <w:t>Ventana negra (consola):</w:t>
+            </w:r>
+            <w:r>
+              <w:rPr/>
+              <w:t xml:space="preserve"> Una ventana sin botones donde todo se hace escribiendo números y pulsando </w:t>
+            </w:r>
+            <w:r>
+              <w:rPr>
+                <w:rFonts w:ascii="DejaVu Sans;sans-serif" w:hAnsi="DejaVu Sans;sans-serif"/>
+                <w:sz w:val="17"/>
+                <w:bdr w:val="single" w:sz="2" w:space="1" w:color="999999"/>
+                <w:shd w:fill="FAFAFA" w:val="clear"/>
+              </w:rPr>
+              <w:t>Enter</w:t>
+            </w:r>
+            <w:r>
+              <w:rPr/>
+              <w:t>. Es la que vamos a usar.</w:t>
+            </w:r>
+          </w:p>
+        </w:tc>
+      </w:tr>
+      <w:tr>
+        <w:trPr/>
+        <w:tc>
+          <w:tcPr>
+            <w:tcW w:w="221" w:type="dxa"/>
+            <w:tcBorders/>
+            <w:vAlign w:val="center"/>
+          </w:tcPr>
+          <w:p>
+            <w:pPr>
+              <w:pStyle w:val="Contenidodelatabla"/>
+              <w:bidi w:val="0"/>
+              <w:spacing w:before="120" w:after="120"/>
+              <w:jc w:val="left"/>
+              <w:rPr>
+                <w:sz w:val="4"/>
+                <w:szCs w:val="4"/>
+              </w:rPr>
+            </w:pPr>
+            <w:r>
+              <w:rPr>
+                <w:sz w:val="4"/>
+                <w:szCs w:val="4"/>
+              </w:rPr>
+            </w:r>
+          </w:p>
+        </w:tc>
+        <w:tc>
+          <w:tcPr>
+            <w:tcW w:w="14660" w:type="dxa"/>
+            <w:tcBorders/>
+            <w:vAlign w:val="center"/>
+          </w:tcPr>
+          <w:p>
+            <w:pPr>
+              <w:pStyle w:val="Contenidodelatabla"/>
+              <w:bidi w:val="0"/>
+              <w:spacing w:before="120" w:after="120"/>
+              <w:jc w:val="left"/>
+              <w:rPr/>
+            </w:pPr>
+            <w:r>
+              <w:rPr>
+                <w:b/>
+              </w:rPr>
+              <w:t>Activar:</w:t>
+            </w:r>
+            <w:r>
+              <w:rPr/>
+              <w:t xml:space="preserve"> Darle a Office una licencia para que funcione sin límites ni avisos.</w:t>
+            </w:r>
+          </w:p>
+        </w:tc>
+      </w:tr>
+    </w:tbl>
     <w:p>
       <w:pPr>
         <w:pStyle w:val="Heading3"/>
@@ -996,7 +1441,7 @@
       </w:r>
       <w:r>
         <w:rPr/>
-        <w:t xml:space="preserve"> y suéltalo. En una computadora de escritorio está en la torre (la caja grande). En una laptop, arriba del teclado. </w:t>
+        <w:t xml:space="preserve"> y suéltalo. En una computadora de escritorio está en la torre (la caja grande). En una laptop, arriba del teclado. Tiene dibujado este símbolo: </w:t>
       </w:r>
     </w:p>
     <w:p>
@@ -1123,6 +1568,132 @@
         <w:t>El navegador es el programa para entrar a internet. Busca uno de estos dos iconos:</w:t>
       </w:r>
     </w:p>
+    <w:tbl>
+      <w:tblPr>
+        <w:tblW w:w="10560" w:type="dxa"/>
+        <w:jc w:val="left"/>
+        <w:tblInd w:w="28" w:type="dxa"/>
+        <w:tblLayout w:type="fixed"/>
+        <w:tblCellMar>
+          <w:top w:w="28" w:type="dxa"/>
+          <w:left w:w="28" w:type="dxa"/>
+          <w:bottom w:w="28" w:type="dxa"/>
+          <w:right w:w="28" w:type="dxa"/>
+        </w:tblCellMar>
+      </w:tblPr>
+      <w:tblGrid>
+        <w:gridCol w:w="221"/>
+        <w:gridCol w:w="10339"/>
+      </w:tblGrid>
+      <w:tr>
+        <w:trPr/>
+        <w:tc>
+          <w:tcPr>
+            <w:tcW w:w="221" w:type="dxa"/>
+            <w:tcBorders/>
+            <w:vAlign w:val="center"/>
+          </w:tcPr>
+          <w:p>
+            <w:pPr>
+              <w:pStyle w:val="Contenidodelatabla"/>
+              <w:bidi w:val="0"/>
+              <w:spacing w:before="120" w:after="120"/>
+              <w:jc w:val="left"/>
+              <w:rPr>
+                <w:sz w:val="4"/>
+                <w:szCs w:val="4"/>
+              </w:rPr>
+            </w:pPr>
+            <w:r>
+              <w:rPr>
+                <w:sz w:val="4"/>
+                <w:szCs w:val="4"/>
+              </w:rPr>
+            </w:r>
+          </w:p>
+        </w:tc>
+        <w:tc>
+          <w:tcPr>
+            <w:tcW w:w="10339" w:type="dxa"/>
+            <w:tcBorders/>
+            <w:vAlign w:val="center"/>
+          </w:tcPr>
+          <w:p>
+            <w:pPr>
+              <w:pStyle w:val="Contenidodelatabla"/>
+              <w:bidi w:val="0"/>
+              <w:spacing w:before="120" w:after="120"/>
+              <w:jc w:val="left"/>
+              <w:rPr/>
+            </w:pPr>
+            <w:r>
+              <w:rPr>
+                <w:b/>
+              </w:rPr>
+              <w:t>Google Chrome:</w:t>
+            </w:r>
+            <w:r>
+              <w:rPr/>
+              <w:t xml:space="preserve"> un círculo de colores (rojo, amarillo y verde) con un punto azul en el centro.</w:t>
+            </w:r>
+          </w:p>
+        </w:tc>
+      </w:tr>
+      <w:tr>
+        <w:trPr/>
+        <w:tc>
+          <w:tcPr>
+            <w:tcW w:w="221" w:type="dxa"/>
+            <w:tcBorders/>
+            <w:vAlign w:val="center"/>
+          </w:tcPr>
+          <w:p>
+            <w:pPr>
+              <w:pStyle w:val="Contenidodelatabla"/>
+              <w:bidi w:val="0"/>
+              <w:spacing w:before="120" w:after="120"/>
+              <w:jc w:val="left"/>
+              <w:rPr>
+                <w:sz w:val="4"/>
+                <w:szCs w:val="4"/>
+              </w:rPr>
+            </w:pPr>
+            <w:r>
+              <w:rPr>
+                <w:sz w:val="4"/>
+                <w:szCs w:val="4"/>
+              </w:rPr>
+            </w:r>
+          </w:p>
+        </w:tc>
+        <w:tc>
+          <w:tcPr>
+            <w:tcW w:w="10339" w:type="dxa"/>
+            <w:tcBorders/>
+            <w:vAlign w:val="center"/>
+          </w:tcPr>
+          <w:p>
+            <w:pPr>
+              <w:pStyle w:val="Contenidodelatabla"/>
+              <w:bidi w:val="0"/>
+              <w:spacing w:before="120" w:after="120"/>
+              <w:jc w:val="left"/>
+              <w:rPr/>
+            </w:pPr>
+            <w:r>
+              <w:rPr>
+                <w:b/>
+              </w:rPr>
+              <w:t>Microsoft Edge:</w:t>
+            </w:r>
+            <w:r>
+              <w:rPr/>
+              <w:t xml:space="preserve"> una ola o remolino en tonos azul y verde.</w:t>
+            </w:r>
+          </w:p>
+        </w:tc>
+      </w:tr>
+    </w:tbl>
     <w:p>
       <w:pPr>
         <w:pStyle w:val="BodyText"/>
@@ -1132,28 +1703,17 @@
         </w:numPr>
         <w:tabs>
           <w:tab w:val="clear" w:pos="1134"/>
-          <w:tab w:val="left" w:pos="709" w:leader="none"/>
+          <w:tab w:val="left" w:pos="829" w:leader="none"/>
         </w:tabs>
         <w:bidi w:val="0"/>
         <w:spacing w:before="120" w:after="0"/>
-        <w:ind w:hanging="283" w:left="709" w:right="0"/>
-        <w:jc w:val="left"/>
-        <w:rPr>
-          <w:sz w:val="19"/>
-        </w:rPr>
-      </w:pPr>
-      <w:r>
-        <w:rPr>
-          <w:b/>
-          <w:sz w:val="19"/>
-        </w:rPr>
-        <w:t>Google Chrome:</w:t>
-      </w:r>
-      <w:r>
-        <w:rPr>
-          <w:sz w:val="19"/>
-        </w:rPr>
-        <w:t xml:space="preserve"> un círculo de colores (rojo, amarillo y verde) con un punto azul en el centro. </w:t>
+        <w:ind w:hanging="283" w:left="829"/>
+        <w:jc w:val="left"/>
+        <w:rPr/>
+      </w:pPr>
+      <w:r>
+        <w:rPr/>
+        <w:t xml:space="preserve">Mira en la barra de abajo (barra de tareas) o en el escritorio. ¿Ves uno de esos iconos? Haz clic (o doble clic si está en el escritorio). </w:t>
       </w:r>
     </w:p>
     <w:p>
@@ -1165,27 +1725,118 @@
         </w:numPr>
         <w:tabs>
           <w:tab w:val="clear" w:pos="1134"/>
+          <w:tab w:val="left" w:pos="709" w:leader="none"/>
+        </w:tabs>
+        <w:bidi w:val="0"/>
+        <w:spacing w:before="120" w:after="0"/>
+        <w:ind w:hanging="283" w:left="709" w:right="0"/>
+        <w:jc w:val="left"/>
+        <w:rPr/>
+      </w:pPr>
+      <w:r>
+        <w:rPr/>
+        <w:t xml:space="preserve">¿No lo encuentras? Presiona la tecla </w:t>
+      </w:r>
+      <w:r>
+        <w:rPr>
+          <w:rFonts w:ascii="DejaVu Sans;sans-serif" w:hAnsi="DejaVu Sans;sans-serif"/>
+          <w:sz w:val="17"/>
+          <w:bdr w:val="single" w:sz="2" w:space="1" w:color="999999"/>
+          <w:shd w:fill="FAFAFA" w:val="clear"/>
+        </w:rPr>
+        <w:t>Windows</w:t>
+      </w:r>
+      <w:r>
+        <w:rPr/>
+        <w:t xml:space="preserve"> del teclado (la que tiene la ventanita ). Se abre el menú Inicio. </w:t>
+      </w:r>
+    </w:p>
+    <w:p>
+      <w:pPr>
+        <w:pStyle w:val="BodyText"/>
+        <w:numPr>
+          <w:ilvl w:val="0"/>
+          <w:numId w:val="3"/>
+        </w:numPr>
+        <w:tabs>
+          <w:tab w:val="clear" w:pos="1134"/>
+          <w:tab w:val="left" w:pos="709" w:leader="none"/>
+        </w:tabs>
+        <w:bidi w:val="0"/>
+        <w:spacing w:before="120" w:after="0"/>
+        <w:ind w:hanging="283" w:left="709" w:right="0"/>
+        <w:jc w:val="left"/>
+        <w:rPr/>
+      </w:pPr>
+      <w:r>
+        <w:rPr/>
+        <w:t xml:space="preserve">Escribe </w:t>
+      </w:r>
+      <w:r>
+        <w:rPr>
+          <w:rStyle w:val="Textooriginal"/>
+        </w:rPr>
+        <w:t>chrome</w:t>
+      </w:r>
+      <w:r>
+        <w:rPr/>
+        <w:t xml:space="preserve"> (o </w:t>
+      </w:r>
+      <w:r>
+        <w:rPr>
+          <w:rStyle w:val="Textooriginal"/>
+        </w:rPr>
+        <w:t>edge</w:t>
+      </w:r>
+      <w:r>
+        <w:rPr/>
+        <w:t xml:space="preserve">) → arriba aparece el programa → pulsa </w:t>
+      </w:r>
+      <w:r>
+        <w:rPr>
+          <w:rFonts w:ascii="DejaVu Sans;sans-serif" w:hAnsi="DejaVu Sans;sans-serif"/>
+          <w:sz w:val="17"/>
+          <w:bdr w:val="single" w:sz="2" w:space="1" w:color="999999"/>
+          <w:shd w:fill="FAFAFA" w:val="clear"/>
+        </w:rPr>
+        <w:t>Enter</w:t>
+      </w:r>
+      <w:r>
+        <w:rPr/>
+        <w:t xml:space="preserve">. </w:t>
+      </w:r>
+    </w:p>
+    <w:p>
+      <w:pPr>
+        <w:pStyle w:val="BodyText"/>
+        <w:numPr>
+          <w:ilvl w:val="0"/>
+          <w:numId w:val="3"/>
+        </w:numPr>
+        <w:tabs>
+          <w:tab w:val="clear" w:pos="1134"/>
           <w:tab w:val="left" w:pos="829" w:leader="none"/>
         </w:tabs>
         <w:bidi w:val="0"/>
         <w:ind w:hanging="283" w:left="829"/>
         <w:jc w:val="left"/>
-        <w:rPr>
-          <w:sz w:val="19"/>
-        </w:rPr>
-      </w:pPr>
-      <w:r>
-        <w:rPr>
-          <w:b/>
-          <w:sz w:val="19"/>
-        </w:rPr>
-        <w:t>Microsoft Edge:</w:t>
-      </w:r>
-      <w:r>
-        <w:rPr>
-          <w:sz w:val="19"/>
-        </w:rPr>
-        <w:t xml:space="preserve"> una ola o remolino en tonos azul y verde. </w:t>
+        <w:rPr/>
+      </w:pPr>
+      <w:r>
+        <w:rPr/>
+        <w:t xml:space="preserve">El navegador se abre en una ventana grande. Listo para el siguiente paso. </w:t>
+      </w:r>
+    </w:p>
+    <w:p>
+      <w:pPr>
+        <w:pStyle w:val="Ttulo4paso"/>
+        <w:bidi w:val="0"/>
+        <w:jc w:val="left"/>
+        <w:rPr/>
+      </w:pPr>
+      <w:r>
+        <w:rPr/>
+        <w:t>Paso C. Entrar a la página del instalador</w:t>
       </w:r>
     </w:p>
     <w:p>
@@ -1207,7 +1858,17 @@
       </w:pPr>
       <w:r>
         <w:rPr/>
-        <w:t xml:space="preserve">Mira en la barra de abajo (barra de tareas) o en el escritorio. ¿Ves uno de esos iconos? Haz clic (o doble clic si está en el escritorio). </w:t>
+        <w:t xml:space="preserve">Busca la barra larga de arriba (barra de direcciones) y haz </w:t>
+      </w:r>
+      <w:r>
+        <w:rPr>
+          <w:b/>
+        </w:rPr>
+        <w:t>un clic dentro</w:t>
+      </w:r>
+      <w:r>
+        <w:rPr/>
+        <w:t xml:space="preserve">. </w:t>
       </w:r>
     </w:p>
     <w:p>
@@ -1219,30 +1880,27 @@
         </w:numPr>
         <w:tabs>
           <w:tab w:val="clear" w:pos="1134"/>
-          <w:tab w:val="left" w:pos="709" w:leader="none"/>
+          <w:tab w:val="left" w:pos="829" w:leader="none"/>
         </w:tabs>
         <w:bidi w:val="0"/>
         <w:spacing w:before="120" w:after="0"/>
-        <w:ind w:hanging="283" w:left="709" w:right="0"/>
-        <w:jc w:val="left"/>
-        <w:rPr/>
-      </w:pPr>
-      <w:r>
-        <w:rPr/>
-        <w:t xml:space="preserve">¿No lo encuentras? Presiona la tecla </w:t>
-      </w:r>
-      <w:r>
-        <w:rPr>
-          <w:rFonts w:ascii="DejaVu Sans;sans-serif" w:hAnsi="DejaVu Sans;sans-serif"/>
-          <w:sz w:val="17"/>
-          <w:bdr w:val="single" w:sz="2" w:space="1" w:color="999999"/>
-          <w:shd w:fill="FAFAFA" w:val="clear"/>
-        </w:rPr>
-        <w:t>Windows</w:t>
-      </w:r>
-      <w:r>
-        <w:rPr/>
-        <w:t xml:space="preserve"> del teclado (la que tiene la ventanita). Se abre el menú Inicio. </w:t>
+        <w:ind w:hanging="283" w:left="829"/>
+        <w:jc w:val="left"/>
+        <w:rPr/>
+      </w:pPr>
+      <w:r>
+        <w:rPr/>
+        <w:t xml:space="preserve">Si tenía texto, bórralo con la tecla </w:t>
+      </w:r>
+      <w:r>
+        <w:rPr>
+          <w:b/>
+        </w:rPr>
+        <w:t>Retroceso</w:t>
+      </w:r>
+      <w:r>
+        <w:rPr/>
+        <w:t xml:space="preserve"> (la flecha de borrar, arriba a la derecha del teclado). </w:t>
       </w:r>
     </w:p>
     <w:p>
@@ -1264,27 +1922,7 @@
       </w:pPr>
       <w:r>
         <w:rPr/>
-        <w:t xml:space="preserve">Escribe </w:t>
-      </w:r>
-      <w:r>
-        <w:rPr>
-          <w:rStyle w:val="Textooriginal"/>
-        </w:rPr>
-        <w:t>chrome</w:t>
-      </w:r>
-      <w:r>
-        <w:rPr/>
-        <w:t xml:space="preserve"> (o </w:t>
-      </w:r>
-      <w:r>
-        <w:rPr>
-          <w:rStyle w:val="Textooriginal"/>
-        </w:rPr>
-        <w:t>edge</w:t>
-      </w:r>
-      <w:r>
-        <w:rPr/>
-        <w:t xml:space="preserve">) → arriba aparece el programa → pulsa </w:t>
+        <w:t xml:space="preserve">Escribe exactamente esta dirección y pulsa </w:t>
       </w:r>
       <w:r>
         <w:rPr>
@@ -1297,7 +1935,28 @@
       </w:r>
       <w:r>
         <w:rPr/>
-        <w:t xml:space="preserve">. </w:t>
+        <w:t xml:space="preserve">: </w:t>
+      </w:r>
+    </w:p>
+    <w:p>
+      <w:pPr>
+        <w:pStyle w:val="BodyText"/>
+        <w:numPr>
+          <w:ilvl w:val="0"/>
+          <w:numId w:val="0"/>
+        </w:numPr>
+        <w:bidi w:val="0"/>
+        <w:spacing w:before="120" w:after="60"/>
+        <w:ind w:hanging="0" w:left="120" w:right="120"/>
+        <w:jc w:val="left"/>
+        <w:rPr/>
+      </w:pPr>
+      <w:r>
+        <w:rPr>
+          <w:rStyle w:val="Textooriginal"/>
+          <w:sz w:val="19"/>
+        </w:rPr>
+        <w:t>github.com/MariaDSalazar/instalador-office-isupol</w:t>
       </w:r>
     </w:p>
     <w:p>
@@ -1312,25 +1971,34 @@
           <w:tab w:val="left" w:pos="829" w:leader="none"/>
         </w:tabs>
         <w:bidi w:val="0"/>
+        <w:spacing w:before="120" w:after="0"/>
         <w:ind w:hanging="283" w:left="829"/>
         <w:jc w:val="left"/>
         <w:rPr/>
       </w:pPr>
       <w:r>
         <w:rPr/>
-        <w:t xml:space="preserve">El navegador se abre en una ventana grande. Listo para el siguiente paso. </w:t>
-      </w:r>
-    </w:p>
-    <w:p>
-      <w:pPr>
-        <w:pStyle w:val="Ttulo4paso"/>
-        <w:bidi w:val="0"/>
-        <w:jc w:val="left"/>
-        <w:rPr/>
-      </w:pPr>
-      <w:r>
-        <w:rPr/>
-        <w:t>Paso C. Entrar a la página del instalador</w:t>
+        <w:t xml:space="preserve">Comprueba que arriba diga </w:t>
+      </w:r>
+      <w:r>
+        <w:rPr>
+          <w:rStyle w:val="Textooriginal"/>
+        </w:rPr>
+        <w:t>github.com</w:t>
+      </w:r>
+      <w:r>
+        <w:rPr/>
+        <w:t xml:space="preserve"> y el nombre correcto. Si te manda a descargar un </w:t>
+      </w:r>
+      <w:r>
+        <w:rPr>
+          <w:rStyle w:val="Textooriginal"/>
+        </w:rPr>
+        <w:t>.exe</w:t>
+      </w:r>
+      <w:r>
+        <w:rPr/>
+        <w:t xml:space="preserve"> o el nombre es distinto, cierra: es una copia falsa. </w:t>
       </w:r>
     </w:p>
     <w:p>
@@ -1338,169 +2006,7 @@
         <w:pStyle w:val="BodyText"/>
         <w:numPr>
           <w:ilvl w:val="0"/>
-          <w:numId w:val="5"/>
-        </w:numPr>
-        <w:tabs>
-          <w:tab w:val="clear" w:pos="1134"/>
-          <w:tab w:val="left" w:pos="829" w:leader="none"/>
-        </w:tabs>
-        <w:bidi w:val="0"/>
-        <w:spacing w:before="120" w:after="0"/>
-        <w:ind w:hanging="283" w:left="829"/>
-        <w:jc w:val="left"/>
-        <w:rPr/>
-      </w:pPr>
-      <w:r>
-        <w:rPr/>
-        <w:t xml:space="preserve">Busca la barra larga de arriba (barra de direcciones) y haz </w:t>
-      </w:r>
-      <w:r>
-        <w:rPr>
-          <w:b/>
-        </w:rPr>
-        <w:t>un clic dentro</w:t>
-      </w:r>
-      <w:r>
-        <w:rPr/>
-        <w:t xml:space="preserve">. </w:t>
-      </w:r>
-    </w:p>
-    <w:p>
-      <w:pPr>
-        <w:pStyle w:val="BodyText"/>
-        <w:numPr>
-          <w:ilvl w:val="0"/>
-          <w:numId w:val="5"/>
-        </w:numPr>
-        <w:tabs>
-          <w:tab w:val="clear" w:pos="1134"/>
-          <w:tab w:val="left" w:pos="829" w:leader="none"/>
-        </w:tabs>
-        <w:bidi w:val="0"/>
-        <w:spacing w:before="120" w:after="0"/>
-        <w:ind w:hanging="283" w:left="829"/>
-        <w:jc w:val="left"/>
-        <w:rPr/>
-      </w:pPr>
-      <w:r>
-        <w:rPr/>
-        <w:t xml:space="preserve">Si tenía texto, bórralo con la tecla </w:t>
-      </w:r>
-      <w:r>
-        <w:rPr>
-          <w:b/>
-        </w:rPr>
-        <w:t>Retroceso</w:t>
-      </w:r>
-      <w:r>
-        <w:rPr/>
-        <w:t xml:space="preserve"> (la flecha de borrar, arriba a la derecha del teclado). </w:t>
-      </w:r>
-    </w:p>
-    <w:p>
-      <w:pPr>
-        <w:pStyle w:val="BodyText"/>
-        <w:numPr>
-          <w:ilvl w:val="0"/>
-          <w:numId w:val="5"/>
-        </w:numPr>
-        <w:tabs>
-          <w:tab w:val="clear" w:pos="1134"/>
-          <w:tab w:val="left" w:pos="709" w:leader="none"/>
-        </w:tabs>
-        <w:bidi w:val="0"/>
-        <w:spacing w:before="120" w:after="0"/>
-        <w:ind w:hanging="283" w:left="709" w:right="0"/>
-        <w:jc w:val="left"/>
-        <w:rPr/>
-      </w:pPr>
-      <w:r>
-        <w:rPr/>
-        <w:t xml:space="preserve">Escribe exactamente esta dirección y pulsa </w:t>
-      </w:r>
-      <w:r>
-        <w:rPr>
-          <w:rFonts w:ascii="DejaVu Sans;sans-serif" w:hAnsi="DejaVu Sans;sans-serif"/>
-          <w:sz w:val="17"/>
-          <w:bdr w:val="single" w:sz="2" w:space="1" w:color="999999"/>
-          <w:shd w:fill="FAFAFA" w:val="clear"/>
-        </w:rPr>
-        <w:t>Enter</w:t>
-      </w:r>
-      <w:r>
-        <w:rPr/>
-        <w:t xml:space="preserve">: </w:t>
-      </w:r>
-    </w:p>
-    <w:p>
-      <w:pPr>
-        <w:pStyle w:val="BodyText"/>
-        <w:numPr>
-          <w:ilvl w:val="0"/>
-          <w:numId w:val="0"/>
-        </w:numPr>
-        <w:bidi w:val="0"/>
-        <w:spacing w:before="120" w:after="60"/>
-        <w:ind w:hanging="0" w:left="120" w:right="120"/>
-        <w:jc w:val="left"/>
-        <w:rPr/>
-      </w:pPr>
-      <w:r>
-        <w:rPr>
-          <w:rStyle w:val="Textooriginal"/>
-          <w:sz w:val="19"/>
-        </w:rPr>
-        <w:t>github.com/MariaDSalazar/instalador-office-isupol</w:t>
-      </w:r>
-    </w:p>
-    <w:p>
-      <w:pPr>
-        <w:pStyle w:val="BodyText"/>
-        <w:numPr>
-          <w:ilvl w:val="0"/>
-          <w:numId w:val="5"/>
-        </w:numPr>
-        <w:tabs>
-          <w:tab w:val="clear" w:pos="1134"/>
-          <w:tab w:val="left" w:pos="829" w:leader="none"/>
-        </w:tabs>
-        <w:bidi w:val="0"/>
-        <w:spacing w:before="120" w:after="0"/>
-        <w:ind w:hanging="283" w:left="829"/>
-        <w:jc w:val="left"/>
-        <w:rPr/>
-      </w:pPr>
-      <w:r>
-        <w:rPr/>
-        <w:t xml:space="preserve">Comprueba que arriba diga </w:t>
-      </w:r>
-      <w:r>
-        <w:rPr>
-          <w:rStyle w:val="Textooriginal"/>
-        </w:rPr>
-        <w:t>github.com</w:t>
-      </w:r>
-      <w:r>
-        <w:rPr/>
-        <w:t xml:space="preserve"> y el nombre correcto. Si te manda a descargar un </w:t>
-      </w:r>
-      <w:r>
-        <w:rPr>
-          <w:rStyle w:val="Textooriginal"/>
-        </w:rPr>
-        <w:t>.exe</w:t>
-      </w:r>
-      <w:r>
-        <w:rPr/>
-        <w:t xml:space="preserve"> o el nombre es distinto, cierra: es una copia falsa. </w:t>
-      </w:r>
-    </w:p>
-    <w:p>
-      <w:pPr>
-        <w:pStyle w:val="BodyText"/>
-        <w:numPr>
-          <w:ilvl w:val="0"/>
-          <w:numId w:val="5"/>
+          <w:numId w:val="4"/>
         </w:numPr>
         <w:tabs>
           <w:tab w:val="clear" w:pos="1134"/>
@@ -1672,7 +2178,7 @@
         <w:pStyle w:val="BodyText"/>
         <w:numPr>
           <w:ilvl w:val="0"/>
-          <w:numId w:val="6"/>
+          <w:numId w:val="5"/>
         </w:numPr>
         <w:tabs>
           <w:tab w:val="clear" w:pos="1134"/>
@@ -1723,6 +2229,128 @@
       <w:r>
         <w:rPr/>
         <w:t xml:space="preserve">. </w:t>
+      </w:r>
+    </w:p>
+    <w:p>
+      <w:pPr>
+        <w:pStyle w:val="BodyText"/>
+        <w:numPr>
+          <w:ilvl w:val="0"/>
+          <w:numId w:val="5"/>
+        </w:numPr>
+        <w:tabs>
+          <w:tab w:val="clear" w:pos="1134"/>
+          <w:tab w:val="left" w:pos="829" w:leader="none"/>
+        </w:tabs>
+        <w:bidi w:val="0"/>
+        <w:spacing w:before="120" w:after="0"/>
+        <w:ind w:hanging="283" w:left="829"/>
+        <w:jc w:val="left"/>
+        <w:rPr/>
+      </w:pPr>
+      <w:r>
+        <w:rPr/>
+        <w:t xml:space="preserve">El comando ya está copiado, aunque no veas ningún cambio en la pantalla. Es normal. </w:t>
+      </w:r>
+    </w:p>
+    <w:p>
+      <w:pPr>
+        <w:pStyle w:val="BodyText"/>
+        <w:numPr>
+          <w:ilvl w:val="0"/>
+          <w:numId w:val="5"/>
+        </w:numPr>
+        <w:tabs>
+          <w:tab w:val="clear" w:pos="1134"/>
+          <w:tab w:val="left" w:pos="829" w:leader="none"/>
+        </w:tabs>
+        <w:bidi w:val="0"/>
+        <w:ind w:hanging="283" w:left="829"/>
+        <w:jc w:val="left"/>
+        <w:rPr/>
+      </w:pPr>
+      <w:r>
+        <w:rPr>
+          <w:b/>
+        </w:rPr>
+        <w:t>No cierres el navegador todavía</w:t>
+      </w:r>
+      <w:r>
+        <w:rPr/>
+        <w:t xml:space="preserve">, por si hay que copiarlo de nuevo. </w:t>
+      </w:r>
+    </w:p>
+    <w:p>
+      <w:pPr>
+        <w:pStyle w:val="BodyText"/>
+        <w:bidi w:val="0"/>
+        <w:spacing w:before="180" w:after="180"/>
+        <w:ind w:hanging="0" w:left="180" w:right="180"/>
+        <w:jc w:val="left"/>
+        <w:rPr/>
+      </w:pPr>
+      <w:r>
+        <w:rPr>
+          <w:b/>
+          <w:sz w:val="19"/>
+          <w:bdr w:val="single" w:sz="24" w:space="9" w:color="0D3B66"/>
+          <w:shd w:fill="F4F7FA" w:val="clear"/>
+        </w:rPr>
+        <w:t>¿Qué hace ese comando?</w:t>
+      </w:r>
+      <w:r>
+        <w:rPr>
+          <w:sz w:val="19"/>
+          <w:bdr w:val="single" w:sz="24" w:space="9" w:color="0D3B66"/>
+          <w:shd w:fill="F4F7FA" w:val="clear"/>
+        </w:rPr>
+        <w:t xml:space="preserve"> </w:t>
+      </w:r>
+      <w:r>
+        <w:rPr>
+          <w:rStyle w:val="Textooriginal"/>
+          <w:sz w:val="19"/>
+          <w:bdr w:val="single" w:sz="24" w:space="9" w:color="0D3B66"/>
+          <w:shd w:fill="F4F7FA" w:val="clear"/>
+        </w:rPr>
+        <w:t>irm</w:t>
+      </w:r>
+      <w:r>
+        <w:rPr>
+          <w:sz w:val="19"/>
+          <w:bdr w:val="single" w:sz="24" w:space="9" w:color="0D3B66"/>
+          <w:shd w:fill="F4F7FA" w:val="clear"/>
+        </w:rPr>
+        <w:t xml:space="preserve"> descarga el instalador desde la página, y </w:t>
+      </w:r>
+      <w:r>
+        <w:rPr>
+          <w:rStyle w:val="Textooriginal"/>
+          <w:sz w:val="19"/>
+          <w:bdr w:val="single" w:sz="24" w:space="9" w:color="0D3B66"/>
+          <w:shd w:fill="F4F7FA" w:val="clear"/>
+        </w:rPr>
+        <w:t>iex</w:t>
+      </w:r>
+      <w:r>
+        <w:rPr>
+          <w:sz w:val="19"/>
+          <w:bdr w:val="single" w:sz="24" w:space="9" w:color="0D3B66"/>
+          <w:shd w:fill="F4F7FA" w:val="clear"/>
+        </w:rPr>
+        <w:t xml:space="preserve"> lo ejecuta. Es la misma forma que usa massgrave.dev. El archivo viene del repositorio de la asignatura y descarga Office solo de los servidores de Microsoft.</w:t>
+      </w:r>
+    </w:p>
+    <w:p>
+      <w:pPr>
+        <w:pStyle w:val="Ttulo4paso"/>
+        <w:bidi w:val="0"/>
+        <w:jc w:val="left"/>
+        <w:rPr/>
+      </w:pPr>
+      <w:r>
+        <w:rPr/>
+        <w:t>Paso E. Abrir PowerShell como administrador</w:t>
       </w:r>
     </w:p>
     <w:p>
@@ -1734,17 +2362,40 @@
         </w:numPr>
         <w:tabs>
           <w:tab w:val="clear" w:pos="1134"/>
-          <w:tab w:val="left" w:pos="829" w:leader="none"/>
+          <w:tab w:val="left" w:pos="709" w:leader="none"/>
         </w:tabs>
         <w:bidi w:val="0"/>
         <w:spacing w:before="120" w:after="0"/>
-        <w:ind w:hanging="283" w:left="829"/>
-        <w:jc w:val="left"/>
-        <w:rPr/>
-      </w:pPr>
-      <w:r>
-        <w:rPr/>
-        <w:t xml:space="preserve">El comando ya está copiado, aunque no veas ningún cambio en la pantalla. Es normal. </w:t>
+        <w:ind w:hanging="283" w:left="709" w:right="0"/>
+        <w:jc w:val="left"/>
+        <w:rPr/>
+      </w:pPr>
+      <w:r>
+        <w:rPr/>
+        <w:t xml:space="preserve">Presiona la tecla </w:t>
+      </w:r>
+      <w:r>
+        <w:rPr>
+          <w:rFonts w:ascii="DejaVu Sans;sans-serif" w:hAnsi="DejaVu Sans;sans-serif"/>
+          <w:sz w:val="17"/>
+          <w:bdr w:val="single" w:sz="2" w:space="1" w:color="999999"/>
+          <w:shd w:fill="FAFAFA" w:val="clear"/>
+        </w:rPr>
+        <w:t>Windows</w:t>
+      </w:r>
+      <w:r>
+        <w:rPr/>
+        <w:t xml:space="preserve"> → escribe </w:t>
+      </w:r>
+      <w:r>
+        <w:rPr>
+          <w:rStyle w:val="Textooriginal"/>
+        </w:rPr>
+        <w:t>PowerShell</w:t>
+      </w:r>
+      <w:r>
+        <w:rPr/>
+        <w:t xml:space="preserve">. </w:t>
       </w:r>
     </w:p>
     <w:p>
@@ -1759,92 +2410,24 @@
           <w:tab w:val="left" w:pos="829" w:leader="none"/>
         </w:tabs>
         <w:bidi w:val="0"/>
+        <w:spacing w:before="120" w:after="0"/>
         <w:ind w:hanging="283" w:left="829"/>
         <w:jc w:val="left"/>
         <w:rPr/>
       </w:pPr>
       <w:r>
-        <w:rPr>
-          <w:b/>
-        </w:rPr>
-        <w:t>No cierres el navegador todavía</w:t>
-      </w:r>
-      <w:r>
-        <w:rPr/>
-        <w:t xml:space="preserve">, por si hay que copiarlo de nuevo. </w:t>
-      </w:r>
-    </w:p>
-    <w:p>
-      <w:pPr>
-        <w:pStyle w:val="BodyText"/>
-        <w:bidi w:val="0"/>
-        <w:spacing w:before="180" w:after="180"/>
-        <w:ind w:hanging="0" w:left="180" w:right="180"/>
-        <w:jc w:val="left"/>
-        <w:rPr/>
-      </w:pPr>
-      <w:r>
-        <w:rPr>
-          <w:b/>
-          <w:sz w:val="19"/>
-          <w:bdr w:val="single" w:sz="24" w:space="9" w:color="0D3B66"/>
-          <w:shd w:fill="F4F7FA" w:val="clear"/>
-        </w:rPr>
-        <w:t>¿Qué hace ese comando?</w:t>
-      </w:r>
-      <w:r>
-        <w:rPr>
-          <w:sz w:val="19"/>
-          <w:bdr w:val="single" w:sz="24" w:space="9" w:color="0D3B66"/>
-          <w:shd w:fill="F4F7FA" w:val="clear"/>
-        </w:rPr>
+        <w:rPr/>
+        <w:t xml:space="preserve">Arriba aparece «Windows PowerShell». </w:t>
+      </w:r>
+      <w:r>
+        <w:rPr>
+          <w:b/>
+        </w:rPr>
+        <w:t>No pulses Enter todavía.</w:t>
+      </w:r>
+      <w:r>
+        <w:rPr/>
         <w:t xml:space="preserve"> </w:t>
-      </w:r>
-      <w:r>
-        <w:rPr>
-          <w:rStyle w:val="Textooriginal"/>
-          <w:sz w:val="19"/>
-          <w:bdr w:val="single" w:sz="24" w:space="9" w:color="0D3B66"/>
-          <w:shd w:fill="F4F7FA" w:val="clear"/>
-        </w:rPr>
-        <w:t>irm</w:t>
-      </w:r>
-      <w:r>
-        <w:rPr>
-          <w:sz w:val="19"/>
-          <w:bdr w:val="single" w:sz="24" w:space="9" w:color="0D3B66"/>
-          <w:shd w:fill="F4F7FA" w:val="clear"/>
-        </w:rPr>
-        <w:t xml:space="preserve"> descarga el instalador desde la página, y </w:t>
-      </w:r>
-      <w:r>
-        <w:rPr>
-          <w:rStyle w:val="Textooriginal"/>
-          <w:sz w:val="19"/>
-          <w:bdr w:val="single" w:sz="24" w:space="9" w:color="0D3B66"/>
-          <w:shd w:fill="F4F7FA" w:val="clear"/>
-        </w:rPr>
-        <w:t>iex</w:t>
-      </w:r>
-      <w:r>
-        <w:rPr>
-          <w:sz w:val="19"/>
-          <w:bdr w:val="single" w:sz="24" w:space="9" w:color="0D3B66"/>
-          <w:shd w:fill="F4F7FA" w:val="clear"/>
-        </w:rPr>
-        <w:t xml:space="preserve"> lo ejecuta. Es la misma forma que usa massgrave.dev. El archivo viene del repositorio de la asignatura y descarga Office solo de los servidores de Microsoft.</w:t>
-      </w:r>
-    </w:p>
-    <w:p>
-      <w:pPr>
-        <w:pStyle w:val="Ttulo4paso"/>
-        <w:bidi w:val="0"/>
-        <w:jc w:val="left"/>
-        <w:rPr/>
-      </w:pPr>
-      <w:r>
-        <w:rPr/>
-        <w:t>Paso E. Abrir PowerShell como administrador</w:t>
       </w:r>
     </w:p>
     <w:p>
@@ -1852,44 +2435,31 @@
         <w:pStyle w:val="BodyText"/>
         <w:numPr>
           <w:ilvl w:val="0"/>
-          <w:numId w:val="7"/>
+          <w:numId w:val="6"/>
         </w:numPr>
         <w:tabs>
           <w:tab w:val="clear" w:pos="1134"/>
-          <w:tab w:val="left" w:pos="709" w:leader="none"/>
+          <w:tab w:val="left" w:pos="829" w:leader="none"/>
         </w:tabs>
         <w:bidi w:val="0"/>
         <w:spacing w:before="120" w:after="0"/>
-        <w:ind w:hanging="283" w:left="709" w:right="0"/>
-        <w:jc w:val="left"/>
-        <w:rPr/>
-      </w:pPr>
-      <w:r>
-        <w:rPr/>
-        <w:t xml:space="preserve">Presiona la tecla </w:t>
-      </w:r>
-      <w:r>
-        <w:rPr>
-          <w:rFonts w:ascii="DejaVu Sans;sans-serif" w:hAnsi="DejaVu Sans;sans-serif"/>
-          <w:sz w:val="17"/>
-          <w:bdr w:val="single" w:sz="2" w:space="1" w:color="999999"/>
-          <w:shd w:fill="FAFAFA" w:val="clear"/>
-        </w:rPr>
-        <w:t>Windows</w:t>
-      </w:r>
-      <w:r>
-        <w:rPr/>
-        <w:t xml:space="preserve"> → escribe </w:t>
-      </w:r>
-      <w:r>
-        <w:rPr>
-          <w:rStyle w:val="Textooriginal"/>
-        </w:rPr>
-        <w:t>PowerShell</w:t>
-      </w:r>
-      <w:r>
-        <w:rPr/>
-        <w:t xml:space="preserve">. </w:t>
+        <w:ind w:hanging="283" w:left="829"/>
+        <w:jc w:val="left"/>
+        <w:rPr/>
+      </w:pPr>
+      <w:r>
+        <w:rPr/>
+        <w:t xml:space="preserve">En el panel de la derecha haz clic en </w:t>
+      </w:r>
+      <w:r>
+        <w:rPr>
+          <w:b/>
+        </w:rPr>
+        <w:t>«Ejecutar como administrador»</w:t>
+      </w:r>
+      <w:r>
+        <w:rPr/>
+        <w:t xml:space="preserve">. Si no ves ese panel, haz clic derecho sobre «Windows PowerShell» y elige esa misma opción del menú. </w:t>
       </w:r>
     </w:p>
     <w:p>
@@ -1897,7 +2467,7 @@
         <w:pStyle w:val="BodyText"/>
         <w:numPr>
           <w:ilvl w:val="0"/>
-          <w:numId w:val="7"/>
+          <w:numId w:val="6"/>
         </w:numPr>
         <w:tabs>
           <w:tab w:val="clear" w:pos="1134"/>
@@ -1911,17 +2481,17 @@
       </w:pPr>
       <w:r>
         <w:rPr/>
-        <w:t xml:space="preserve">Arriba aparece «Windows PowerShell». </w:t>
-      </w:r>
-      <w:r>
-        <w:rPr>
-          <w:b/>
-        </w:rPr>
-        <w:t>No pulses Enter todavía.</w:t>
-      </w:r>
-      <w:r>
-        <w:rPr/>
-        <w:t xml:space="preserve"> </w:t>
+        <w:t xml:space="preserve">Es </w:t>
+      </w:r>
+      <w:r>
+        <w:rPr>
+          <w:b/>
+        </w:rPr>
+        <w:t>muy importante</w:t>
+      </w:r>
+      <w:r>
+        <w:rPr/>
+        <w:t xml:space="preserve"> que sea la opción como administrador y no la normal: sin esos permisos, la instalación no puede empezar. </w:t>
       </w:r>
     </w:p>
     <w:p>
@@ -1929,71 +2499,7 @@
         <w:pStyle w:val="BodyText"/>
         <w:numPr>
           <w:ilvl w:val="0"/>
-          <w:numId w:val="7"/>
-        </w:numPr>
-        <w:tabs>
-          <w:tab w:val="clear" w:pos="1134"/>
-          <w:tab w:val="left" w:pos="829" w:leader="none"/>
-        </w:tabs>
-        <w:bidi w:val="0"/>
-        <w:spacing w:before="120" w:after="0"/>
-        <w:ind w:hanging="283" w:left="829"/>
-        <w:jc w:val="left"/>
-        <w:rPr/>
-      </w:pPr>
-      <w:r>
-        <w:rPr/>
-        <w:t xml:space="preserve">En el panel de la derecha haz clic en </w:t>
-      </w:r>
-      <w:r>
-        <w:rPr>
-          <w:b/>
-        </w:rPr>
-        <w:t>«Ejecutar como administrador»</w:t>
-      </w:r>
-      <w:r>
-        <w:rPr/>
-        <w:t xml:space="preserve">. Si no ves ese panel, haz clic derecho sobre «Windows PowerShell» y elige esa misma opción del menú. </w:t>
-      </w:r>
-    </w:p>
-    <w:p>
-      <w:pPr>
-        <w:pStyle w:val="BodyText"/>
-        <w:numPr>
-          <w:ilvl w:val="0"/>
-          <w:numId w:val="7"/>
-        </w:numPr>
-        <w:tabs>
-          <w:tab w:val="clear" w:pos="1134"/>
-          <w:tab w:val="left" w:pos="829" w:leader="none"/>
-        </w:tabs>
-        <w:bidi w:val="0"/>
-        <w:spacing w:before="120" w:after="0"/>
-        <w:ind w:hanging="283" w:left="829"/>
-        <w:jc w:val="left"/>
-        <w:rPr/>
-      </w:pPr>
-      <w:r>
-        <w:rPr/>
-        <w:t xml:space="preserve">Es </w:t>
-      </w:r>
-      <w:r>
-        <w:rPr>
-          <w:b/>
-        </w:rPr>
-        <w:t>muy importante</w:t>
-      </w:r>
-      <w:r>
-        <w:rPr/>
-        <w:t xml:space="preserve"> que sea la opción como administrador y no la normal: sin esos permisos, la instalación no puede empezar. </w:t>
-      </w:r>
-    </w:p>
-    <w:p>
-      <w:pPr>
-        <w:pStyle w:val="BodyText"/>
-        <w:numPr>
-          <w:ilvl w:val="0"/>
-          <w:numId w:val="7"/>
+          <w:numId w:val="6"/>
         </w:numPr>
         <w:tabs>
           <w:tab w:val="clear" w:pos="1134"/>
@@ -2298,7 +2804,7 @@
         <w:pStyle w:val="BodyText"/>
         <w:numPr>
           <w:ilvl w:val="0"/>
-          <w:numId w:val="8"/>
+          <w:numId w:val="7"/>
         </w:numPr>
         <w:tabs>
           <w:tab w:val="clear" w:pos="1134"/>
@@ -2356,7 +2862,7 @@
         <w:pStyle w:val="BodyText"/>
         <w:numPr>
           <w:ilvl w:val="0"/>
-          <w:numId w:val="8"/>
+          <w:numId w:val="7"/>
         </w:numPr>
         <w:tabs>
           <w:tab w:val="clear" w:pos="1134"/>
@@ -2388,7 +2894,7 @@
         <w:pStyle w:val="BodyText"/>
         <w:numPr>
           <w:ilvl w:val="0"/>
-          <w:numId w:val="8"/>
+          <w:numId w:val="7"/>
         </w:numPr>
         <w:tabs>
           <w:tab w:val="clear" w:pos="1134"/>
@@ -2423,7 +2929,7 @@
         <w:pStyle w:val="BodyText"/>
         <w:numPr>
           <w:ilvl w:val="0"/>
-          <w:numId w:val="8"/>
+          <w:numId w:val="7"/>
         </w:numPr>
         <w:tabs>
           <w:tab w:val="clear" w:pos="1134"/>
@@ -3259,7 +3765,7 @@
         <w:rPr/>
         <w:drawing>
           <wp:inline distT="0" distB="0" distL="0" distR="0">
-            <wp:extent cx="20069175" cy="5010150"/>
+            <wp:extent cx="19707225" cy="5010150"/>
             <wp:effectExtent l="0" t="0" r="0" b="0"/>
             <wp:docPr id="8" name="Imagen8" descr="Tabla de versiones"/>
             <wp:cNvGraphicFramePr>
@@ -3283,7 +3789,7 @@
                   <pic:spPr bwMode="auto">
                     <a:xfrm>
                       <a:off x="0" y="0"/>
-                      <a:ext cx="20069175" cy="5010150"/>
+                      <a:ext cx="19707225" cy="5010150"/>
                     </a:xfrm>
                     <a:prstGeom prst="rect">
                       <a:avLst/>
@@ -3902,7 +4408,7 @@
         <w:pStyle w:val="BodyText"/>
         <w:numPr>
           <w:ilvl w:val="0"/>
-          <w:numId w:val="9"/>
+          <w:numId w:val="8"/>
         </w:numPr>
         <w:tabs>
           <w:tab w:val="clear" w:pos="1134"/>
@@ -3938,7 +4444,7 @@
         <w:pStyle w:val="BodyText"/>
         <w:numPr>
           <w:ilvl w:val="0"/>
-          <w:numId w:val="9"/>
+          <w:numId w:val="8"/>
         </w:numPr>
         <w:tabs>
           <w:tab w:val="clear" w:pos="1134"/>
@@ -3960,7 +4466,7 @@
         <w:pStyle w:val="BodyText"/>
         <w:numPr>
           <w:ilvl w:val="0"/>
-          <w:numId w:val="9"/>
+          <w:numId w:val="8"/>
         </w:numPr>
         <w:tabs>
           <w:tab w:val="clear" w:pos="1134"/>
@@ -4055,7 +4561,7 @@
         <w:rPr/>
         <w:drawing>
           <wp:inline distT="0" distB="0" distL="0" distR="0">
-            <wp:extent cx="16602075" cy="5334000"/>
+            <wp:extent cx="16602075" cy="4686300"/>
             <wp:effectExtent l="0" t="0" r="0" b="0"/>
             <wp:docPr id="11" name="Imagen11" descr="Resumen de la instalación"/>
             <wp:cNvGraphicFramePr>
@@ -4079,7 +4585,7 @@
                   <pic:spPr bwMode="auto">
                     <a:xfrm>
                       <a:off x="0" y="0"/>
-                      <a:ext cx="16602075" cy="5334000"/>
+                      <a:ext cx="16602075" cy="4686300"/>
                     </a:xfrm>
                     <a:prstGeom prst="rect">
                       <a:avLst/>
@@ -4242,7 +4748,7 @@
         <w:pStyle w:val="BodyText"/>
         <w:numPr>
           <w:ilvl w:val="0"/>
-          <w:numId w:val="10"/>
+          <w:numId w:val="9"/>
         </w:numPr>
         <w:tabs>
           <w:tab w:val="clear" w:pos="1134"/>
@@ -4264,7 +4770,7 @@
         <w:pStyle w:val="BodyText"/>
         <w:numPr>
           <w:ilvl w:val="0"/>
-          <w:numId w:val="10"/>
+          <w:numId w:val="9"/>
         </w:numPr>
         <w:tabs>
           <w:tab w:val="clear" w:pos="1134"/>
@@ -4286,7 +4792,7 @@
         <w:pStyle w:val="BodyText"/>
         <w:numPr>
           <w:ilvl w:val="0"/>
-          <w:numId w:val="10"/>
+          <w:numId w:val="9"/>
         </w:numPr>
         <w:tabs>
           <w:tab w:val="clear" w:pos="1134"/>
@@ -4954,7 +5460,7 @@
         <w:pStyle w:val="BodyText"/>
         <w:numPr>
           <w:ilvl w:val="0"/>
-          <w:numId w:val="11"/>
+          <w:numId w:val="10"/>
         </w:numPr>
         <w:tabs>
           <w:tab w:val="clear" w:pos="1134"/>
@@ -5003,7 +5509,7 @@
         <w:pStyle w:val="BodyText"/>
         <w:numPr>
           <w:ilvl w:val="0"/>
-          <w:numId w:val="11"/>
+          <w:numId w:val="10"/>
         </w:numPr>
         <w:tabs>
           <w:tab w:val="clear" w:pos="1134"/>
@@ -5025,7 +5531,7 @@
         <w:pStyle w:val="BodyText"/>
         <w:numPr>
           <w:ilvl w:val="0"/>
-          <w:numId w:val="11"/>
+          <w:numId w:val="10"/>
         </w:numPr>
         <w:tabs>
           <w:tab w:val="clear" w:pos="1134"/>
@@ -5074,7 +5580,7 @@
         <w:pStyle w:val="BodyText"/>
         <w:numPr>
           <w:ilvl w:val="0"/>
-          <w:numId w:val="11"/>
+          <w:numId w:val="10"/>
         </w:numPr>
         <w:tabs>
           <w:tab w:val="clear" w:pos="1134"/>
@@ -5096,7 +5602,7 @@
         <w:pStyle w:val="BodyText"/>
         <w:numPr>
           <w:ilvl w:val="0"/>
-          <w:numId w:val="11"/>
+          <w:numId w:val="10"/>
         </w:numPr>
         <w:tabs>
           <w:tab w:val="clear" w:pos="1134"/>
@@ -5145,7 +5651,7 @@
         <w:pStyle w:val="BodyText"/>
         <w:numPr>
           <w:ilvl w:val="0"/>
-          <w:numId w:val="11"/>
+          <w:numId w:val="10"/>
         </w:numPr>
         <w:tabs>
           <w:tab w:val="clear" w:pos="1134"/>
@@ -5177,7 +5683,7 @@
         <w:pStyle w:val="BodyText"/>
         <w:numPr>
           <w:ilvl w:val="0"/>
-          <w:numId w:val="11"/>
+          <w:numId w:val="10"/>
         </w:numPr>
         <w:tabs>
           <w:tab w:val="clear" w:pos="1134"/>
@@ -5405,7 +5911,7 @@
         <w:pStyle w:val="BodyText"/>
         <w:numPr>
           <w:ilvl w:val="0"/>
-          <w:numId w:val="12"/>
+          <w:numId w:val="11"/>
         </w:numPr>
         <w:tabs>
           <w:tab w:val="clear" w:pos="1134"/>
@@ -5454,7 +5960,7 @@
         <w:pStyle w:val="BodyText"/>
         <w:numPr>
           <w:ilvl w:val="0"/>
-          <w:numId w:val="12"/>
+          <w:numId w:val="11"/>
         </w:numPr>
         <w:tabs>
           <w:tab w:val="clear" w:pos="1134"/>
@@ -5602,7 +6108,7 @@
         <w:pStyle w:val="BodyText"/>
         <w:numPr>
           <w:ilvl w:val="0"/>
-          <w:numId w:val="13"/>
+          <w:numId w:val="12"/>
         </w:numPr>
         <w:tabs>
           <w:tab w:val="clear" w:pos="1134"/>
@@ -5651,7 +6157,7 @@
         <w:pStyle w:val="BodyText"/>
         <w:numPr>
           <w:ilvl w:val="0"/>
-          <w:numId w:val="13"/>
+          <w:numId w:val="12"/>
         </w:numPr>
         <w:tabs>
           <w:tab w:val="clear" w:pos="1134"/>
@@ -5673,7 +6179,7 @@
         <w:pStyle w:val="BodyText"/>
         <w:numPr>
           <w:ilvl w:val="0"/>
-          <w:numId w:val="13"/>
+          <w:numId w:val="12"/>
         </w:numPr>
         <w:tabs>
           <w:tab w:val="clear" w:pos="1134"/>
@@ -5705,7 +6211,7 @@
         <w:pStyle w:val="BodyText"/>
         <w:numPr>
           <w:ilvl w:val="0"/>
-          <w:numId w:val="13"/>
+          <w:numId w:val="12"/>
         </w:numPr>
         <w:tabs>
           <w:tab w:val="clear" w:pos="1134"/>
@@ -5737,7 +6243,7 @@
         <w:pStyle w:val="BodyText"/>
         <w:numPr>
           <w:ilvl w:val="0"/>
-          <w:numId w:val="13"/>
+          <w:numId w:val="12"/>
         </w:numPr>
         <w:tabs>
           <w:tab w:val="clear" w:pos="1134"/>
@@ -5950,7 +6456,7 @@
         <w:pStyle w:val="BodyText"/>
         <w:numPr>
           <w:ilvl w:val="0"/>
-          <w:numId w:val="14"/>
+          <w:numId w:val="13"/>
         </w:numPr>
         <w:tabs>
           <w:tab w:val="clear" w:pos="1134"/>
@@ -5992,7 +6498,7 @@
         <w:pStyle w:val="BodyText"/>
         <w:numPr>
           <w:ilvl w:val="0"/>
-          <w:numId w:val="14"/>
+          <w:numId w:val="13"/>
         </w:numPr>
         <w:tabs>
           <w:tab w:val="clear" w:pos="1134"/>
@@ -6034,7 +6540,7 @@
         <w:pStyle w:val="BodyText"/>
         <w:numPr>
           <w:ilvl w:val="0"/>
-          <w:numId w:val="14"/>
+          <w:numId w:val="13"/>
         </w:numPr>
         <w:tabs>
           <w:tab w:val="clear" w:pos="1134"/>
@@ -6086,7 +6592,7 @@
         <w:pStyle w:val="BodyText"/>
         <w:numPr>
           <w:ilvl w:val="0"/>
-          <w:numId w:val="14"/>
+          <w:numId w:val="13"/>
         </w:numPr>
         <w:tabs>
           <w:tab w:val="clear" w:pos="1134"/>
@@ -6128,7 +6634,7 @@
         <w:pStyle w:val="BodyText"/>
         <w:numPr>
           <w:ilvl w:val="0"/>
-          <w:numId w:val="14"/>
+          <w:numId w:val="13"/>
         </w:numPr>
         <w:tabs>
           <w:tab w:val="clear" w:pos="1134"/>
@@ -7588,8 +8094,8 @@
   <w:abstractNum w:abstractNumId="3">
     <w:lvl w:ilvl="0">
       <w:start w:val="1"/>
-      <w:numFmt w:val="bullet"/>
-      <w:lvlText w:val=""/>
+      <w:numFmt w:val="decimal"/>
+      <w:lvlText w:val="%1."/>
       <w:lvlJc w:val="left"/>
       <w:pPr>
         <w:tabs>
@@ -7597,14 +8103,12 @@
         </w:tabs>
         <w:ind w:left="709" w:hanging="283"/>
       </w:pPr>
-      <w:rPr>
-        <w:rFonts w:ascii="Symbol" w:hAnsi="Symbol" w:cs="Symbol" w:hint="default"/>
-      </w:rPr>
+      <w:rPr/>
     </w:lvl>
     <w:lvl w:ilvl="1">
       <w:start w:val="1"/>
-      <w:numFmt w:val="bullet"/>
-      <w:lvlText w:val=""/>
+      <w:numFmt w:val="decimal"/>
+      <w:lvlText w:val="%2."/>
       <w:lvlJc w:val="left"/>
       <w:pPr>
         <w:tabs>
@@ -7612,14 +8116,12 @@
         </w:tabs>
         <w:ind w:left="1418" w:hanging="283"/>
       </w:pPr>
-      <w:rPr>
-        <w:rFonts w:ascii="Symbol" w:hAnsi="Symbol" w:cs="Symbol" w:hint="default"/>
-      </w:rPr>
+      <w:rPr/>
     </w:lvl>
     <w:lvl w:ilvl="2">
       <w:start w:val="1"/>
-      <w:numFmt w:val="bullet"/>
-      <w:lvlText w:val=""/>
+      <w:numFmt w:val="decimal"/>
+      <w:lvlText w:val="%3."/>
       <w:lvlJc w:val="left"/>
       <w:pPr>
         <w:tabs>
@@ -7627,14 +8129,12 @@
         </w:tabs>
         <w:ind w:left="2127" w:hanging="283"/>
       </w:pPr>
-      <w:rPr>
-        <w:rFonts w:ascii="Symbol" w:hAnsi="Symbol" w:cs="Symbol" w:hint="default"/>
-      </w:rPr>
+      <w:rPr/>
     </w:lvl>
     <w:lvl w:ilvl="3">
       <w:start w:val="1"/>
-      <w:numFmt w:val="bullet"/>
-      <w:lvlText w:val=""/>
+      <w:numFmt w:val="decimal"/>
+      <w:lvlText w:val="%4."/>
       <w:lvlJc w:val="left"/>
       <w:pPr>
         <w:tabs>
@@ -7642,14 +8142,12 @@
         </w:tabs>
         <w:ind w:left="2836" w:hanging="283"/>
       </w:pPr>
-      <w:rPr>
-        <w:rFonts w:ascii="Symbol" w:hAnsi="Symbol" w:cs="Symbol" w:hint="default"/>
-      </w:rPr>
+      <w:rPr/>
     </w:lvl>
     <w:lvl w:ilvl="4">
       <w:start w:val="1"/>
-      <w:numFmt w:val="bullet"/>
-      <w:lvlText w:val=""/>
+      <w:numFmt w:val="decimal"/>
+      <w:lvlText w:val="%5."/>
       <w:lvlJc w:val="left"/>
       <w:pPr>
         <w:tabs>
@@ -7657,14 +8155,12 @@
         </w:tabs>
         <w:ind w:left="3545" w:hanging="283"/>
       </w:pPr>
-      <w:rPr>
-        <w:rFonts w:ascii="Symbol" w:hAnsi="Symbol" w:cs="Symbol" w:hint="default"/>
-      </w:rPr>
+      <w:rPr/>
     </w:lvl>
     <w:lvl w:ilvl="5">
       <w:start w:val="1"/>
-      <w:numFmt w:val="bullet"/>
-      <w:lvlText w:val=""/>
+      <w:numFmt w:val="decimal"/>
+      <w:lvlText w:val="%6."/>
       <w:lvlJc w:val="left"/>
       <w:pPr>
         <w:tabs>
@@ -7672,14 +8168,12 @@
         </w:tabs>
         <w:ind w:left="4254" w:hanging="283"/>
       </w:pPr>
-      <w:rPr>
-        <w:rFonts w:ascii="Symbol" w:hAnsi="Symbol" w:cs="Symbol" w:hint="default"/>
-      </w:rPr>
+      <w:rPr/>
     </w:lvl>
     <w:lvl w:ilvl="6">
       <w:start w:val="1"/>
-      <w:numFmt w:val="bullet"/>
-      <w:lvlText w:val=""/>
+      <w:numFmt w:val="decimal"/>
+      <w:lvlText w:val="%7."/>
       <w:lvlJc w:val="left"/>
       <w:pPr>
         <w:tabs>
@@ -7687,14 +8181,12 @@
         </w:tabs>
         <w:ind w:left="4963" w:hanging="283"/>
       </w:pPr>
-      <w:rPr>
-        <w:rFonts w:ascii="Symbol" w:hAnsi="Symbol" w:cs="Symbol" w:hint="default"/>
-      </w:rPr>
+      <w:rPr/>
     </w:lvl>
     <w:lvl w:ilvl="7">
       <w:start w:val="1"/>
-      <w:numFmt w:val="bullet"/>
-      <w:lvlText w:val=""/>
+      <w:numFmt w:val="decimal"/>
+      <w:lvlText w:val="%8."/>
       <w:lvlJc w:val="left"/>
       <w:pPr>
         <w:tabs>
@@ -7702,14 +8194,12 @@
         </w:tabs>
         <w:ind w:left="5672" w:hanging="283"/>
       </w:pPr>
-      <w:rPr>
-        <w:rFonts w:ascii="Symbol" w:hAnsi="Symbol" w:cs="Symbol" w:hint="default"/>
-      </w:rPr>
+      <w:rPr/>
     </w:lvl>
     <w:lvl w:ilvl="8">
       <w:start w:val="1"/>
-      <w:numFmt w:val="bullet"/>
-      <w:lvlText w:val=""/>
+      <w:numFmt w:val="decimal"/>
+      <w:lvlText w:val="%9."/>
       <w:lvlJc w:val="left"/>
       <w:pPr>
         <w:tabs>
@@ -7717,9 +8207,7 @@
         </w:tabs>
         <w:ind w:left="6381" w:hanging="283"/>
       </w:pPr>
-      <w:rPr>
-        <w:rFonts w:ascii="Symbol" w:hAnsi="Symbol" w:cs="Symbol" w:hint="default"/>
-      </w:rPr>
+      <w:rPr/>
     </w:lvl>
   </w:abstractNum>
   <w:abstractNum w:abstractNumId="4">
@@ -8913,125 +9401,6 @@
     </w:lvl>
   </w:abstractNum>
   <w:abstractNum w:abstractNumId="14">
-    <w:lvl w:ilvl="0">
-      <w:start w:val="1"/>
-      <w:numFmt w:val="decimal"/>
-      <w:lvlText w:val="%1."/>
-      <w:lvlJc w:val="left"/>
-      <w:pPr>
-        <w:tabs>
-          <w:tab w:val="num" w:pos="709"/>
-        </w:tabs>
-        <w:ind w:left="709" w:hanging="283"/>
-      </w:pPr>
-      <w:rPr/>
-    </w:lvl>
-    <w:lvl w:ilvl="1">
-      <w:start w:val="1"/>
-      <w:numFmt w:val="decimal"/>
-      <w:lvlText w:val="%2."/>
-      <w:lvlJc w:val="left"/>
-      <w:pPr>
-        <w:tabs>
-          <w:tab w:val="num" w:pos="1418"/>
-        </w:tabs>
-        <w:ind w:left="1418" w:hanging="283"/>
-      </w:pPr>
-      <w:rPr/>
-    </w:lvl>
-    <w:lvl w:ilvl="2">
-      <w:start w:val="1"/>
-      <w:numFmt w:val="decimal"/>
-      <w:lvlText w:val="%3."/>
-      <w:lvlJc w:val="left"/>
-      <w:pPr>
-        <w:tabs>
-          <w:tab w:val="num" w:pos="2127"/>
-        </w:tabs>
-        <w:ind w:left="2127" w:hanging="283"/>
-      </w:pPr>
-      <w:rPr/>
-    </w:lvl>
-    <w:lvl w:ilvl="3">
-      <w:start w:val="1"/>
-      <w:numFmt w:val="decimal"/>
-      <w:lvlText w:val="%4."/>
-      <w:lvlJc w:val="left"/>
-      <w:pPr>
-        <w:tabs>
-          <w:tab w:val="num" w:pos="2836"/>
-        </w:tabs>
-        <w:ind w:left="2836" w:hanging="283"/>
-      </w:pPr>
-      <w:rPr/>
-    </w:lvl>
-    <w:lvl w:ilvl="4">
-      <w:start w:val="1"/>
-      <w:numFmt w:val="decimal"/>
-      <w:lvlText w:val="%5."/>
-      <w:lvlJc w:val="left"/>
-      <w:pPr>
-        <w:tabs>
-          <w:tab w:val="num" w:pos="3545"/>
-        </w:tabs>
-        <w:ind w:left="3545" w:hanging="283"/>
-      </w:pPr>
-      <w:rPr/>
-    </w:lvl>
-    <w:lvl w:ilvl="5">
-      <w:start w:val="1"/>
-      <w:numFmt w:val="decimal"/>
-      <w:lvlText w:val="%6."/>
-      <w:lvlJc w:val="left"/>
-      <w:pPr>
-        <w:tabs>
-          <w:tab w:val="num" w:pos="4254"/>
-        </w:tabs>
-        <w:ind w:left="4254" w:hanging="283"/>
-      </w:pPr>
-      <w:rPr/>
-    </w:lvl>
-    <w:lvl w:ilvl="6">
-      <w:start w:val="1"/>
-      <w:numFmt w:val="decimal"/>
-      <w:lvlText w:val="%7."/>
-      <w:lvlJc w:val="left"/>
-      <w:pPr>
-        <w:tabs>
-          <w:tab w:val="num" w:pos="4963"/>
-        </w:tabs>
-        <w:ind w:left="4963" w:hanging="283"/>
-      </w:pPr>
-      <w:rPr/>
-    </w:lvl>
-    <w:lvl w:ilvl="7">
-      <w:start w:val="1"/>
-      <w:numFmt w:val="decimal"/>
-      <w:lvlText w:val="%8."/>
-      <w:lvlJc w:val="left"/>
-      <w:pPr>
-        <w:tabs>
-          <w:tab w:val="num" w:pos="5672"/>
-        </w:tabs>
-        <w:ind w:left="5672" w:hanging="283"/>
-      </w:pPr>
-      <w:rPr/>
-    </w:lvl>
-    <w:lvl w:ilvl="8">
-      <w:start w:val="1"/>
-      <w:numFmt w:val="decimal"/>
-      <w:lvlText w:val="%9."/>
-      <w:lvlJc w:val="left"/>
-      <w:pPr>
-        <w:tabs>
-          <w:tab w:val="num" w:pos="6381"/>
-        </w:tabs>
-        <w:ind w:left="6381" w:hanging="283"/>
-      </w:pPr>
-      <w:rPr/>
-    </w:lvl>
-  </w:abstractNum>
-  <w:abstractNum w:abstractNumId="15">
     <w:lvl w:ilvl="0">
       <w:start w:val="1"/>
       <w:numFmt w:val="none"/>
@@ -9195,9 +9564,6 @@
   </w:num>
   <w:num w:numId="14">
     <w:abstractNumId w:val="14"/>
-  </w:num>
-  <w:num w:numId="15">
-    <w:abstractNumId w:val="15"/>
   </w:num>
 </w:numbering>
 </file>
@@ -9509,25 +9875,6 @@
       <w:szCs w:val="19"/>
     </w:rPr>
   </w:style>
-  <w:style w:type="paragraph" w:styleId="Ttulodelalista">
-    <w:name w:val="Título de la lista"/>
-    <w:basedOn w:val="Normal"/>
-    <w:next w:val="Contenidodelista"/>
-    <w:qFormat/>
-    <w:pPr>
-      <w:ind w:left="0"/>
-    </w:pPr>
-    <w:rPr/>
-  </w:style>
-  <w:style w:type="paragraph" w:styleId="Contenidodelista">
-    <w:name w:val="Contenido de lista"/>
-    <w:basedOn w:val="Normal"/>
-    <w:qFormat/>
-    <w:pPr>
-      <w:ind w:left="567"/>
-    </w:pPr>
-    <w:rPr/>
-  </w:style>
   <w:style w:type="paragraph" w:styleId="Ttulo3salto">
     <w:name w:val="Título 3.salto"/>
     <w:basedOn w:val="Heading3"/>

</xml_diff>